<commit_message>
Update release plan: server migration, TLS, security audit, orders-disabled flag
</commit_message>
<xml_diff>
--- a/docs/release-plan.docx
+++ b/docs/release-plan.docx
@@ -7,16 +7,16 @@
         <w:pStyle w:val="Title"/>
       </w:pPr>
       <w:r>
-        <w:t xml:space="preserve">План релиза FunMarket</w:t>
-      </w:r>
-    </w:p>
-    <w:bookmarkStart w:id="33" w:name="план-релиза-funmarket"/>
+        <w:t xml:space="preserve">План релиза HobbyHub</w:t>
+      </w:r>
+    </w:p>
+    <w:bookmarkStart w:id="33" w:name="план-релиза-hobbyhub"/>
     <w:p>
       <w:pPr>
         <w:pStyle w:val="Heading1"/>
       </w:pPr>
       <w:r>
-        <w:t xml:space="preserve">План релиза FunMarket</w:t>
+        <w:t xml:space="preserve">План релиза HobbyHub</w:t>
       </w:r>
     </w:p>
     <w:p>
@@ -24,13 +24,7 @@
         <w:pStyle w:val="FirstParagraph"/>
       </w:pPr>
       <w:r>
-        <w:t xml:space="preserve">Статус на 2026-08-20. Документ описывает путь от текущего состояния</w:t>
-      </w:r>
-      <w:r>
-        <w:t xml:space="preserve"> </w:t>
-      </w:r>
-      <w:r>
-        <w:t xml:space="preserve">(рабочий MVP на dev-сервере за временным cloudflared-туннелем) до</w:t>
+        <w:t xml:space="preserve">Статус на 2026-08-28. Документ описывает путь от текущего состояния до</w:t>
       </w:r>
       <w:r>
         <w:t xml:space="preserve"> </w:t>
@@ -104,55 +98,19 @@
         <w:t xml:space="preserve">PaymentProvider</w:t>
       </w:r>
       <w:r>
-        <w:t xml:space="preserve">), отзывы, чат (включая плавающий виджет), избранное,</w:t>
-      </w:r>
-      <w:r>
-        <w:t xml:space="preserve"> </w:t>
-      </w:r>
-      <w:r>
-        <w:t xml:space="preserve">модерация объявлений админом, профили продавцов, уведомления. Backend</w:t>
-      </w:r>
-      <w:r>
-        <w:t xml:space="preserve"> </w:t>
-      </w:r>
-      <w:r>
-        <w:t xml:space="preserve">уже собирается в прод-режиме (</w:t>
-      </w:r>
-      <w:r>
-        <w:rPr>
-          <w:rStyle w:val="VerbatimChar"/>
-        </w:rPr>
-        <w:t xml:space="preserve">nest build</w:t>
-      </w:r>
-      <w:r>
-        <w:t xml:space="preserve"> </w:t>
-      </w:r>
-      <w:r>
-        <w:t xml:space="preserve">→</w:t>
-      </w:r>
-      <w:r>
-        <w:t xml:space="preserve"> </w:t>
-      </w:r>
-      <w:r>
-        <w:rPr>
-          <w:rStyle w:val="VerbatimChar"/>
-        </w:rPr>
-        <w:t xml:space="preserve">node dist/main.js</w:t>
-      </w:r>
-      <w:r>
-        <w:t xml:space="preserve">) и</w:t>
-      </w:r>
-      <w:r>
-        <w:t xml:space="preserve"> </w:t>
-      </w:r>
-      <w:r>
-        <w:t xml:space="preserve">именно так и запущен через systemd. Репозиторий уже в git и запушен на</w:t>
-      </w:r>
-      <w:r>
-        <w:t xml:space="preserve"> </w:t>
-      </w:r>
-      <w:r>
-        <w:t xml:space="preserve">GitHub.</w:t>
+        <w:t xml:space="preserve">), отзывы, чат (включая плавающий виджет и канал</w:t>
+      </w:r>
+      <w:r>
+        <w:t xml:space="preserve"> </w:t>
+      </w:r>
+      <w:r>
+        <w:t xml:space="preserve">поддержки), избранное, модерация объявлений админом, профили продавцов,</w:t>
+      </w:r>
+      <w:r>
+        <w:t xml:space="preserve"> </w:t>
+      </w:r>
+      <w:r>
+        <w:t xml:space="preserve">уведомления.</w:t>
       </w:r>
     </w:p>
     <w:p>
@@ -160,13 +118,112 @@
         <w:pStyle w:val="BodyText"/>
       </w:pPr>
       <w:r>
+        <w:t xml:space="preserve">С 2026-08-27 сайт живёт не на dev-сервере за туннелем, а на выделенном</w:t>
+      </w:r>
+      <w:r>
+        <w:t xml:space="preserve"> </w:t>
+      </w:r>
+      <w:r>
+        <w:t xml:space="preserve">сервере (Timeweb) под собственным доменом</w:t>
+      </w:r>
+      <w:r>
+        <w:t xml:space="preserve"> </w:t>
+      </w:r>
+      <w:r>
+        <w:rPr>
+          <w:bCs/>
+          <w:b/>
+        </w:rPr>
+        <w:t xml:space="preserve">hobbyhub.ru</w:t>
+      </w:r>
+      <w:r>
+        <w:t xml:space="preserve">, с настоящим</w:t>
+      </w:r>
+      <w:r>
+        <w:t xml:space="preserve"> </w:t>
+      </w:r>
+      <w:r>
+        <w:t xml:space="preserve">TLS-сертификатом (Let’s Encrypt через Caddy, автообновление). Backend и</w:t>
+      </w:r>
+      <w:r>
+        <w:t xml:space="preserve"> </w:t>
+      </w:r>
+      <w:r>
+        <w:t xml:space="preserve">frontend собраны в прод-режиме и запущены через systemd под отдельным</w:t>
+      </w:r>
+      <w:r>
+        <w:t xml:space="preserve"> </w:t>
+      </w:r>
+      <w:r>
+        <w:t xml:space="preserve">непривилегированным пользователем</w:t>
+      </w:r>
+      <w:r>
+        <w:t xml:space="preserve"> </w:t>
+      </w:r>
+      <w:r>
+        <w:rPr>
+          <w:rStyle w:val="VerbatimChar"/>
+        </w:rPr>
+        <w:t xml:space="preserve">hobbyhub</w:t>
+      </w:r>
+      <w:r>
+        <w:t xml:space="preserve"> </w:t>
+      </w:r>
+      <w:r>
+        <w:t xml:space="preserve">(не root). По итогам</w:t>
+      </w:r>
+      <w:r>
+        <w:t xml:space="preserve"> </w:t>
+      </w:r>
+      <w:r>
+        <w:t xml:space="preserve">аудита безопасности 2026-08-27 закрыт ряд находок (детали — Фаза 5).</w:t>
+      </w:r>
+      <w:r>
+        <w:t xml:space="preserve"> </w:t>
+      </w:r>
+      <w:r>
+        <w:t xml:space="preserve">Пока нет реального платёжного провайдера — оформление брони временно</w:t>
+      </w:r>
+      <w:r>
+        <w:t xml:space="preserve"> </w:t>
+      </w:r>
+      <w:r>
+        <w:t xml:space="preserve">выключено флагом</w:t>
+      </w:r>
+      <w:r>
+        <w:t xml:space="preserve"> </w:t>
+      </w:r>
+      <w:r>
+        <w:rPr>
+          <w:rStyle w:val="VerbatimChar"/>
+        </w:rPr>
+        <w:t xml:space="preserve">ORDERS_DISABLED</w:t>
+      </w:r>
+      <w:r>
+        <w:t xml:space="preserve"> </w:t>
+      </w:r>
+      <w:r>
+        <w:t xml:space="preserve">(сайт открыт для просмотра/регистрации,</w:t>
+      </w:r>
+      <w:r>
+        <w:t xml:space="preserve"> </w:t>
+      </w:r>
+      <w:r>
+        <w:t xml:space="preserve">проверки UX и контента, но без реальных сделок).</w:t>
+      </w:r>
+    </w:p>
+    <w:p>
+      <w:pPr>
+        <w:pStyle w:val="BodyText"/>
+      </w:pPr>
+      <w:r>
         <w:t xml:space="preserve">Это значит, что релиз — это в основном не «дописать функциональность»,</w:t>
       </w:r>
       <w:r>
         <w:t xml:space="preserve"> </w:t>
       </w:r>
       <w:r>
-        <w:t xml:space="preserve">а закрыть эксплуатационные, юридические и надёжностные пробелы ниже.</w:t>
+        <w:t xml:space="preserve">а закрыть юридические, платёжные и надёжностные пробелы ниже.</w:t>
       </w:r>
     </w:p>
     <w:bookmarkEnd w:id="20"/>
@@ -299,7 +356,7 @@
               <w:jc w:val="left"/>
             </w:pPr>
             <w:r>
-              <w:t xml:space="preserve">Подтверждение email и восстановление пароля физически не работают для реальных пользователей</w:t>
+              <w:t xml:space="preserve">Подтверждение email и восстановление пароля физически не работают для реальных пользователей. Домен уже есть (блокер №6 закрыт) — прежняя причина отложить пункт больше не действует, можно начинать</w:t>
             </w:r>
           </w:p>
         </w:tc>
@@ -355,7 +412,22 @@
               <w:jc w:val="left"/>
             </w:pPr>
             <w:r>
-              <w:t xml:space="preserve">Деньги не двигаются по-настоящему; нужен реальный юрлицо/ИП и договор с провайдером (см. tz-amendments п.1-2)</w:t>
+              <w:t xml:space="preserve">Деньги не двигаются по-настоящему; нужен реальный юрлицо/ИП и договор с провайдером (см. tz-amendments п.1-2). Временно смягчено:</w:t>
+            </w:r>
+            <w:r>
+              <w:t xml:space="preserve"> </w:t>
+            </w:r>
+            <w:r>
+              <w:rPr>
+                <w:rStyle w:val="VerbatimChar"/>
+              </w:rPr>
+              <w:t xml:space="preserve">ORDERS_DISABLED=true</w:t>
+            </w:r>
+            <w:r>
+              <w:t xml:space="preserve"> </w:t>
+            </w:r>
+            <w:r>
+              <w:t xml:space="preserve">прячет оформление брони, пока сайт публично тестируется</w:t>
             </w:r>
           </w:p>
         </w:tc>
@@ -501,7 +573,7 @@
               <w:jc w:val="left"/>
             </w:pPr>
             <w:r>
-              <w:t xml:space="preserve">Помимо снятия — по итогам аудита безопасности 2026-08-27 обнаружено, что гейт был тривиально обходим подделкой заголовка</w:t>
+              <w:t xml:space="preserve">По итогам аудита безопасности 2026-08-27 обнаружено, что гейт был тривиально обходим подделкой заголовка</w:t>
             </w:r>
             <w:r>
               <w:t xml:space="preserve"> </w:t>
@@ -516,7 +588,7 @@
               <w:t xml:space="preserve"> </w:t>
             </w:r>
             <w:r>
-              <w:t xml:space="preserve">(код пропускал любой Bearer, не проверяя валидность токена), т.е. фактически уже не защищал</w:t>
+              <w:t xml:space="preserve">— фактически уже не защищал, снят полностью</w:t>
             </w:r>
           </w:p>
         </w:tc>
@@ -576,7 +648,7 @@
               <w:jc w:val="left"/>
             </w:pPr>
             <w:r>
-              <w:t xml:space="preserve">systemd теперь</w:t>
+              <w:t xml:space="preserve">systemd</w:t>
             </w:r>
             <w:r>
               <w:t xml:space="preserve"> </w:t>
@@ -609,7 +681,7 @@
               <w:t xml:space="preserve">next build</w:t>
             </w:r>
             <w:r>
-              <w:t xml:space="preserve">, память упала с ~700 МБ до ~50 МБ, страницы отдаются за единицы мс вместо десятков</w:t>
+              <w:t xml:space="preserve">, память упала с ~700 МБ до ~50 МБ</w:t>
             </w:r>
           </w:p>
         </w:tc>
@@ -623,6 +695,9 @@
               <w:jc w:val="left"/>
             </w:pPr>
             <w:r>
+              <w:rPr>
+                <w:strike/>
+              </w:rPr>
               <w:t xml:space="preserve">6</w:t>
             </w:r>
           </w:p>
@@ -635,7 +710,26 @@
               <w:jc w:val="left"/>
             </w:pPr>
             <w:r>
+              <w:rPr>
+                <w:strike/>
+              </w:rPr>
               <w:t xml:space="preserve">Нет реального домена/TLS</w:t>
+            </w:r>
+            <w:r>
+              <w:t xml:space="preserve"> </w:t>
+            </w:r>
+            <w:r>
+              <w:t xml:space="preserve">—</w:t>
+            </w:r>
+            <w:r>
+              <w:t xml:space="preserve"> </w:t>
+            </w:r>
+            <w:r>
+              <w:rPr>
+                <w:bCs/>
+                <w:b/>
+              </w:rPr>
+              <w:t xml:space="preserve">готово</w:t>
             </w:r>
           </w:p>
         </w:tc>
@@ -647,19 +741,13 @@
               <w:jc w:val="left"/>
             </w:pPr>
             <w:r>
-              <w:t xml:space="preserve">Сейчас</w:t>
-            </w:r>
-            <w:r>
-              <w:t xml:space="preserve"> </w:t>
-            </w:r>
-            <w:r>
               <w:rPr>
                 <w:rStyle w:val="VerbatimChar"/>
               </w:rPr>
-              <w:t xml:space="preserve">*.trycloudflare.com</w:t>
-            </w:r>
-            <w:r>
-              <w:t xml:space="preserve">, best-effort без гарантий аптайма</w:t>
+              <w:t xml:space="preserve">hobbyhub.ru</w:t>
+            </w:r>
+            <w:r>
+              <w:t xml:space="preserve">, TLS через Caddy/Let’s Encrypt, автопродление</w:t>
             </w:r>
           </w:p>
         </w:tc>
@@ -671,7 +759,7 @@
               <w:jc w:val="left"/>
             </w:pPr>
             <w:r>
-              <w:t xml:space="preserve">Публичному сервису нужен собственный домен и стабильный TLS</w:t>
+              <w:t xml:space="preserve">Публичный сервис теперь на постоянном адресе с гарантированным HTTPS, а не на best-effort туннеле</w:t>
             </w:r>
           </w:p>
         </w:tc>
@@ -709,7 +797,7 @@
               <w:jc w:val="left"/>
             </w:pPr>
             <w:r>
-              <w:t xml:space="preserve">Множество услуг вида «Скриншот-тест: …», «Обычная услуга регресс»</w:t>
+              <w:t xml:space="preserve">Новый сервер стартовал с чистой БД, но за время публичного тестирования уже накопились реальные тестовые аккаунты/брони</w:t>
             </w:r>
           </w:p>
         </w:tc>
@@ -721,7 +809,7 @@
               <w:jc w:val="left"/>
             </w:pPr>
             <w:r>
-              <w:t xml:space="preserve">Нельзя показывать реальным пользователям как есть</w:t>
+              <w:t xml:space="preserve">Перед широким анонсом — почистить; ниже, не растёт критично, пока сайт не мягкого-запущен</w:t>
             </w:r>
           </w:p>
         </w:tc>
@@ -841,6 +929,267 @@
     </w:p>
     <w:p>
       <w:pPr>
+        <w:pStyle w:val="FirstParagraph"/>
+      </w:pPr>
+      <w:r>
+        <w:rPr>
+          <w:bCs/>
+          <w:b/>
+        </w:rPr>
+        <w:t xml:space="preserve">Готово (2026-08-27):</w:t>
+      </w:r>
+      <w:r>
+        <w:t xml:space="preserve"> </w:t>
+      </w:r>
+      <w:r>
+        <w:t xml:space="preserve">переезд на выделенный сервер (Timeweb) —</w:t>
+      </w:r>
+      <w:r>
+        <w:t xml:space="preserve"> </w:t>
+      </w:r>
+      <w:r>
+        <w:rPr>
+          <w:rStyle w:val="VerbatimChar"/>
+        </w:rPr>
+        <w:t xml:space="preserve">scripts/server-bootstrap.sh</w:t>
+      </w:r>
+      <w:r>
+        <w:t xml:space="preserve"> </w:t>
+      </w:r>
+      <w:r>
+        <w:t xml:space="preserve">(Node/PostgreSQL+PostGIS/MinIO/Caddy/ufw/</w:t>
+      </w:r>
+      <w:r>
+        <w:t xml:space="preserve"> </w:t>
+      </w:r>
+      <w:r>
+        <w:t xml:space="preserve">непривилегированный пользователь</w:t>
+      </w:r>
+      <w:r>
+        <w:t xml:space="preserve"> </w:t>
+      </w:r>
+      <w:r>
+        <w:rPr>
+          <w:rStyle w:val="VerbatimChar"/>
+        </w:rPr>
+        <w:t xml:space="preserve">hobbyhub</w:t>
+      </w:r>
+      <w:r>
+        <w:t xml:space="preserve">, идемпотентно) +</w:t>
+      </w:r>
+      <w:r>
+        <w:t xml:space="preserve"> </w:t>
+      </w:r>
+      <w:r>
+        <w:rPr>
+          <w:rStyle w:val="VerbatimChar"/>
+        </w:rPr>
+        <w:t xml:space="preserve">scripts/deploy.sh</w:t>
+      </w:r>
+      <w:r>
+        <w:t xml:space="preserve"> </w:t>
+      </w:r>
+      <w:r>
+        <w:t xml:space="preserve">(git clone/pull, сборка, миграции, systemd-юниты,</w:t>
+      </w:r>
+      <w:r>
+        <w:t xml:space="preserve"> </w:t>
+      </w:r>
+      <w:r>
+        <w:t xml:space="preserve">Caddyfile под домен).</w:t>
+      </w:r>
+      <w:r>
+        <w:t xml:space="preserve"> </w:t>
+      </w:r>
+      <w:r>
+        <w:rPr>
+          <w:strike/>
+        </w:rPr>
+        <w:t xml:space="preserve">Домен + TLS</w:t>
+      </w:r>
+      <w:r>
+        <w:t xml:space="preserve">,</w:t>
+      </w:r>
+      <w:r>
+        <w:t xml:space="preserve"> </w:t>
+      </w:r>
+      <w:r>
+        <w:rPr>
+          <w:strike/>
+        </w:rPr>
+        <w:t xml:space="preserve">backend/frontend под root</w:t>
+      </w:r>
+      <w:r>
+        <w:t xml:space="preserve"> </w:t>
+      </w:r>
+      <w:r>
+        <w:t xml:space="preserve">—</w:t>
+      </w:r>
+      <w:r>
+        <w:t xml:space="preserve"> </w:t>
+      </w:r>
+      <w:r>
+        <w:t xml:space="preserve">оба закрыты этим же переездом (backend/frontend теперь</w:t>
+      </w:r>
+      <w:r>
+        <w:t xml:space="preserve"> </w:t>
+      </w:r>
+      <w:r>
+        <w:rPr>
+          <w:rStyle w:val="VerbatimChar"/>
+        </w:rPr>
+        <w:t xml:space="preserve">User=hobbyhub</w:t>
+      </w:r>
+      <w:r>
+        <w:t xml:space="preserve">,</w:t>
+      </w:r>
+      <w:r>
+        <w:t xml:space="preserve"> </w:t>
+      </w:r>
+      <w:r>
+        <w:t xml:space="preserve">не root). Пошаговая шпаргалка по типовым операциям —</w:t>
+      </w:r>
+      <w:r>
+        <w:t xml:space="preserve"> </w:t>
+      </w:r>
+      <w:r>
+        <w:rPr>
+          <w:rStyle w:val="VerbatimChar"/>
+        </w:rPr>
+        <w:t xml:space="preserve">docs/server-cheatsheet.md</w:t>
+      </w:r>
+      <w:r>
+        <w:t xml:space="preserve">.</w:t>
+      </w:r>
+    </w:p>
+    <w:p>
+      <w:pPr>
+        <w:pStyle w:val="BodyText"/>
+      </w:pPr>
+      <w:r>
+        <w:t xml:space="preserve">Осталось:</w:t>
+      </w:r>
+      <w:r>
+        <w:t xml:space="preserve"> </w:t>
+      </w:r>
+      <w:r>
+        <w:t xml:space="preserve">- Хостинг: рассмотреть managed-сервисы (уже рекомендовано в</w:t>
+      </w:r>
+      <w:r>
+        <w:t xml:space="preserve"> </w:t>
+      </w:r>
+      <w:r>
+        <w:t xml:space="preserve">tz-amendments п.9) — Managed PostgreSQL с автобэкапами и PITR,</w:t>
+      </w:r>
+      <w:r>
+        <w:t xml:space="preserve"> </w:t>
+      </w:r>
+      <w:r>
+        <w:t xml:space="preserve">S3-совместимое хранилище вместо self-hosted MinIO. Не блокирует</w:t>
+      </w:r>
+      <w:r>
+        <w:t xml:space="preserve"> </w:t>
+      </w:r>
+      <w:r>
+        <w:t xml:space="preserve">запуск при разумном трафике, но снижает риск при росте нагрузки —</w:t>
+      </w:r>
+      <w:r>
+        <w:t xml:space="preserve"> </w:t>
+      </w:r>
+      <w:r>
+        <w:t xml:space="preserve">решить по факту, не обязательно до первого релиза.</w:t>
+      </w:r>
+      <w:r>
+        <w:t xml:space="preserve"> </w:t>
+      </w:r>
+      <w:r>
+        <w:t xml:space="preserve">- CI/CD (GitHub Actions, раз репозиторий уже на GitHub): lint + typecheck</w:t>
+      </w:r>
+      <w:r>
+        <w:t xml:space="preserve"> </w:t>
+      </w:r>
+      <w:r>
+        <w:t xml:space="preserve">+ build на каждый PR, ручной или автоматический деплой на push в main</w:t>
+      </w:r>
+      <w:r>
+        <w:t xml:space="preserve"> </w:t>
+      </w:r>
+      <w:r>
+        <w:t xml:space="preserve">(сейчас деплой — ручной запуск</w:t>
+      </w:r>
+      <w:r>
+        <w:t xml:space="preserve"> </w:t>
+      </w:r>
+      <w:r>
+        <w:rPr>
+          <w:rStyle w:val="VerbatimChar"/>
+        </w:rPr>
+        <w:t xml:space="preserve">deploy.sh</w:t>
+      </w:r>
+      <w:r>
+        <w:t xml:space="preserve"> </w:t>
+      </w:r>
+      <w:r>
+        <w:t xml:space="preserve">по SSH).</w:t>
+      </w:r>
+      <w:r>
+        <w:t xml:space="preserve"> </w:t>
+      </w:r>
+      <w:r>
+        <w:t xml:space="preserve">- Секреты: сейчас</w:t>
+      </w:r>
+      <w:r>
+        <w:t xml:space="preserve"> </w:t>
+      </w:r>
+      <w:r>
+        <w:rPr>
+          <w:rStyle w:val="VerbatimChar"/>
+        </w:rPr>
+        <w:t xml:space="preserve">.env</w:t>
+      </w:r>
+      <w:r>
+        <w:t xml:space="preserve"> </w:t>
+      </w:r>
+      <w:r>
+        <w:t xml:space="preserve">с правами 600, свежесгенерированы при</w:t>
+      </w:r>
+      <w:r>
+        <w:t xml:space="preserve"> </w:t>
+      </w:r>
+      <w:r>
+        <w:t xml:space="preserve">bootstrap — приемлемо для старта; секрет-менеджер хостинг-провайдера</w:t>
+      </w:r>
+      <w:r>
+        <w:t xml:space="preserve"> </w:t>
+      </w:r>
+      <w:r>
+        <w:t xml:space="preserve">можно добавить позже, не блокер.</w:t>
+      </w:r>
+      <w:r>
+        <w:t xml:space="preserve"> </w:t>
+      </w:r>
+      <w:r>
+        <w:t xml:space="preserve">- resource limits в systemd-юнитах (сейчас без ограничений по</w:t>
+      </w:r>
+      <w:r>
+        <w:t xml:space="preserve"> </w:t>
+      </w:r>
+      <w:r>
+        <w:t xml:space="preserve">памяти/CPU) — желательно перед реальной нагрузкой, не блокер MVP.</w:t>
+      </w:r>
+    </w:p>
+    <w:bookmarkEnd w:id="23"/>
+    <w:bookmarkStart w:id="24" w:name="фаза-2-надёжность-данных"/>
+    <w:p>
+      <w:pPr>
+        <w:pStyle w:val="Heading3"/>
+      </w:pPr>
+      <w:r>
+        <w:t xml:space="preserve">Фаза 2 — Надёжность данных</w:t>
+      </w:r>
+    </w:p>
+    <w:p>
+      <w:pPr>
         <w:numPr>
           <w:ilvl w:val="0"/>
           <w:numId w:val="1001"/>
@@ -848,25 +1197,13 @@
         <w:pStyle w:val="Compact"/>
       </w:pPr>
       <w:r>
-        <w:t xml:space="preserve">Хостинг: перейти с текущей self-hosted VM-конфигурации на managed-</w:t>
-      </w:r>
-      <w:r>
-        <w:t xml:space="preserve"> </w:t>
-      </w:r>
-      <w:r>
-        <w:t xml:space="preserve">сервисы (уже рекомендовано в tz-amendments п.9) — Managed PostgreSQL</w:t>
-      </w:r>
-      <w:r>
-        <w:t xml:space="preserve"> </w:t>
-      </w:r>
-      <w:r>
-        <w:t xml:space="preserve">с автобэкапами и PITR, managed Redis, S3-совместимое хранилище вместо</w:t>
-      </w:r>
-      <w:r>
-        <w:t xml:space="preserve"> </w:t>
-      </w:r>
-      <w:r>
-        <w:t xml:space="preserve">self-hosted MinIO.</w:t>
+        <w:t xml:space="preserve">Проверить и протестировать восстановление из бэкапов БД (не просто</w:t>
+      </w:r>
+      <w:r>
+        <w:t xml:space="preserve"> </w:t>
+      </w:r>
+      <w:r>
+        <w:t xml:space="preserve">включить автобэкап, а реально прогнать restore на staging).</w:t>
       </w:r>
     </w:p>
     <w:p>
@@ -878,13 +1215,7 @@
         <w:pStyle w:val="Compact"/>
       </w:pPr>
       <w:r>
-        <w:t xml:space="preserve">Домен + TLS (реальный домен, сертификат через Let’s Encrypt или</w:t>
-      </w:r>
-      <w:r>
-        <w:t xml:space="preserve"> </w:t>
-      </w:r>
-      <w:r>
-        <w:t xml:space="preserve">хостинг-провайдера), обратный прокси перед backend/frontend.</w:t>
+        <w:t xml:space="preserve">Бэкап object storage (фото услуг, аватары, фото в отзывах).</w:t>
       </w:r>
     </w:p>
     <w:p>
@@ -896,76 +1227,13 @@
         <w:pStyle w:val="Compact"/>
       </w:pPr>
       <w:r>
-        <w:rPr>
-          <w:strike/>
-        </w:rPr>
-        <w:t xml:space="preserve">Frontend: переключить с</w:t>
-      </w:r>
-      <w:r>
-        <w:rPr>
-          <w:strike/>
-        </w:rPr>
-        <w:t xml:space="preserve"> </w:t>
-      </w:r>
-      <w:r>
-        <w:rPr>
-          <w:rStyle w:val="VerbatimChar"/>
-          <w:strike/>
-        </w:rPr>
-        <w:t xml:space="preserve">next dev</w:t>
-      </w:r>
-      <w:r>
-        <w:rPr>
-          <w:strike/>
-        </w:rPr>
-        <w:t xml:space="preserve"> </w:t>
-      </w:r>
-      <w:r>
-        <w:rPr>
-          <w:strike/>
-        </w:rPr>
-        <w:t xml:space="preserve">на</w:t>
-      </w:r>
-      <w:r>
-        <w:rPr>
-          <w:strike/>
-        </w:rPr>
-        <w:t xml:space="preserve"> </w:t>
-      </w:r>
-      <w:r>
-        <w:rPr>
-          <w:rStyle w:val="VerbatimChar"/>
-          <w:strike/>
-        </w:rPr>
-        <w:t xml:space="preserve">next build &amp;&amp; next start</w:t>
-      </w:r>
-      <w:r>
-        <w:rPr>
-          <w:strike/>
-        </w:rPr>
-        <w:t xml:space="preserve">,</w:t>
-      </w:r>
-      <w:r>
-        <w:rPr>
-          <w:strike/>
-        </w:rPr>
-        <w:t xml:space="preserve"> </w:t>
-      </w:r>
-      <w:r>
-        <w:rPr>
-          <w:strike/>
-        </w:rPr>
-        <w:t xml:space="preserve">обновить systemd-unit.</w:t>
-      </w:r>
-      <w:r>
-        <w:t xml:space="preserve"> </w:t>
-      </w:r>
-      <w:r>
-        <w:rPr>
-          <w:bCs/>
-          <w:b/>
-        </w:rPr>
-        <w:t xml:space="preserve">Готово.</w:t>
+        <w:t xml:space="preserve">Health-check эндпоинты + аптайм-мониторинг + сбор ошибок (Sentry или</w:t>
+      </w:r>
+      <w:r>
+        <w:t xml:space="preserve"> </w:t>
+      </w:r>
+      <w:r>
+        <w:t xml:space="preserve">аналог) — сейчас никакого мониторинга ошибок в проде нет.</w:t>
       </w:r>
     </w:p>
     <w:p>
@@ -977,121 +1245,205 @@
         <w:pStyle w:val="Compact"/>
       </w:pPr>
       <w:r>
-        <w:t xml:space="preserve">Backend: пересоздать systemd-unit под отдельным непривилегированным</w:t>
-      </w:r>
-      <w:r>
-        <w:t xml:space="preserve"> </w:t>
-      </w:r>
-      <w:r>
-        <w:t xml:space="preserve">пользователем (сейчас</w:t>
-      </w:r>
-      <w:r>
-        <w:t xml:space="preserve"> </w:t>
-      </w:r>
-      <w:r>
-        <w:rPr>
-          <w:rStyle w:val="VerbatimChar"/>
-        </w:rPr>
-        <w:t xml:space="preserve">User=root</w:t>
-      </w:r>
-      <w:r>
-        <w:t xml:space="preserve"> </w:t>
-      </w:r>
-      <w:r>
-        <w:t xml:space="preserve">— снизить привилегии), добавить</w:t>
-      </w:r>
-      <w:r>
-        <w:t xml:space="preserve"> </w:t>
-      </w:r>
-      <w:r>
-        <w:t xml:space="preserve">resource limits.</w:t>
+        <w:t xml:space="preserve">Логирование: структурированные логи backend с ротацией.</w:t>
+      </w:r>
+    </w:p>
+    <w:bookmarkEnd w:id="24"/>
+    <w:bookmarkStart w:id="25" w:name="фаза-3-email"/>
+    <w:p>
+      <w:pPr>
+        <w:pStyle w:val="Heading3"/>
+      </w:pPr>
+      <w:r>
+        <w:t xml:space="preserve">Фаза 3 — Email</w:t>
+      </w:r>
+    </w:p>
+    <w:p>
+      <w:pPr>
+        <w:pStyle w:val="FirstParagraph"/>
+      </w:pPr>
+      <w:r>
+        <w:t xml:space="preserve">Ранее откладывали до появления домена (SPF/DKIM/DMARC не настроить без</w:t>
+      </w:r>
+      <w:r>
+        <w:t xml:space="preserve"> </w:t>
+      </w:r>
+      <w:r>
+        <w:t xml:space="preserve">него) — теперь домен есть (</w:t>
+      </w:r>
+      <w:r>
+        <w:rPr>
+          <w:rStyle w:val="VerbatimChar"/>
+        </w:rPr>
+        <w:t xml:space="preserve">hobbyhub.ru</w:t>
+      </w:r>
+      <w:r>
+        <w:t xml:space="preserve">), блокер снят, можно начинать.</w:t>
       </w:r>
     </w:p>
     <w:p>
       <w:pPr>
         <w:numPr>
           <w:ilvl w:val="0"/>
-          <w:numId w:val="1001"/>
-        </w:numPr>
-        <w:pStyle w:val="Compact"/>
-      </w:pPr>
-      <w:r>
-        <w:rPr>
-          <w:strike/>
-        </w:rPr>
-        <w:t xml:space="preserve">Убрать Basic Auth гейт (пункт 4 блокеров) и связанный с ним код в</w:t>
-      </w:r>
-      <w:r>
-        <w:rPr>
-          <w:strike/>
-        </w:rPr>
-        <w:t xml:space="preserve"> </w:t>
-      </w:r>
-      <w:r>
-        <w:rPr>
-          <w:rStyle w:val="VerbatimChar"/>
-          <w:strike/>
-        </w:rPr>
-        <w:t xml:space="preserve">middleware.ts</w:t>
-      </w:r>
-      <w:r>
-        <w:rPr>
-          <w:strike/>
-        </w:rPr>
-        <w:t xml:space="preserve">/</w:t>
-      </w:r>
-      <w:r>
-        <w:rPr>
-          <w:rStyle w:val="VerbatimChar"/>
-          <w:strike/>
-        </w:rPr>
-        <w:t xml:space="preserve">main.ts</w:t>
-      </w:r>
-      <w:r>
-        <w:t xml:space="preserve"> </w:t>
-      </w:r>
-      <w:r>
-        <w:rPr>
-          <w:bCs/>
-          <w:b/>
-        </w:rPr>
-        <w:t xml:space="preserve">Готово.</w:t>
-      </w:r>
-    </w:p>
-    <w:p>
-      <w:pPr>
-        <w:numPr>
-          <w:ilvl w:val="0"/>
-          <w:numId w:val="1001"/>
-        </w:numPr>
-        <w:pStyle w:val="Compact"/>
-      </w:pPr>
-      <w:r>
-        <w:t xml:space="preserve">CI/CD (GitHub Actions, раз репозиторий уже на GitHub): lint + typecheck</w:t>
-      </w:r>
-    </w:p>
-    <w:p>
-      <w:pPr>
-        <w:numPr>
-          <w:ilvl w:val="1"/>
           <w:numId w:val="1002"/>
         </w:numPr>
         <w:pStyle w:val="Compact"/>
       </w:pPr>
       <w:r>
-        <w:t xml:space="preserve">build на каждый PR, ручной или автоматический деплой на push в main.</w:t>
+        <w:t xml:space="preserve">Подключить реального провайдера (SendGrid / Mailgun / Yandex Cloud</w:t>
+      </w:r>
+      <w:r>
+        <w:t xml:space="preserve"> </w:t>
+      </w:r>
+      <w:r>
+        <w:t xml:space="preserve">почтовый сервис) вместо</w:t>
+      </w:r>
+      <w:r>
+        <w:t xml:space="preserve"> </w:t>
+      </w:r>
+      <w:r>
+        <w:rPr>
+          <w:rStyle w:val="VerbatimChar"/>
+        </w:rPr>
+        <w:t xml:space="preserve">mail.service.ts</w:t>
+      </w:r>
+      <w:r>
+        <w:t xml:space="preserve">-заглушки — интерфейс методов</w:t>
+      </w:r>
+      <w:r>
+        <w:t xml:space="preserve"> </w:t>
+      </w:r>
+      <w:r>
+        <w:t xml:space="preserve">менять не нужно, только реализацию (например, через</w:t>
+      </w:r>
+      <w:r>
+        <w:t xml:space="preserve"> </w:t>
+      </w:r>
+      <w:r>
+        <w:rPr>
+          <w:rStyle w:val="VerbatimChar"/>
+        </w:rPr>
+        <w:t xml:space="preserve">nodemailer</w:t>
+      </w:r>
+      <w:r>
+        <w:t xml:space="preserve"> </w:t>
+      </w:r>
+      <w:r>
+        <w:t xml:space="preserve">+ SMTP,</w:t>
+      </w:r>
+      <w:r>
+        <w:t xml:space="preserve"> </w:t>
+      </w:r>
+      <w:r>
+        <w:t xml:space="preserve">настраиваемое через env —</w:t>
+      </w:r>
+      <w:r>
+        <w:t xml:space="preserve"> </w:t>
+      </w:r>
+      <w:r>
+        <w:rPr>
+          <w:rStyle w:val="VerbatimChar"/>
+        </w:rPr>
+        <w:t xml:space="preserve">SMTP_HOST/PORT/USER/PASSWORD/MAIL_FROM</w:t>
+      </w:r>
+      <w:r>
+        <w:t xml:space="preserve">).</w:t>
       </w:r>
     </w:p>
     <w:p>
       <w:pPr>
         <w:numPr>
           <w:ilvl w:val="0"/>
-          <w:numId w:val="1001"/>
+          <w:numId w:val="1002"/>
         </w:numPr>
         <w:pStyle w:val="Compact"/>
       </w:pPr>
       <w:r>
-        <w:t xml:space="preserve">Секреты: развести dev/prod-значения, ограничить доступ к prod</w:t>
+        <w:t xml:space="preserve">Настроить SPF/DKIM/DMARC для</w:t>
+      </w:r>
+      <w:r>
+        <w:t xml:space="preserve"> </w:t>
+      </w:r>
+      <w:r>
+        <w:rPr>
+          <w:rStyle w:val="VerbatimChar"/>
+        </w:rPr>
+        <w:t xml:space="preserve">hobbyhub.ru</w:t>
+      </w:r>
+      <w:r>
+        <w:t xml:space="preserve"> </w:t>
+      </w:r>
+      <w:r>
+        <w:t xml:space="preserve">(DNS-записи у регистратора</w:t>
+      </w:r>
+      <w:r>
+        <w:t xml:space="preserve"> </w:t>
+      </w:r>
+      <w:r>
+        <w:t xml:space="preserve">или через NS-хостинг Timeweb, куда уже переключены NS-серверы домена),</w:t>
+      </w:r>
+      <w:r>
+        <w:t xml:space="preserve"> </w:t>
+      </w:r>
+      <w:r>
+        <w:t xml:space="preserve">иначе письма будут попадать в спам.</w:t>
+      </w:r>
+    </w:p>
+    <w:p>
+      <w:pPr>
+        <w:numPr>
+          <w:ilvl w:val="0"/>
+          <w:numId w:val="1002"/>
+        </w:numPr>
+        <w:pStyle w:val="Compact"/>
+      </w:pPr>
+      <w:r>
+        <w:t xml:space="preserve">До подключения провайдера можно проверить саму реализацию на бесплатном</w:t>
+      </w:r>
+      <w:r>
+        <w:t xml:space="preserve"> </w:t>
+      </w:r>
+      <w:r>
+        <w:t xml:space="preserve">тестовом SMTP вроде Ethereal Email — письма никуда не уходят, но код и</w:t>
+      </w:r>
+      <w:r>
+        <w:t xml:space="preserve"> </w:t>
+      </w:r>
+      <w:r>
+        <w:t xml:space="preserve">flow проверяются end-to-end.</w:t>
+      </w:r>
+    </w:p>
+    <w:bookmarkEnd w:id="25"/>
+    <w:bookmarkStart w:id="26" w:name="фаза-4-реальные-платежи"/>
+    <w:p>
+      <w:pPr>
+        <w:pStyle w:val="Heading3"/>
+      </w:pPr>
+      <w:r>
+        <w:t xml:space="preserve">Фаза 4 — Реальные платежи</w:t>
+      </w:r>
+    </w:p>
+    <w:p>
+      <w:pPr>
+        <w:pStyle w:val="FirstParagraph"/>
+      </w:pPr>
+      <w:r>
+        <w:t xml:space="preserve">Возможна только после Фазы 0. До этой фазы бронирование скрыто флагом</w:t>
+      </w:r>
+      <w:r>
+        <w:t xml:space="preserve"> </w:t>
+      </w:r>
+      <w:r>
+        <w:rPr>
+          <w:rStyle w:val="VerbatimChar"/>
+        </w:rPr>
+        <w:t xml:space="preserve">ORDERS_DISABLED</w:t>
+      </w:r>
+      <w:r>
+        <w:t xml:space="preserve"> </w:t>
+      </w:r>
+      <w:r>
+        <w:t xml:space="preserve">(backend</w:t>
       </w:r>
       <w:r>
         <w:t xml:space="preserve"> </w:t>
@@ -1103,26 +1455,604 @@
         <w:t xml:space="preserve">.env</w:t>
       </w:r>
       <w:r>
-        <w:t xml:space="preserve"> </w:t>
-      </w:r>
-      <w:r>
-        <w:t xml:space="preserve">(хотя бы права на файл + отдельный сервисный пользователь; в идеале —</w:t>
-      </w:r>
-      <w:r>
-        <w:t xml:space="preserve"> </w:t>
-      </w:r>
-      <w:r>
-        <w:t xml:space="preserve">секрет-менеджер хостинг-провайдера).</w:t>
-      </w:r>
-    </w:p>
-    <w:bookmarkEnd w:id="23"/>
-    <w:bookmarkStart w:id="24" w:name="фаза-2-надёжность-данных"/>
+        <w:t xml:space="preserve">) /</w:t>
+      </w:r>
+      <w:r>
+        <w:t xml:space="preserve"> </w:t>
+      </w:r>
+      <w:r>
+        <w:rPr>
+          <w:rStyle w:val="VerbatimChar"/>
+        </w:rPr>
+        <w:t xml:space="preserve">NEXT_PUBLIC_ORDERS_DISABLED</w:t>
+      </w:r>
+      <w:r>
+        <w:t xml:space="preserve"> </w:t>
+      </w:r>
+      <w:r>
+        <w:t xml:space="preserve">(frontend</w:t>
+      </w:r>
+      <w:r>
+        <w:t xml:space="preserve"> </w:t>
+      </w:r>
+      <w:r>
+        <w:rPr>
+          <w:rStyle w:val="VerbatimChar"/>
+        </w:rPr>
+        <w:t xml:space="preserve">.env.local</w:t>
+      </w:r>
+      <w:r>
+        <w:t xml:space="preserve">) — сайт открыт для просмотра/регистрации, но</w:t>
+      </w:r>
+      <w:r>
+        <w:t xml:space="preserve"> </w:t>
+      </w:r>
+      <w:r>
+        <w:t xml:space="preserve">попытка оформить бронь показывает «сайт в разработке». Снимается без</w:t>
+      </w:r>
+      <w:r>
+        <w:t xml:space="preserve"> </w:t>
+      </w:r>
+      <w:r>
+        <w:t xml:space="preserve">правок кода — убрать обе переменные и передеплоить.</w:t>
+      </w:r>
+      <w:r>
+        <w:t xml:space="preserve"> </w:t>
+      </w:r>
+      <w:r>
+        <w:t xml:space="preserve">- Реализовать реальный класс</w:t>
+      </w:r>
+      <w:r>
+        <w:t xml:space="preserve"> </w:t>
+      </w:r>
+      <w:r>
+        <w:rPr>
+          <w:rStyle w:val="VerbatimChar"/>
+        </w:rPr>
+        <w:t xml:space="preserve">PaymentProvider</w:t>
+      </w:r>
+      <w:r>
+        <w:t xml:space="preserve"> </w:t>
+      </w:r>
+      <w:r>
+        <w:t xml:space="preserve">вместо</w:t>
+      </w:r>
+      <w:r>
+        <w:t xml:space="preserve"> </w:t>
+      </w:r>
+      <w:r>
+        <w:rPr>
+          <w:rStyle w:val="VerbatimChar"/>
+        </w:rPr>
+        <w:t xml:space="preserve">MockYookassaProvider</w:t>
+      </w:r>
+      <w:r>
+        <w:t xml:space="preserve"> </w:t>
+      </w:r>
+      <w:r>
+        <w:t xml:space="preserve">— архитектурно уже готово (весь остальной код</w:t>
+      </w:r>
+      <w:r>
+        <w:t xml:space="preserve"> </w:t>
+      </w:r>
+      <w:r>
+        <w:t xml:space="preserve">работает через интерфейс, подстановка класса под токеном</w:t>
+      </w:r>
+      <w:r>
+        <w:t xml:space="preserve"> </w:t>
+      </w:r>
+      <w:r>
+        <w:rPr>
+          <w:rStyle w:val="VerbatimChar"/>
+        </w:rPr>
+        <w:t xml:space="preserve">PAYMENT_PROVIDER</w:t>
+      </w:r>
+      <w:r>
+        <w:t xml:space="preserve"> </w:t>
+      </w:r>
+      <w:r>
+        <w:t xml:space="preserve">не требует правок в бронированиях/эскроу-логике).</w:t>
+      </w:r>
+      <w:r>
+        <w:t xml:space="preserve"> </w:t>
+      </w:r>
+      <w:r>
+        <w:t xml:space="preserve">- Реализовать флоу верификации продавца перед первой выплатой (поле</w:t>
+      </w:r>
+      <w:r>
+        <w:t xml:space="preserve"> </w:t>
+      </w:r>
+      <w:r>
+        <w:rPr>
+          <w:rStyle w:val="VerbatimChar"/>
+        </w:rPr>
+        <w:t xml:space="preserve">isSellerVerified</w:t>
+      </w:r>
+      <w:r>
+        <w:t xml:space="preserve"> </w:t>
+      </w:r>
+      <w:r>
+        <w:t xml:space="preserve">в модели уже есть, самого KYC-процесса — нет).</w:t>
+      </w:r>
+      <w:r>
+        <w:t xml:space="preserve"> </w:t>
+      </w:r>
+      <w:r>
+        <w:t xml:space="preserve">- Прогнать сквозной тест реальных платежей в sandbox-режиме провайдера</w:t>
+      </w:r>
+      <w:r>
+        <w:t xml:space="preserve"> </w:t>
+      </w:r>
+      <w:r>
+        <w:t xml:space="preserve">перед боевым переключением.</w:t>
+      </w:r>
+    </w:p>
+    <w:bookmarkEnd w:id="26"/>
+    <w:bookmarkStart w:id="27" w:name="фаза-5-тестирование-и-безопасность"/>
     <w:p>
       <w:pPr>
         <w:pStyle w:val="Heading3"/>
       </w:pPr>
       <w:r>
-        <w:t xml:space="preserve">Фаза 2 — Надёжность данных</w:t>
+        <w:t xml:space="preserve">Фаза 5 — Тестирование и безопасность</w:t>
+      </w:r>
+    </w:p>
+    <w:p>
+      <w:pPr>
+        <w:pStyle w:val="FirstParagraph"/>
+      </w:pPr>
+      <w:r>
+        <w:rPr>
+          <w:bCs/>
+          <w:b/>
+        </w:rPr>
+        <w:t xml:space="preserve">Готово (2026-08-27):</w:t>
+      </w:r>
+      <w:r>
+        <w:t xml:space="preserve"> </w:t>
+      </w:r>
+      <w:r>
+        <w:t xml:space="preserve">полный аудит безопасности перед релизом (auth/authz,</w:t>
+      </w:r>
+      <w:r>
+        <w:t xml:space="preserve"> </w:t>
+      </w:r>
+      <w:r>
+        <w:t xml:space="preserve">инъекции, загрузка файлов, секреты, CORS, rate limiting, эскроу-логика,</w:t>
+      </w:r>
+      <w:r>
+        <w:t xml:space="preserve"> </w:t>
+      </w:r>
+      <w:r>
+        <w:t xml:space="preserve">админка, зависимости). Найденное и исправленное:</w:t>
+      </w:r>
+      <w:r>
+        <w:t xml:space="preserve"> </w:t>
+      </w:r>
+      <w:r>
+        <w:t xml:space="preserve">- Basic Auth гейт обходился подделкой</w:t>
+      </w:r>
+      <w:r>
+        <w:t xml:space="preserve"> </w:t>
+      </w:r>
+      <w:r>
+        <w:rPr>
+          <w:rStyle w:val="VerbatimChar"/>
+        </w:rPr>
+        <w:t xml:space="preserve">Authorization: Bearer x</w:t>
+      </w:r>
+      <w:r>
+        <w:t xml:space="preserve"> </w:t>
+      </w:r>
+      <w:r>
+        <w:t xml:space="preserve">— гейт</w:t>
+      </w:r>
+      <w:r>
+        <w:t xml:space="preserve"> </w:t>
+      </w:r>
+      <w:r>
+        <w:t xml:space="preserve">снят полностью (см. блокер №4 выше).</w:t>
+      </w:r>
+      <w:r>
+        <w:t xml:space="preserve"> </w:t>
+      </w:r>
+      <w:r>
+        <w:t xml:space="preserve">- Токены сброса пароля/подтверждения email писались в лог в открытом виде</w:t>
+      </w:r>
+      <w:r>
+        <w:t xml:space="preserve"> </w:t>
+      </w:r>
+      <w:r>
+        <w:t xml:space="preserve">в проде — теперь логируются только вне</w:t>
+      </w:r>
+      <w:r>
+        <w:t xml:space="preserve"> </w:t>
+      </w:r>
+      <w:r>
+        <w:rPr>
+          <w:rStyle w:val="VerbatimChar"/>
+        </w:rPr>
+        <w:t xml:space="preserve">NODE_ENV=production</w:t>
+      </w:r>
+      <w:r>
+        <w:t xml:space="preserve"> </w:t>
+      </w:r>
+      <w:r>
+        <w:t xml:space="preserve">(</w:t>
+      </w:r>
+      <w:r>
+        <w:rPr>
+          <w:rStyle w:val="VerbatimChar"/>
+        </w:rPr>
+        <w:t xml:space="preserve">backend/src/mail/mail.service.ts</w:t>
+      </w:r>
+      <w:r>
+        <w:t xml:space="preserve">); сама отправка писем по-прежнему</w:t>
+      </w:r>
+      <w:r>
+        <w:t xml:space="preserve"> </w:t>
+      </w:r>
+      <w:r>
+        <w:t xml:space="preserve">не реализована (см. Фазу 3).</w:t>
+      </w:r>
+      <w:r>
+        <w:t xml:space="preserve"> </w:t>
+      </w:r>
+      <w:r>
+        <w:t xml:space="preserve">- WebSocket</w:t>
+      </w:r>
+      <w:r>
+        <w:t xml:space="preserve"> </w:t>
+      </w:r>
+      <w:r>
+        <w:rPr>
+          <w:rStyle w:val="VerbatimChar"/>
+        </w:rPr>
+        <w:t xml:space="preserve">chat:join</w:t>
+      </w:r>
+      <w:r>
+        <w:t xml:space="preserve"> </w:t>
+      </w:r>
+      <w:r>
+        <w:t xml:space="preserve">пускал в комнату любого чата без проверки, что</w:t>
+      </w:r>
+      <w:r>
+        <w:t xml:space="preserve"> </w:t>
+      </w:r>
+      <w:r>
+        <w:t xml:space="preserve">пользователь — участник (можно было слушать чужую переписку по</w:t>
+      </w:r>
+      <w:r>
+        <w:t xml:space="preserve"> </w:t>
+      </w:r>
+      <w:r>
+        <w:t xml:space="preserve">известному chatId) — добавлена проверка через</w:t>
+      </w:r>
+      <w:r>
+        <w:t xml:space="preserve"> </w:t>
+      </w:r>
+      <w:r>
+        <w:rPr>
+          <w:rStyle w:val="VerbatimChar"/>
+        </w:rPr>
+        <w:t xml:space="preserve">getChatForParticipant</w:t>
+      </w:r>
+      <w:r>
+        <w:t xml:space="preserve"> </w:t>
+      </w:r>
+      <w:r>
+        <w:t xml:space="preserve">(</w:t>
+      </w:r>
+      <w:r>
+        <w:rPr>
+          <w:rStyle w:val="VerbatimChar"/>
+        </w:rPr>
+        <w:t xml:space="preserve">backend/src/chats/chats.gateway.ts</w:t>
+      </w:r>
+      <w:r>
+        <w:t xml:space="preserve">).</w:t>
+      </w:r>
+      <w:r>
+        <w:t xml:space="preserve"> </w:t>
+      </w:r>
+      <w:r>
+        <w:t xml:space="preserve">- Presigned upload в MinIO принимал</w:t>
+      </w:r>
+      <w:r>
+        <w:t xml:space="preserve"> </w:t>
+      </w:r>
+      <w:r>
+        <w:rPr>
+          <w:rStyle w:val="VerbatimChar"/>
+        </w:rPr>
+        <w:t xml:space="preserve">Content-Type</w:t>
+      </w:r>
+      <w:r>
+        <w:t xml:space="preserve"> </w:t>
+      </w:r>
+      <w:r>
+        <w:t xml:space="preserve">по префиксу</w:t>
+      </w:r>
+      <w:r>
+        <w:t xml:space="preserve"> </w:t>
+      </w:r>
+      <w:r>
+        <w:rPr>
+          <w:rStyle w:val="VerbatimChar"/>
+        </w:rPr>
+        <w:t xml:space="preserve">image/</w:t>
+      </w:r>
+      <w:r>
+        <w:t xml:space="preserve"> </w:t>
+      </w:r>
+      <w:r>
+        <w:t xml:space="preserve">(пропускал</w:t>
+      </w:r>
+      <w:r>
+        <w:t xml:space="preserve"> </w:t>
+      </w:r>
+      <w:r>
+        <w:rPr>
+          <w:rStyle w:val="VerbatimChar"/>
+        </w:rPr>
+        <w:t xml:space="preserve">image/svg+xml</w:t>
+      </w:r>
+      <w:r>
+        <w:t xml:space="preserve"> </w:t>
+      </w:r>
+      <w:r>
+        <w:t xml:space="preserve">— потенциальный stored XSS) — заменено на</w:t>
+      </w:r>
+      <w:r>
+        <w:t xml:space="preserve"> </w:t>
+      </w:r>
+      <w:r>
+        <w:t xml:space="preserve">точное совпадение (</w:t>
+      </w:r>
+      <w:r>
+        <w:rPr>
+          <w:rStyle w:val="VerbatimChar"/>
+        </w:rPr>
+        <w:t xml:space="preserve">backend/src/uploads/uploads.service.ts</w:t>
+      </w:r>
+      <w:r>
+        <w:t xml:space="preserve">).</w:t>
+      </w:r>
+      <w:r>
+        <w:t xml:space="preserve"> </w:t>
+      </w:r>
+      <w:r>
+        <w:t xml:space="preserve">-</w:t>
+      </w:r>
+      <w:r>
+        <w:t xml:space="preserve"> </w:t>
+      </w:r>
+      <w:r>
+        <w:rPr>
+          <w:rStyle w:val="VerbatimChar"/>
+        </w:rPr>
+        <w:t xml:space="preserve">fixedAmount</w:t>
+      </w:r>
+      <w:r>
+        <w:t xml:space="preserve"> </w:t>
+      </w:r>
+      <w:r>
+        <w:t xml:space="preserve">при подтверждении брони с договорной ценой не проверялся</w:t>
+      </w:r>
+      <w:r>
+        <w:t xml:space="preserve"> </w:t>
+      </w:r>
+      <w:r>
+        <w:t xml:space="preserve">на положительность — добавлена валидация</w:t>
+      </w:r>
+      <w:r>
+        <w:t xml:space="preserve"> </w:t>
+      </w:r>
+      <w:r>
+        <w:t xml:space="preserve">(</w:t>
+      </w:r>
+      <w:r>
+        <w:rPr>
+          <w:rStyle w:val="VerbatimChar"/>
+        </w:rPr>
+        <w:t xml:space="preserve">backend/src/bookings/dto/confirm-booking.dto.ts</w:t>
+      </w:r>
+      <w:r>
+        <w:t xml:space="preserve">).</w:t>
+      </w:r>
+      <w:r>
+        <w:t xml:space="preserve"> </w:t>
+      </w:r>
+      <w:r>
+        <w:t xml:space="preserve">-</w:t>
+      </w:r>
+      <w:r>
+        <w:t xml:space="preserve"> </w:t>
+      </w:r>
+      <w:r>
+        <w:rPr>
+          <w:rStyle w:val="VerbatimChar"/>
+        </w:rPr>
+        <w:t xml:space="preserve">npm audit</w:t>
+      </w:r>
+      <w:r>
+        <w:t xml:space="preserve"> </w:t>
+      </w:r>
+      <w:r>
+        <w:t xml:space="preserve">(backend и frontend) — 0 уязвимостей после</w:t>
+      </w:r>
+      <w:r>
+        <w:t xml:space="preserve"> </w:t>
+      </w:r>
+      <w:r>
+        <w:rPr>
+          <w:rStyle w:val="VerbatimChar"/>
+        </w:rPr>
+        <w:t xml:space="preserve">npm audit fix</w:t>
+      </w:r>
+      <w:r>
+        <w:t xml:space="preserve">.</w:t>
+      </w:r>
+    </w:p>
+    <w:p>
+      <w:pPr>
+        <w:pStyle w:val="BodyText"/>
+      </w:pPr>
+      <w:r>
+        <w:t xml:space="preserve">Не исправлено, осознанно отложено:</w:t>
+      </w:r>
+      <w:r>
+        <w:t xml:space="preserve"> </w:t>
+      </w:r>
+      <w:r>
+        <w:t xml:space="preserve">- Внешние URL для аватара/фото услуг/фото отзывов не ограничены доменом</w:t>
+      </w:r>
+      <w:r>
+        <w:t xml:space="preserve"> </w:t>
+      </w:r>
+      <w:r>
+        <w:t xml:space="preserve">собственного хранилища (можно подменить контент после модерации) —</w:t>
+      </w:r>
+      <w:r>
+        <w:t xml:space="preserve"> </w:t>
+      </w:r>
+      <w:r>
+        <w:t xml:space="preserve">требует решения, ограничивать ли строго</w:t>
+      </w:r>
+      <w:r>
+        <w:t xml:space="preserve"> </w:t>
+      </w:r>
+      <w:r>
+        <w:rPr>
+          <w:rStyle w:val="VerbatimChar"/>
+        </w:rPr>
+        <w:t xml:space="preserve">S3_PUBLIC_URL</w:t>
+      </w:r>
+      <w:r>
+        <w:t xml:space="preserve"> </w:t>
+      </w:r>
+      <w:r>
+        <w:t xml:space="preserve">или разрешить</w:t>
+      </w:r>
+      <w:r>
+        <w:t xml:space="preserve"> </w:t>
+      </w:r>
+      <w:r>
+        <w:t xml:space="preserve">внешние ссылки как фичу.</w:t>
+      </w:r>
+      <w:r>
+        <w:t xml:space="preserve"> </w:t>
+      </w:r>
+      <w:r>
+        <w:t xml:space="preserve">-</w:t>
+      </w:r>
+      <w:r>
+        <w:t xml:space="preserve"> </w:t>
+      </w:r>
+      <w:r>
+        <w:rPr>
+          <w:rStyle w:val="VerbatimChar"/>
+        </w:rPr>
+        <w:t xml:space="preserve">accessToken</w:t>
+      </w:r>
+      <w:r>
+        <w:t xml:space="preserve">/</w:t>
+      </w:r>
+      <w:r>
+        <w:rPr>
+          <w:rStyle w:val="VerbatimChar"/>
+        </w:rPr>
+        <w:t xml:space="preserve">refreshToken</w:t>
+      </w:r>
+      <w:r>
+        <w:t xml:space="preserve"> </w:t>
+      </w:r>
+      <w:r>
+        <w:t xml:space="preserve">в</w:t>
+      </w:r>
+      <w:r>
+        <w:t xml:space="preserve"> </w:t>
+      </w:r>
+      <w:r>
+        <w:rPr>
+          <w:rStyle w:val="VerbatimChar"/>
+        </w:rPr>
+        <w:t xml:space="preserve">localStorage</w:t>
+      </w:r>
+      <w:r>
+        <w:t xml:space="preserve"> </w:t>
+      </w:r>
+      <w:r>
+        <w:t xml:space="preserve">вместо</w:t>
+      </w:r>
+      <w:r>
+        <w:t xml:space="preserve"> </w:t>
+      </w:r>
+      <w:r>
+        <w:rPr>
+          <w:rStyle w:val="VerbatimChar"/>
+        </w:rPr>
+        <w:t xml:space="preserve">httpOnly</w:t>
+      </w:r>
+      <w:r>
+        <w:t xml:space="preserve">-cookie —</w:t>
+      </w:r>
+      <w:r>
+        <w:t xml:space="preserve"> </w:t>
+      </w:r>
+      <w:r>
+        <w:t xml:space="preserve">архитектурная правка, требует отдельного захода.</w:t>
+      </w:r>
+      <w:r>
+        <w:t xml:space="preserve"> </w:t>
+      </w:r>
+      <w:r>
+        <w:t xml:space="preserve">- Нет</w:t>
+      </w:r>
+      <w:r>
+        <w:t xml:space="preserve"> </w:t>
+      </w:r>
+      <w:r>
+        <w:rPr>
+          <w:rStyle w:val="VerbatimChar"/>
+        </w:rPr>
+        <w:t xml:space="preserve">helmet</w:t>
+      </w:r>
+      <w:r>
+        <w:t xml:space="preserve">/security headers в backend, нет rate limit на</w:t>
+      </w:r>
+      <w:r>
+        <w:t xml:space="preserve"> </w:t>
+      </w:r>
+      <w:r>
+        <w:rPr>
+          <w:rStyle w:val="VerbatimChar"/>
+        </w:rPr>
+        <w:t xml:space="preserve">/api/auth/refresh</w:t>
+      </w:r>
+      <w:r>
+        <w:t xml:space="preserve">, MinIO service-account с</w:t>
+      </w:r>
+      <w:r>
+        <w:t xml:space="preserve"> </w:t>
+      </w:r>
+      <w:r>
+        <w:rPr>
+          <w:rStyle w:val="VerbatimChar"/>
+        </w:rPr>
+        <w:t xml:space="preserve">readwrite</w:t>
+      </w:r>
+      <w:r>
+        <w:t xml:space="preserve"> </w:t>
+      </w:r>
+      <w:r>
+        <w:t xml:space="preserve">на весь</w:t>
+      </w:r>
+      <w:r>
+        <w:t xml:space="preserve"> </w:t>
+      </w:r>
+      <w:r>
+        <w:t xml:space="preserve">инстанс вместо одного бакета — низкий приоритет, до релиза не блокирует.</w:t>
       </w:r>
     </w:p>
     <w:p>
@@ -1134,13 +2064,28 @@
         <w:pStyle w:val="Compact"/>
       </w:pPr>
       <w:r>
-        <w:t xml:space="preserve">Проверить и протестировать восстановление из бэкапов БД (не просто</w:t>
-      </w:r>
-      <w:r>
-        <w:t xml:space="preserve"> </w:t>
-      </w:r>
-      <w:r>
-        <w:t xml:space="preserve">включить автобэкап, а реально прогнать restore на staging).</w:t>
+        <w:t xml:space="preserve">Написать smoke/e2e-тесты на критичные пути (регистрация, бронирование,</w:t>
+      </w:r>
+      <w:r>
+        <w:t xml:space="preserve"> </w:t>
+      </w:r>
+      <w:r>
+        <w:t xml:space="preserve">оплата, чат) — сейчас в проекте нет тестов, кроме дефолтного</w:t>
+      </w:r>
+      <w:r>
+        <w:t xml:space="preserve"> </w:t>
+      </w:r>
+      <w:r>
+        <w:t xml:space="preserve">Nest-boilerplate (</w:t>
+      </w:r>
+      <w:r>
+        <w:rPr>
+          <w:rStyle w:val="VerbatimChar"/>
+        </w:rPr>
+        <w:t xml:space="preserve">app.controller.spec.ts</w:t>
+      </w:r>
+      <w:r>
+        <w:t xml:space="preserve">).</w:t>
       </w:r>
     </w:p>
     <w:p>
@@ -1152,7 +2097,13 @@
         <w:pStyle w:val="Compact"/>
       </w:pPr>
       <w:r>
-        <w:t xml:space="preserve">Бэкап object storage (фото услуг, аватары, фото в отзывах).</w:t>
+        <w:t xml:space="preserve">Нагрузочное тестирование на целевые 1000+ одновременных пользователей</w:t>
+      </w:r>
+      <w:r>
+        <w:t xml:space="preserve"> </w:t>
+      </w:r>
+      <w:r>
+        <w:t xml:space="preserve">(зафиксировано в tz-amendments п.11).</w:t>
       </w:r>
     </w:p>
     <w:p>
@@ -1164,13 +2115,28 @@
         <w:pStyle w:val="Compact"/>
       </w:pPr>
       <w:r>
-        <w:t xml:space="preserve">Health-check эндпоинты + аптайм-мониторинг + сбор ошибок (Sentry или</w:t>
-      </w:r>
-      <w:r>
-        <w:t xml:space="preserve"> </w:t>
-      </w:r>
-      <w:r>
-        <w:t xml:space="preserve">аналог) — сейчас никакого мониторинга ошибок в проде нет.</w:t>
+        <w:t xml:space="preserve">Security review: OWASP top 10, аудит прав доступа (</w:t>
+      </w:r>
+      <w:r>
+        <w:rPr>
+          <w:rStyle w:val="VerbatimChar"/>
+        </w:rPr>
+        <w:t xml:space="preserve">JwtAuthGuard</w:t>
+      </w:r>
+      <w:r>
+        <w:t xml:space="preserve">,</w:t>
+      </w:r>
+      <w:r>
+        <w:t xml:space="preserve"> </w:t>
+      </w:r>
+      <w:r>
+        <w:t xml:space="preserve">admin-гварды), проверка что секреты не попали в git, что Basic Auth</w:t>
+      </w:r>
+      <w:r>
+        <w:t xml:space="preserve"> </w:t>
+      </w:r>
+      <w:r>
+        <w:t xml:space="preserve">гейт действительно снят.</w:t>
       </w:r>
     </w:p>
     <w:p>
@@ -1182,59 +2148,17 @@
         <w:pStyle w:val="Compact"/>
       </w:pPr>
       <w:r>
-        <w:t xml:space="preserve">Логирование: структурированные логи backend с ротацией.</w:t>
-      </w:r>
-    </w:p>
-    <w:bookmarkEnd w:id="24"/>
-    <w:bookmarkStart w:id="25" w:name="фаза-3-email"/>
+        <w:t xml:space="preserve">Ручной регресс по ключевым пользовательским сценариям (чек-лист ниже).</w:t>
+      </w:r>
+    </w:p>
+    <w:bookmarkEnd w:id="27"/>
+    <w:bookmarkStart w:id="28" w:name="фаза-6-контент-и-запуск"/>
     <w:p>
       <w:pPr>
         <w:pStyle w:val="Heading3"/>
       </w:pPr>
       <w:r>
-        <w:t xml:space="preserve">Фаза 3 — Email</w:t>
-      </w:r>
-    </w:p>
-    <w:p>
-      <w:pPr>
-        <w:pStyle w:val="FirstParagraph"/>
-      </w:pPr>
-      <w:r>
-        <w:rPr>
-          <w:bCs/>
-          <w:b/>
-        </w:rPr>
-        <w:t xml:space="preserve">Осознанно отложено</w:t>
-      </w:r>
-      <w:r>
-        <w:t xml:space="preserve"> </w:t>
-      </w:r>
-      <w:r>
-        <w:t xml:space="preserve">(2026-08-24): пытались взяться раньше срока — уткнулись</w:t>
-      </w:r>
-      <w:r>
-        <w:t xml:space="preserve"> </w:t>
-      </w:r>
-      <w:r>
-        <w:t xml:space="preserve">в то, что подключать реального провайдера без своего домена (блокер №6)</w:t>
-      </w:r>
-      <w:r>
-        <w:t xml:space="preserve"> </w:t>
-      </w:r>
-      <w:r>
-        <w:t xml:space="preserve">бессмысленно: письма без SPF/DKIM/DMARC на чужом/тестовом домене</w:t>
-      </w:r>
-      <w:r>
-        <w:t xml:space="preserve"> </w:t>
-      </w:r>
-      <w:r>
-        <w:t xml:space="preserve">всё равно будут падать в спам или вовсе отклоняться. Возвращаемся к этому</w:t>
-      </w:r>
-      <w:r>
-        <w:t xml:space="preserve"> </w:t>
-      </w:r>
-      <w:r>
-        <w:t xml:space="preserve">пункту сразу после Фазы 1 (домен появится там).</w:t>
+        <w:t xml:space="preserve">Фаза 6 — Контент и запуск</w:t>
       </w:r>
     </w:p>
     <w:p>
@@ -1246,64 +2170,13 @@
         <w:pStyle w:val="Compact"/>
       </w:pPr>
       <w:r>
-        <w:t xml:space="preserve">Подключить реального провайдера (SendGrid / Mailgun / Yandex Cloud</w:t>
-      </w:r>
-      <w:r>
-        <w:t xml:space="preserve"> </w:t>
-      </w:r>
-      <w:r>
-        <w:t xml:space="preserve">почтовый сервис) вместо</w:t>
-      </w:r>
-      <w:r>
-        <w:t xml:space="preserve"> </w:t>
-      </w:r>
-      <w:r>
-        <w:rPr>
-          <w:rStyle w:val="VerbatimChar"/>
-        </w:rPr>
-        <w:t xml:space="preserve">mail.service.ts</w:t>
-      </w:r>
-      <w:r>
-        <w:t xml:space="preserve">-заглушки — интерфейс методов</w:t>
-      </w:r>
-      <w:r>
-        <w:t xml:space="preserve"> </w:t>
-      </w:r>
-      <w:r>
-        <w:t xml:space="preserve">менять не нужно, только реализацию (например, через</w:t>
-      </w:r>
-      <w:r>
-        <w:t xml:space="preserve"> </w:t>
-      </w:r>
-      <w:r>
-        <w:rPr>
-          <w:rStyle w:val="VerbatimChar"/>
-        </w:rPr>
-        <w:t xml:space="preserve">nodemailer</w:t>
-      </w:r>
-      <w:r>
-        <w:t xml:space="preserve"> </w:t>
-      </w:r>
-      <w:r>
-        <w:t xml:space="preserve">+ SMTP,</w:t>
-      </w:r>
-      <w:r>
-        <w:t xml:space="preserve"> </w:t>
-      </w:r>
-      <w:r>
-        <w:t xml:space="preserve">настраиваемое через env —</w:t>
-      </w:r>
-      <w:r>
-        <w:t xml:space="preserve"> </w:t>
-      </w:r>
-      <w:r>
-        <w:rPr>
-          <w:rStyle w:val="VerbatimChar"/>
-        </w:rPr>
-        <w:t xml:space="preserve">SMTP_HOST/PORT/USER/PASSWORD/MAIL_FROM</w:t>
-      </w:r>
-      <w:r>
-        <w:t xml:space="preserve">).</w:t>
+        <w:t xml:space="preserve">Очистить тестовые данные (услуги вида «Скриншот-тест…», тестовые</w:t>
+      </w:r>
+      <w:r>
+        <w:t xml:space="preserve"> </w:t>
+      </w:r>
+      <w:r>
+        <w:t xml:space="preserve">аккаунты) перед показом реальным пользователям.</w:t>
       </w:r>
     </w:p>
     <w:p>
@@ -1315,13 +2188,13 @@
         <w:pStyle w:val="Compact"/>
       </w:pPr>
       <w:r>
-        <w:t xml:space="preserve">Настроить SPF/DKIM/DMARC для домена отправителя, иначе письма будут</w:t>
-      </w:r>
-      <w:r>
-        <w:t xml:space="preserve"> </w:t>
-      </w:r>
-      <w:r>
-        <w:t xml:space="preserve">попадать в спам.</w:t>
+        <w:t xml:space="preserve">Убедиться, что модерация объявлений отработана на реальном потоке</w:t>
+      </w:r>
+      <w:r>
+        <w:t xml:space="preserve"> </w:t>
+      </w:r>
+      <w:r>
+        <w:t xml:space="preserve">(сам механизм уже реализован).</w:t>
       </w:r>
     </w:p>
     <w:p>
@@ -1333,595 +2206,35 @@
         <w:pStyle w:val="Compact"/>
       </w:pPr>
       <w:r>
-        <w:t xml:space="preserve">До появления домена можно проверить саму реализацию (не прод-доставку)</w:t>
-      </w:r>
-      <w:r>
-        <w:t xml:space="preserve"> </w:t>
-      </w:r>
-      <w:r>
-        <w:t xml:space="preserve">на бесплатном тестовом SMTP вроде Ethereal Email — письма никуда не</w:t>
-      </w:r>
-      <w:r>
-        <w:t xml:space="preserve"> </w:t>
-      </w:r>
-      <w:r>
-        <w:t xml:space="preserve">уходят, но код и flow проверяются end-to-end.</w:t>
-      </w:r>
-    </w:p>
-    <w:bookmarkEnd w:id="25"/>
-    <w:bookmarkStart w:id="26" w:name="фаза-4-реальные-платежи"/>
+        <w:t xml:space="preserve">Мягкий запуск: ограниченный круг пользователей/один город перед</w:t>
+      </w:r>
+      <w:r>
+        <w:t xml:space="preserve"> </w:t>
+      </w:r>
+      <w:r>
+        <w:t xml:space="preserve">широким анонсом.</w:t>
+      </w:r>
+    </w:p>
+    <w:p>
+      <w:pPr>
+        <w:numPr>
+          <w:ilvl w:val="0"/>
+          <w:numId w:val="1004"/>
+        </w:numPr>
+        <w:pStyle w:val="Compact"/>
+      </w:pPr>
+      <w:r>
+        <w:t xml:space="preserve">План отката: как быстро откатить деплой/миграцию при критичном баге.</w:t>
+      </w:r>
+    </w:p>
+    <w:bookmarkEnd w:id="28"/>
+    <w:bookmarkStart w:id="29" w:name="фаза-7-после-запуска"/>
     <w:p>
       <w:pPr>
         <w:pStyle w:val="Heading3"/>
       </w:pPr>
       <w:r>
-        <w:t xml:space="preserve">Фаза 4 — Реальные платежи</w:t>
-      </w:r>
-    </w:p>
-    <w:p>
-      <w:pPr>
-        <w:pStyle w:val="FirstParagraph"/>
-      </w:pPr>
-      <w:r>
-        <w:t xml:space="preserve">Возможна только после Фазы 0.</w:t>
-      </w:r>
-      <w:r>
-        <w:t xml:space="preserve"> </w:t>
-      </w:r>
-      <w:r>
-        <w:t xml:space="preserve">- Реализовать реальный класс</w:t>
-      </w:r>
-      <w:r>
-        <w:t xml:space="preserve"> </w:t>
-      </w:r>
-      <w:r>
-        <w:rPr>
-          <w:rStyle w:val="VerbatimChar"/>
-        </w:rPr>
-        <w:t xml:space="preserve">PaymentProvider</w:t>
-      </w:r>
-      <w:r>
-        <w:t xml:space="preserve"> </w:t>
-      </w:r>
-      <w:r>
-        <w:t xml:space="preserve">вместо</w:t>
-      </w:r>
-      <w:r>
-        <w:t xml:space="preserve"> </w:t>
-      </w:r>
-      <w:r>
-        <w:rPr>
-          <w:rStyle w:val="VerbatimChar"/>
-        </w:rPr>
-        <w:t xml:space="preserve">MockYookassaProvider</w:t>
-      </w:r>
-      <w:r>
-        <w:t xml:space="preserve"> </w:t>
-      </w:r>
-      <w:r>
-        <w:t xml:space="preserve">— архитектурно уже готово (весь остальной код</w:t>
-      </w:r>
-      <w:r>
-        <w:t xml:space="preserve"> </w:t>
-      </w:r>
-      <w:r>
-        <w:t xml:space="preserve">работает через интерфейс, подстановка класса под токеном</w:t>
-      </w:r>
-      <w:r>
-        <w:t xml:space="preserve"> </w:t>
-      </w:r>
-      <w:r>
-        <w:rPr>
-          <w:rStyle w:val="VerbatimChar"/>
-        </w:rPr>
-        <w:t xml:space="preserve">PAYMENT_PROVIDER</w:t>
-      </w:r>
-      <w:r>
-        <w:t xml:space="preserve"> </w:t>
-      </w:r>
-      <w:r>
-        <w:t xml:space="preserve">не требует правок в бронированиях/эскроу-логике).</w:t>
-      </w:r>
-      <w:r>
-        <w:t xml:space="preserve"> </w:t>
-      </w:r>
-      <w:r>
-        <w:t xml:space="preserve">- Реализовать флоу верификации продавца перед первой выплатой (поле</w:t>
-      </w:r>
-      <w:r>
-        <w:t xml:space="preserve"> </w:t>
-      </w:r>
-      <w:r>
-        <w:rPr>
-          <w:rStyle w:val="VerbatimChar"/>
-        </w:rPr>
-        <w:t xml:space="preserve">isSellerVerified</w:t>
-      </w:r>
-      <w:r>
-        <w:t xml:space="preserve"> </w:t>
-      </w:r>
-      <w:r>
-        <w:t xml:space="preserve">в модели уже есть, самого KYC-процесса — нет).</w:t>
-      </w:r>
-      <w:r>
-        <w:t xml:space="preserve"> </w:t>
-      </w:r>
-      <w:r>
-        <w:t xml:space="preserve">- Прогнать сквозной тест реальных платежей в sandbox-режиме провайдера</w:t>
-      </w:r>
-      <w:r>
-        <w:t xml:space="preserve"> </w:t>
-      </w:r>
-      <w:r>
-        <w:t xml:space="preserve">перед боевым переключением.</w:t>
-      </w:r>
-    </w:p>
-    <w:bookmarkEnd w:id="26"/>
-    <w:bookmarkStart w:id="27" w:name="фаза-5-тестирование-и-безопасность"/>
-    <w:p>
-      <w:pPr>
-        <w:pStyle w:val="Heading3"/>
-      </w:pPr>
-      <w:r>
-        <w:t xml:space="preserve">Фаза 5 — Тестирование и безопасность</w:t>
-      </w:r>
-    </w:p>
-    <w:p>
-      <w:pPr>
-        <w:pStyle w:val="FirstParagraph"/>
-      </w:pPr>
-      <w:r>
-        <w:rPr>
-          <w:bCs/>
-          <w:b/>
-        </w:rPr>
-        <w:t xml:space="preserve">Готово (2026-08-27):</w:t>
-      </w:r>
-      <w:r>
-        <w:t xml:space="preserve"> </w:t>
-      </w:r>
-      <w:r>
-        <w:t xml:space="preserve">полный аудит безопасности перед релизом (auth/authz,</w:t>
-      </w:r>
-      <w:r>
-        <w:t xml:space="preserve"> </w:t>
-      </w:r>
-      <w:r>
-        <w:t xml:space="preserve">инъекции, загрузка файлов, секреты, CORS, rate limiting, эскроу-логика,</w:t>
-      </w:r>
-      <w:r>
-        <w:t xml:space="preserve"> </w:t>
-      </w:r>
-      <w:r>
-        <w:t xml:space="preserve">админка, зависимости). Найденное и исправленное:</w:t>
-      </w:r>
-      <w:r>
-        <w:t xml:space="preserve"> </w:t>
-      </w:r>
-      <w:r>
-        <w:t xml:space="preserve">- Basic Auth гейт обходился подделкой</w:t>
-      </w:r>
-      <w:r>
-        <w:t xml:space="preserve"> </w:t>
-      </w:r>
-      <w:r>
-        <w:rPr>
-          <w:rStyle w:val="VerbatimChar"/>
-        </w:rPr>
-        <w:t xml:space="preserve">Authorization: Bearer x</w:t>
-      </w:r>
-      <w:r>
-        <w:t xml:space="preserve"> </w:t>
-      </w:r>
-      <w:r>
-        <w:t xml:space="preserve">— гейт</w:t>
-      </w:r>
-      <w:r>
-        <w:t xml:space="preserve"> </w:t>
-      </w:r>
-      <w:r>
-        <w:t xml:space="preserve">снят полностью (см. блокер №4 выше).</w:t>
-      </w:r>
-      <w:r>
-        <w:t xml:space="preserve"> </w:t>
-      </w:r>
-      <w:r>
-        <w:t xml:space="preserve">- Токены сброса пароля/подтверждения email писались в лог в открытом виде</w:t>
-      </w:r>
-      <w:r>
-        <w:t xml:space="preserve"> </w:t>
-      </w:r>
-      <w:r>
-        <w:t xml:space="preserve">в проде — теперь логируются только вне</w:t>
-      </w:r>
-      <w:r>
-        <w:t xml:space="preserve"> </w:t>
-      </w:r>
-      <w:r>
-        <w:rPr>
-          <w:rStyle w:val="VerbatimChar"/>
-        </w:rPr>
-        <w:t xml:space="preserve">NODE_ENV=production</w:t>
-      </w:r>
-      <w:r>
-        <w:t xml:space="preserve"> </w:t>
-      </w:r>
-      <w:r>
-        <w:t xml:space="preserve">(</w:t>
-      </w:r>
-      <w:r>
-        <w:rPr>
-          <w:rStyle w:val="VerbatimChar"/>
-        </w:rPr>
-        <w:t xml:space="preserve">backend/src/mail/mail.service.ts</w:t>
-      </w:r>
-      <w:r>
-        <w:t xml:space="preserve">); сама отправка писем по-прежнему</w:t>
-      </w:r>
-      <w:r>
-        <w:t xml:space="preserve"> </w:t>
-      </w:r>
-      <w:r>
-        <w:t xml:space="preserve">не реализована (см. Фазу 3).</w:t>
-      </w:r>
-      <w:r>
-        <w:t xml:space="preserve"> </w:t>
-      </w:r>
-      <w:r>
-        <w:t xml:space="preserve">- WebSocket</w:t>
-      </w:r>
-      <w:r>
-        <w:t xml:space="preserve"> </w:t>
-      </w:r>
-      <w:r>
-        <w:rPr>
-          <w:rStyle w:val="VerbatimChar"/>
-        </w:rPr>
-        <w:t xml:space="preserve">chat:join</w:t>
-      </w:r>
-      <w:r>
-        <w:t xml:space="preserve"> </w:t>
-      </w:r>
-      <w:r>
-        <w:t xml:space="preserve">пускал в комнату любого чата без проверки, что</w:t>
-      </w:r>
-      <w:r>
-        <w:t xml:space="preserve"> </w:t>
-      </w:r>
-      <w:r>
-        <w:t xml:space="preserve">пользователь — участник (можно было слушать чужую переписку по</w:t>
-      </w:r>
-      <w:r>
-        <w:t xml:space="preserve"> </w:t>
-      </w:r>
-      <w:r>
-        <w:t xml:space="preserve">известному chatId) — добавлена проверка через</w:t>
-      </w:r>
-      <w:r>
-        <w:t xml:space="preserve"> </w:t>
-      </w:r>
-      <w:r>
-        <w:rPr>
-          <w:rStyle w:val="VerbatimChar"/>
-        </w:rPr>
-        <w:t xml:space="preserve">getChatForParticipant</w:t>
-      </w:r>
-      <w:r>
-        <w:t xml:space="preserve"> </w:t>
-      </w:r>
-      <w:r>
-        <w:t xml:space="preserve">(</w:t>
-      </w:r>
-      <w:r>
-        <w:rPr>
-          <w:rStyle w:val="VerbatimChar"/>
-        </w:rPr>
-        <w:t xml:space="preserve">backend/src/chats/chats.gateway.ts</w:t>
-      </w:r>
-      <w:r>
-        <w:t xml:space="preserve">).</w:t>
-      </w:r>
-      <w:r>
-        <w:t xml:space="preserve"> </w:t>
-      </w:r>
-      <w:r>
-        <w:t xml:space="preserve">- Presigned upload в MinIO принимал</w:t>
-      </w:r>
-      <w:r>
-        <w:t xml:space="preserve"> </w:t>
-      </w:r>
-      <w:r>
-        <w:rPr>
-          <w:rStyle w:val="VerbatimChar"/>
-        </w:rPr>
-        <w:t xml:space="preserve">Content-Type</w:t>
-      </w:r>
-      <w:r>
-        <w:t xml:space="preserve"> </w:t>
-      </w:r>
-      <w:r>
-        <w:t xml:space="preserve">по префиксу</w:t>
-      </w:r>
-      <w:r>
-        <w:t xml:space="preserve"> </w:t>
-      </w:r>
-      <w:r>
-        <w:rPr>
-          <w:rStyle w:val="VerbatimChar"/>
-        </w:rPr>
-        <w:t xml:space="preserve">image/</w:t>
-      </w:r>
-      <w:r>
-        <w:t xml:space="preserve"> </w:t>
-      </w:r>
-      <w:r>
-        <w:t xml:space="preserve">(пропускал</w:t>
-      </w:r>
-      <w:r>
-        <w:t xml:space="preserve"> </w:t>
-      </w:r>
-      <w:r>
-        <w:rPr>
-          <w:rStyle w:val="VerbatimChar"/>
-        </w:rPr>
-        <w:t xml:space="preserve">image/svg+xml</w:t>
-      </w:r>
-      <w:r>
-        <w:t xml:space="preserve"> </w:t>
-      </w:r>
-      <w:r>
-        <w:t xml:space="preserve">— потенциальный stored XSS) — заменено на</w:t>
-      </w:r>
-      <w:r>
-        <w:t xml:space="preserve"> </w:t>
-      </w:r>
-      <w:r>
-        <w:t xml:space="preserve">точное совпадение (</w:t>
-      </w:r>
-      <w:r>
-        <w:rPr>
-          <w:rStyle w:val="VerbatimChar"/>
-        </w:rPr>
-        <w:t xml:space="preserve">backend/src/uploads/uploads.service.ts</w:t>
-      </w:r>
-      <w:r>
-        <w:t xml:space="preserve">).</w:t>
-      </w:r>
-      <w:r>
-        <w:t xml:space="preserve"> </w:t>
-      </w:r>
-      <w:r>
-        <w:t xml:space="preserve">-</w:t>
-      </w:r>
-      <w:r>
-        <w:t xml:space="preserve"> </w:t>
-      </w:r>
-      <w:r>
-        <w:rPr>
-          <w:rStyle w:val="VerbatimChar"/>
-        </w:rPr>
-        <w:t xml:space="preserve">fixedAmount</w:t>
-      </w:r>
-      <w:r>
-        <w:t xml:space="preserve"> </w:t>
-      </w:r>
-      <w:r>
-        <w:t xml:space="preserve">при подтверждении брони с договорной ценой не проверялся</w:t>
-      </w:r>
-      <w:r>
-        <w:t xml:space="preserve"> </w:t>
-      </w:r>
-      <w:r>
-        <w:t xml:space="preserve">на положительность — добавлена валидация</w:t>
-      </w:r>
-      <w:r>
-        <w:t xml:space="preserve"> </w:t>
-      </w:r>
-      <w:r>
-        <w:t xml:space="preserve">(</w:t>
-      </w:r>
-      <w:r>
-        <w:rPr>
-          <w:rStyle w:val="VerbatimChar"/>
-        </w:rPr>
-        <w:t xml:space="preserve">backend/src/bookings/dto/confirm-booking.dto.ts</w:t>
-      </w:r>
-      <w:r>
-        <w:t xml:space="preserve">).</w:t>
-      </w:r>
-      <w:r>
-        <w:t xml:space="preserve"> </w:t>
-      </w:r>
-      <w:r>
-        <w:t xml:space="preserve">-</w:t>
-      </w:r>
-      <w:r>
-        <w:t xml:space="preserve"> </w:t>
-      </w:r>
-      <w:r>
-        <w:rPr>
-          <w:rStyle w:val="VerbatimChar"/>
-        </w:rPr>
-        <w:t xml:space="preserve">npm audit</w:t>
-      </w:r>
-      <w:r>
-        <w:t xml:space="preserve"> </w:t>
-      </w:r>
-      <w:r>
-        <w:t xml:space="preserve">(backend и frontend) — 0 уязвимостей после</w:t>
-      </w:r>
-      <w:r>
-        <w:t xml:space="preserve"> </w:t>
-      </w:r>
-      <w:r>
-        <w:rPr>
-          <w:rStyle w:val="VerbatimChar"/>
-        </w:rPr>
-        <w:t xml:space="preserve">npm audit fix</w:t>
-      </w:r>
-      <w:r>
-        <w:t xml:space="preserve">.</w:t>
-      </w:r>
-    </w:p>
-    <w:p>
-      <w:pPr>
-        <w:pStyle w:val="BodyText"/>
-      </w:pPr>
-      <w:r>
-        <w:t xml:space="preserve">Не исправлено, осознанно отложено:</w:t>
-      </w:r>
-      <w:r>
-        <w:t xml:space="preserve"> </w:t>
-      </w:r>
-      <w:r>
-        <w:t xml:space="preserve">- Внешние URL для аватара/фото услуг/фото отзывов не ограничены доменом</w:t>
-      </w:r>
-      <w:r>
-        <w:t xml:space="preserve"> </w:t>
-      </w:r>
-      <w:r>
-        <w:t xml:space="preserve">собственного хранилища (можно подменить контент после модерации) —</w:t>
-      </w:r>
-      <w:r>
-        <w:t xml:space="preserve"> </w:t>
-      </w:r>
-      <w:r>
-        <w:t xml:space="preserve">требует решения, ограничивать ли строго</w:t>
-      </w:r>
-      <w:r>
-        <w:t xml:space="preserve"> </w:t>
-      </w:r>
-      <w:r>
-        <w:rPr>
-          <w:rStyle w:val="VerbatimChar"/>
-        </w:rPr>
-        <w:t xml:space="preserve">S3_PUBLIC_URL</w:t>
-      </w:r>
-      <w:r>
-        <w:t xml:space="preserve"> </w:t>
-      </w:r>
-      <w:r>
-        <w:t xml:space="preserve">или разрешить</w:t>
-      </w:r>
-      <w:r>
-        <w:t xml:space="preserve"> </w:t>
-      </w:r>
-      <w:r>
-        <w:t xml:space="preserve">внешние ссылки как фичу.</w:t>
-      </w:r>
-      <w:r>
-        <w:t xml:space="preserve"> </w:t>
-      </w:r>
-      <w:r>
-        <w:t xml:space="preserve">-</w:t>
-      </w:r>
-      <w:r>
-        <w:t xml:space="preserve"> </w:t>
-      </w:r>
-      <w:r>
-        <w:rPr>
-          <w:rStyle w:val="VerbatimChar"/>
-        </w:rPr>
-        <w:t xml:space="preserve">accessToken</w:t>
-      </w:r>
-      <w:r>
-        <w:t xml:space="preserve">/</w:t>
-      </w:r>
-      <w:r>
-        <w:rPr>
-          <w:rStyle w:val="VerbatimChar"/>
-        </w:rPr>
-        <w:t xml:space="preserve">refreshToken</w:t>
-      </w:r>
-      <w:r>
-        <w:t xml:space="preserve"> </w:t>
-      </w:r>
-      <w:r>
-        <w:t xml:space="preserve">в</w:t>
-      </w:r>
-      <w:r>
-        <w:t xml:space="preserve"> </w:t>
-      </w:r>
-      <w:r>
-        <w:rPr>
-          <w:rStyle w:val="VerbatimChar"/>
-        </w:rPr>
-        <w:t xml:space="preserve">localStorage</w:t>
-      </w:r>
-      <w:r>
-        <w:t xml:space="preserve"> </w:t>
-      </w:r>
-      <w:r>
-        <w:t xml:space="preserve">вместо</w:t>
-      </w:r>
-      <w:r>
-        <w:t xml:space="preserve"> </w:t>
-      </w:r>
-      <w:r>
-        <w:rPr>
-          <w:rStyle w:val="VerbatimChar"/>
-        </w:rPr>
-        <w:t xml:space="preserve">httpOnly</w:t>
-      </w:r>
-      <w:r>
-        <w:t xml:space="preserve">-cookie —</w:t>
-      </w:r>
-      <w:r>
-        <w:t xml:space="preserve"> </w:t>
-      </w:r>
-      <w:r>
-        <w:t xml:space="preserve">архитектурная правка, требует отдельного захода.</w:t>
-      </w:r>
-      <w:r>
-        <w:t xml:space="preserve"> </w:t>
-      </w:r>
-      <w:r>
-        <w:t xml:space="preserve">- Нет</w:t>
-      </w:r>
-      <w:r>
-        <w:t xml:space="preserve"> </w:t>
-      </w:r>
-      <w:r>
-        <w:rPr>
-          <w:rStyle w:val="VerbatimChar"/>
-        </w:rPr>
-        <w:t xml:space="preserve">helmet</w:t>
-      </w:r>
-      <w:r>
-        <w:t xml:space="preserve">/security headers в backend, нет rate limit на</w:t>
-      </w:r>
-      <w:r>
-        <w:t xml:space="preserve"> </w:t>
-      </w:r>
-      <w:r>
-        <w:rPr>
-          <w:rStyle w:val="VerbatimChar"/>
-        </w:rPr>
-        <w:t xml:space="preserve">/api/auth/refresh</w:t>
-      </w:r>
-      <w:r>
-        <w:t xml:space="preserve">, MinIO service-account с</w:t>
-      </w:r>
-      <w:r>
-        <w:t xml:space="preserve"> </w:t>
-      </w:r>
-      <w:r>
-        <w:rPr>
-          <w:rStyle w:val="VerbatimChar"/>
-        </w:rPr>
-        <w:t xml:space="preserve">readwrite</w:t>
-      </w:r>
-      <w:r>
-        <w:t xml:space="preserve"> </w:t>
-      </w:r>
-      <w:r>
-        <w:t xml:space="preserve">на весь</w:t>
-      </w:r>
-      <w:r>
-        <w:t xml:space="preserve"> </w:t>
-      </w:r>
-      <w:r>
-        <w:t xml:space="preserve">инстанс вместо одного бакета — низкий приоритет, до релиза не блокирует.</w:t>
+        <w:t xml:space="preserve">Фаза 7 — После запуска</w:t>
       </w:r>
     </w:p>
     <w:p>
@@ -1933,28 +2246,13 @@
         <w:pStyle w:val="Compact"/>
       </w:pPr>
       <w:r>
-        <w:t xml:space="preserve">Написать smoke/e2e-тесты на критичные пути (регистрация, бронирование,</w:t>
-      </w:r>
-      <w:r>
-        <w:t xml:space="preserve"> </w:t>
-      </w:r>
-      <w:r>
-        <w:t xml:space="preserve">оплата, чат) — сейчас в проекте нет тестов, кроме дефолтного</w:t>
-      </w:r>
-      <w:r>
-        <w:t xml:space="preserve"> </w:t>
-      </w:r>
-      <w:r>
-        <w:t xml:space="preserve">Nest-boilerplate (</w:t>
-      </w:r>
-      <w:r>
-        <w:rPr>
-          <w:rStyle w:val="VerbatimChar"/>
-        </w:rPr>
-        <w:t xml:space="preserve">app.controller.spec.ts</w:t>
-      </w:r>
-      <w:r>
-        <w:t xml:space="preserve">).</w:t>
+        <w:t xml:space="preserve">Мониторинг первую неделю: ошибки, конверсия регистрация → бронирование</w:t>
+      </w:r>
+      <w:r>
+        <w:t xml:space="preserve"> </w:t>
+      </w:r>
+      <w:r>
+        <w:t xml:space="preserve">→ оплата.</w:t>
       </w:r>
     </w:p>
     <w:p>
@@ -1966,68 +2264,153 @@
         <w:pStyle w:val="Compact"/>
       </w:pPr>
       <w:r>
-        <w:t xml:space="preserve">Нагрузочное тестирование на целевые 1000+ одновременных пользователей</w:t>
-      </w:r>
-      <w:r>
-        <w:t xml:space="preserve"> </w:t>
-      </w:r>
-      <w:r>
-        <w:t xml:space="preserve">(зафиксировано в tz-amendments п.11).</w:t>
-      </w:r>
-    </w:p>
-    <w:p>
-      <w:pPr>
-        <w:numPr>
-          <w:ilvl w:val="0"/>
-          <w:numId w:val="1005"/>
-        </w:numPr>
-        <w:pStyle w:val="Compact"/>
-      </w:pPr>
-      <w:r>
-        <w:t xml:space="preserve">Security review: OWASP top 10, аудит прав доступа (</w:t>
-      </w:r>
-      <w:r>
-        <w:rPr>
-          <w:rStyle w:val="VerbatimChar"/>
-        </w:rPr>
-        <w:t xml:space="preserve">JwtAuthGuard</w:t>
-      </w:r>
-      <w:r>
-        <w:t xml:space="preserve">,</w:t>
-      </w:r>
-      <w:r>
-        <w:t xml:space="preserve"> </w:t>
-      </w:r>
-      <w:r>
-        <w:t xml:space="preserve">admin-гварды), проверка что секреты не попали в git, что Basic Auth</w:t>
-      </w:r>
-      <w:r>
-        <w:t xml:space="preserve"> </w:t>
-      </w:r>
-      <w:r>
-        <w:t xml:space="preserve">гейт действительно снят.</w:t>
-      </w:r>
-    </w:p>
-    <w:p>
-      <w:pPr>
-        <w:numPr>
-          <w:ilvl w:val="0"/>
-          <w:numId w:val="1005"/>
-        </w:numPr>
-        <w:pStyle w:val="Compact"/>
-      </w:pPr>
-      <w:r>
-        <w:t xml:space="preserve">Ручной регресс по ключевым пользовательским сценариям (чек-лист ниже).</w:t>
-      </w:r>
-    </w:p>
-    <w:bookmarkEnd w:id="27"/>
-    <w:bookmarkStart w:id="28" w:name="фаза-6-контент-и-запуск"/>
-    <w:p>
-      <w:pPr>
-        <w:pStyle w:val="Heading3"/>
-      </w:pPr>
-      <w:r>
-        <w:t xml:space="preserve">Фаза 6 — Контент и запуск</w:t>
+        <w:t xml:space="preserve">Возврат к пост-MVP пунктам из tz-amendments («продуктовые дополнения»:</w:t>
+      </w:r>
+      <w:r>
+        <w:t xml:space="preserve"> </w:t>
+      </w:r>
+      <w:r>
+        <w:t xml:space="preserve">двусторонние отзывы и т.п.) и к остальным пожеланиям из бэклога.</w:t>
+      </w:r>
+    </w:p>
+    <w:p>
+      <w:pPr>
+        <w:pStyle w:val="FirstParagraph"/>
+      </w:pPr>
+      <w:r>
+        <w:rPr>
+          <w:bCs/>
+          <w:b/>
+        </w:rPr>
+        <w:t xml:space="preserve">Готово:</w:t>
+      </w:r>
+      <w:r>
+        <w:t xml:space="preserve"> </w:t>
+      </w:r>
+      <w:r>
+        <w:t xml:space="preserve">канал поддержки пользователей — реализован поверх</w:t>
+      </w:r>
+      <w:r>
+        <w:t xml:space="preserve"> </w:t>
+      </w:r>
+      <w:r>
+        <w:t xml:space="preserve">существующего чата. Один аккаунт помечается флагом</w:t>
+      </w:r>
+      <w:r>
+        <w:t xml:space="preserve"> </w:t>
+      </w:r>
+      <w:r>
+        <w:rPr>
+          <w:rStyle w:val="VerbatimChar"/>
+        </w:rPr>
+        <w:t xml:space="preserve">User.isSupport</w:t>
+      </w:r>
+      <w:r>
+        <w:t xml:space="preserve"> </w:t>
+      </w:r>
+      <w:r>
+        <w:t xml:space="preserve">(сейчас — напрямую в БД, тем же способом, что и</w:t>
+      </w:r>
+      <w:r>
+        <w:t xml:space="preserve"> </w:t>
+      </w:r>
+      <w:r>
+        <w:rPr>
+          <w:rStyle w:val="VerbatimChar"/>
+        </w:rPr>
+        <w:t xml:space="preserve">isAdmin</w:t>
+      </w:r>
+      <w:r>
+        <w:t xml:space="preserve">; отдельной</w:t>
+      </w:r>
+      <w:r>
+        <w:t xml:space="preserve"> </w:t>
+      </w:r>
+      <w:r>
+        <w:t xml:space="preserve">админ-панели управления пользователями в проекте нет). Публичный</w:t>
+      </w:r>
+      <w:r>
+        <w:t xml:space="preserve"> </w:t>
+      </w:r>
+      <w:r>
+        <w:t xml:space="preserve">эндпоинт</w:t>
+      </w:r>
+      <w:r>
+        <w:t xml:space="preserve"> </w:t>
+      </w:r>
+      <w:r>
+        <w:rPr>
+          <w:rStyle w:val="VerbatimChar"/>
+        </w:rPr>
+        <w:t xml:space="preserve">GET /api/support/contact</w:t>
+      </w:r>
+      <w:r>
+        <w:t xml:space="preserve"> </w:t>
+      </w:r>
+      <w:r>
+        <w:t xml:space="preserve">отдаёт его id, плавающий</w:t>
+      </w:r>
+      <w:r>
+        <w:t xml:space="preserve"> </w:t>
+      </w:r>
+      <w:r>
+        <w:t xml:space="preserve">чат-виджет показывает закреплённую строку «Поддержка» сверху списка</w:t>
+      </w:r>
+      <w:r>
+        <w:t xml:space="preserve"> </w:t>
+      </w:r>
+      <w:r>
+        <w:t xml:space="preserve">диалогов — переиспользует уже готовую инфраструктуру чата (WS,</w:t>
+      </w:r>
+      <w:r>
+        <w:t xml:space="preserve"> </w:t>
+      </w:r>
+      <w:r>
+        <w:t xml:space="preserve">REST-фолбэк, бейдж непрочитанных), отдельной системы тикетов не</w:t>
+      </w:r>
+      <w:r>
+        <w:t xml:space="preserve"> </w:t>
+      </w:r>
+      <w:r>
+        <w:t xml:space="preserve">потребовалось. На новом сервере поддержку сейчас ведёт аккаунт</w:t>
+      </w:r>
+      <w:r>
+        <w:t xml:space="preserve"> </w:t>
+      </w:r>
+      <w:r>
+        <w:rPr>
+          <w:rStyle w:val="VerbatimChar"/>
+        </w:rPr>
+        <w:t xml:space="preserve">support@hobbyhub.ru</w:t>
+      </w:r>
+      <w:r>
+        <w:t xml:space="preserve"> </w:t>
+      </w:r>
+      <w:r>
+        <w:t xml:space="preserve">— перед реальным запуском решить, кто и по какому</w:t>
+      </w:r>
+      <w:r>
+        <w:t xml:space="preserve"> </w:t>
+      </w:r>
+      <w:r>
+        <w:t xml:space="preserve">графику на него отвечает (или завести несколько таких аккаунтов, если</w:t>
+      </w:r>
+      <w:r>
+        <w:t xml:space="preserve"> </w:t>
+      </w:r>
+      <w:r>
+        <w:t xml:space="preserve">нагрузка потребует).</w:t>
+      </w:r>
+    </w:p>
+    <w:bookmarkEnd w:id="29"/>
+    <w:bookmarkEnd w:id="30"/>
+    <w:bookmarkStart w:id="31" w:name="Xbed8038e2bfc6adc28336f0e4406830b9b72dd2"/>
+    <w:p>
+      <w:pPr>
+        <w:pStyle w:val="Heading2"/>
+      </w:pPr>
+      <w:r>
+        <w:t xml:space="preserve">3. Чек-лист регресс-тестирования перед запуском (минимум)</w:t>
       </w:r>
     </w:p>
     <w:p>
@@ -2039,13 +2422,13 @@
         <w:pStyle w:val="Compact"/>
       </w:pPr>
       <w:r>
-        <w:t xml:space="preserve">Очистить тестовые данные (услуги вида «Скриншот-тест…», тестовые</w:t>
-      </w:r>
-      <w:r>
-        <w:t xml:space="preserve"> </w:t>
-      </w:r>
-      <w:r>
-        <w:t xml:space="preserve">аккаунты) перед показом реальным пользователям.</w:t>
+        <w:t xml:space="preserve">Регистрация покупателя и продавца, подтверждение email, вход, сброс</w:t>
+      </w:r>
+      <w:r>
+        <w:t xml:space="preserve"> </w:t>
+      </w:r>
+      <w:r>
+        <w:t xml:space="preserve">пароля.</w:t>
       </w:r>
     </w:p>
     <w:p>
@@ -2057,13 +2440,7 @@
         <w:pStyle w:val="Compact"/>
       </w:pPr>
       <w:r>
-        <w:t xml:space="preserve">Убедиться, что модерация объявлений отработана на реальном потоке</w:t>
-      </w:r>
-      <w:r>
-        <w:t xml:space="preserve"> </w:t>
-      </w:r>
-      <w:r>
-        <w:t xml:space="preserve">(сам механизм уже реализован).</w:t>
+        <w:t xml:space="preserve">Создание услуги продавцом → прохождение модерации → публикация.</w:t>
       </w:r>
     </w:p>
     <w:p>
@@ -2075,13 +2452,7 @@
         <w:pStyle w:val="Compact"/>
       </w:pPr>
       <w:r>
-        <w:t xml:space="preserve">Мягкий запуск: ограниченный круг пользователей/один город перед</w:t>
-      </w:r>
-      <w:r>
-        <w:t xml:space="preserve"> </w:t>
-      </w:r>
-      <w:r>
-        <w:t xml:space="preserve">широким анонсом.</w:t>
+        <w:t xml:space="preserve">Поиск/фильтрация в каталоге, просмотр на карте.</w:t>
       </w:r>
     </w:p>
     <w:p>
@@ -2093,320 +2464,86 @@
         <w:pStyle w:val="Compact"/>
       </w:pPr>
       <w:r>
-        <w:t xml:space="preserve">План отката: как быстро откатить деплой/миграцию при критичном баге.</w:t>
-      </w:r>
-    </w:p>
-    <w:bookmarkEnd w:id="28"/>
-    <w:bookmarkStart w:id="29" w:name="фаза-7-после-запуска"/>
-    <w:p>
-      <w:pPr>
-        <w:pStyle w:val="Heading3"/>
-      </w:pPr>
-      <w:r>
-        <w:t xml:space="preserve">Фаза 7 — После запуска</w:t>
+        <w:t xml:space="preserve">Бронирование по слотам (включая групповую вместимость) и по запросу.</w:t>
       </w:r>
     </w:p>
     <w:p>
       <w:pPr>
         <w:numPr>
           <w:ilvl w:val="0"/>
-          <w:numId w:val="1007"/>
+          <w:numId w:val="1006"/>
         </w:numPr>
         <w:pStyle w:val="Compact"/>
       </w:pPr>
       <w:r>
-        <w:t xml:space="preserve">Мониторинг первую неделю: ошибки, конверсия регистрация → бронирование</w:t>
-      </w:r>
-      <w:r>
-        <w:t xml:space="preserve"> </w:t>
-      </w:r>
-      <w:r>
-        <w:t xml:space="preserve">→ оплата.</w:t>
+        <w:t xml:space="preserve">Полный цикл оплаты: холдирование → подтверждение продавцом →</w:t>
+      </w:r>
+      <w:r>
+        <w:t xml:space="preserve"> </w:t>
+      </w:r>
+      <w:r>
+        <w:t xml:space="preserve">освобождение эскроу → чек покупателю.</w:t>
       </w:r>
     </w:p>
     <w:p>
       <w:pPr>
         <w:numPr>
           <w:ilvl w:val="0"/>
-          <w:numId w:val="1007"/>
+          <w:numId w:val="1006"/>
         </w:numPr>
         <w:pStyle w:val="Compact"/>
       </w:pPr>
       <w:r>
-        <w:t xml:space="preserve">Возврат к пост-MVP пунктам из tz-amendments («продуктовые дополнения»:</w:t>
-      </w:r>
-      <w:r>
-        <w:t xml:space="preserve"> </w:t>
-      </w:r>
-      <w:r>
-        <w:t xml:space="preserve">двусторонние отзывы и т.п.) и к остальным пожеланиям из бэклога.</w:t>
-      </w:r>
-    </w:p>
-    <w:p>
-      <w:pPr>
-        <w:pStyle w:val="FirstParagraph"/>
-      </w:pPr>
-      <w:r>
-        <w:rPr>
-          <w:bCs/>
-          <w:b/>
-        </w:rPr>
-        <w:t xml:space="preserve">Готово:</w:t>
-      </w:r>
-      <w:r>
-        <w:t xml:space="preserve"> </w:t>
-      </w:r>
-      <w:r>
-        <w:t xml:space="preserve">канал поддержки пользователей — реализован поверх</w:t>
-      </w:r>
-      <w:r>
-        <w:t xml:space="preserve"> </w:t>
-      </w:r>
-      <w:r>
-        <w:t xml:space="preserve">существующего чата. Один аккаунт помечается флагом</w:t>
-      </w:r>
-      <w:r>
-        <w:t xml:space="preserve"> </w:t>
-      </w:r>
-      <w:r>
-        <w:rPr>
-          <w:rStyle w:val="VerbatimChar"/>
-        </w:rPr>
-        <w:t xml:space="preserve">User.isSupport</w:t>
-      </w:r>
-      <w:r>
-        <w:t xml:space="preserve"> </w:t>
-      </w:r>
-      <w:r>
-        <w:t xml:space="preserve">(сейчас — напрямую в БД, тем же способом, что и</w:t>
-      </w:r>
-      <w:r>
-        <w:t xml:space="preserve"> </w:t>
-      </w:r>
-      <w:r>
-        <w:rPr>
-          <w:rStyle w:val="VerbatimChar"/>
-        </w:rPr>
-        <w:t xml:space="preserve">isAdmin</w:t>
-      </w:r>
-      <w:r>
-        <w:t xml:space="preserve">; отдельной</w:t>
-      </w:r>
-      <w:r>
-        <w:t xml:space="preserve"> </w:t>
-      </w:r>
-      <w:r>
-        <w:t xml:space="preserve">админ-панели управления пользователями в проекте нет). Публичный</w:t>
-      </w:r>
-      <w:r>
-        <w:t xml:space="preserve"> </w:t>
-      </w:r>
-      <w:r>
-        <w:t xml:space="preserve">эндпоинт</w:t>
-      </w:r>
-      <w:r>
-        <w:t xml:space="preserve"> </w:t>
-      </w:r>
-      <w:r>
-        <w:rPr>
-          <w:rStyle w:val="VerbatimChar"/>
-        </w:rPr>
-        <w:t xml:space="preserve">GET /api/support/contact</w:t>
-      </w:r>
-      <w:r>
-        <w:t xml:space="preserve"> </w:t>
-      </w:r>
-      <w:r>
-        <w:t xml:space="preserve">отдаёт его id, плавающий</w:t>
-      </w:r>
-      <w:r>
-        <w:t xml:space="preserve"> </w:t>
-      </w:r>
-      <w:r>
-        <w:t xml:space="preserve">чат-виджет показывает закреплённую строку «Поддержка» сверху списка</w:t>
-      </w:r>
-      <w:r>
-        <w:t xml:space="preserve"> </w:t>
-      </w:r>
-      <w:r>
-        <w:t xml:space="preserve">диалогов — переиспользует уже готовую инфраструктуру чата (WS,</w:t>
-      </w:r>
-      <w:r>
-        <w:t xml:space="preserve"> </w:t>
-      </w:r>
-      <w:r>
-        <w:t xml:space="preserve">REST-фолбэк, бейдж непрочитанных), отдельной системы тикетов не</w:t>
-      </w:r>
-      <w:r>
-        <w:t xml:space="preserve"> </w:t>
-      </w:r>
-      <w:r>
-        <w:t xml:space="preserve">потребовалось. Перед реальным запуском — заменить тестовый аккаунт</w:t>
-      </w:r>
-      <w:r>
-        <w:t xml:space="preserve"> </w:t>
-      </w:r>
-      <w:r>
-        <w:rPr>
-          <w:rStyle w:val="VerbatimChar"/>
-        </w:rPr>
-        <w:t xml:space="preserve">support@funmarket.test</w:t>
-      </w:r>
-      <w:r>
-        <w:t xml:space="preserve"> </w:t>
-      </w:r>
-      <w:r>
-        <w:t xml:space="preserve">на реальный (или несколько, если нагрузка</w:t>
-      </w:r>
-      <w:r>
-        <w:t xml:space="preserve"> </w:t>
-      </w:r>
-      <w:r>
-        <w:t xml:space="preserve">потребует), настроить рабочий график ответов.</w:t>
-      </w:r>
-    </w:p>
-    <w:bookmarkEnd w:id="29"/>
-    <w:bookmarkEnd w:id="30"/>
-    <w:bookmarkStart w:id="31" w:name="Xbed8038e2bfc6adc28336f0e4406830b9b72dd2"/>
-    <w:p>
-      <w:pPr>
-        <w:pStyle w:val="Heading2"/>
-      </w:pPr>
-      <w:r>
-        <w:t xml:space="preserve">3. Чек-лист регресс-тестирования перед запуском (минимум)</w:t>
+        <w:t xml:space="preserve">Отмена брони, спор, разрешение спора администратором.</w:t>
       </w:r>
     </w:p>
     <w:p>
       <w:pPr>
         <w:numPr>
           <w:ilvl w:val="0"/>
-          <w:numId w:val="1008"/>
+          <w:numId w:val="1006"/>
         </w:numPr>
         <w:pStyle w:val="Compact"/>
       </w:pPr>
       <w:r>
-        <w:t xml:space="preserve">Регистрация покупателя и продавца, подтверждение email, вход, сброс</w:t>
-      </w:r>
-      <w:r>
-        <w:t xml:space="preserve"> </w:t>
-      </w:r>
-      <w:r>
-        <w:t xml:space="preserve">пароля.</w:t>
+        <w:t xml:space="preserve">Чат: сообщения, жалоба на сообщение, плавающий виджет и полная</w:t>
+      </w:r>
+      <w:r>
+        <w:t xml:space="preserve"> </w:t>
+      </w:r>
+      <w:r>
+        <w:t xml:space="preserve">страница.</w:t>
       </w:r>
     </w:p>
     <w:p>
       <w:pPr>
         <w:numPr>
           <w:ilvl w:val="0"/>
-          <w:numId w:val="1008"/>
+          <w:numId w:val="1006"/>
         </w:numPr>
         <w:pStyle w:val="Compact"/>
       </w:pPr>
       <w:r>
-        <w:t xml:space="preserve">Создание услуги продавцом → прохождение модерации → публикация.</w:t>
+        <w:t xml:space="preserve">Отзыв после завершения заказа, ответ продавца на отзыв.</w:t>
       </w:r>
     </w:p>
     <w:p>
       <w:pPr>
         <w:numPr>
           <w:ilvl w:val="0"/>
-          <w:numId w:val="1008"/>
+          <w:numId w:val="1006"/>
         </w:numPr>
         <w:pStyle w:val="Compact"/>
       </w:pPr>
       <w:r>
-        <w:t xml:space="preserve">Поиск/фильтрация в каталоге, просмотр на карте.</w:t>
+        <w:t xml:space="preserve">Избранное: добавление, счётчик у продавца.</w:t>
       </w:r>
     </w:p>
     <w:p>
       <w:pPr>
         <w:numPr>
           <w:ilvl w:val="0"/>
-          <w:numId w:val="1008"/>
-        </w:numPr>
-        <w:pStyle w:val="Compact"/>
-      </w:pPr>
-      <w:r>
-        <w:t xml:space="preserve">Бронирование по слотам (включая групповую вместимость) и по запросу.</w:t>
-      </w:r>
-    </w:p>
-    <w:p>
-      <w:pPr>
-        <w:numPr>
-          <w:ilvl w:val="0"/>
-          <w:numId w:val="1008"/>
-        </w:numPr>
-        <w:pStyle w:val="Compact"/>
-      </w:pPr>
-      <w:r>
-        <w:t xml:space="preserve">Полный цикл оплаты: холдирование → подтверждение продавцом →</w:t>
-      </w:r>
-      <w:r>
-        <w:t xml:space="preserve"> </w:t>
-      </w:r>
-      <w:r>
-        <w:t xml:space="preserve">освобождение эскроу → чек покупателю.</w:t>
-      </w:r>
-    </w:p>
-    <w:p>
-      <w:pPr>
-        <w:numPr>
-          <w:ilvl w:val="0"/>
-          <w:numId w:val="1008"/>
-        </w:numPr>
-        <w:pStyle w:val="Compact"/>
-      </w:pPr>
-      <w:r>
-        <w:t xml:space="preserve">Отмена брони, спор, разрешение спора администратором.</w:t>
-      </w:r>
-    </w:p>
-    <w:p>
-      <w:pPr>
-        <w:numPr>
-          <w:ilvl w:val="0"/>
-          <w:numId w:val="1008"/>
-        </w:numPr>
-        <w:pStyle w:val="Compact"/>
-      </w:pPr>
-      <w:r>
-        <w:t xml:space="preserve">Чат: сообщения, жалоба на сообщение, плавающий виджет и полная</w:t>
-      </w:r>
-      <w:r>
-        <w:t xml:space="preserve"> </w:t>
-      </w:r>
-      <w:r>
-        <w:t xml:space="preserve">страница.</w:t>
-      </w:r>
-    </w:p>
-    <w:p>
-      <w:pPr>
-        <w:numPr>
-          <w:ilvl w:val="0"/>
-          <w:numId w:val="1008"/>
-        </w:numPr>
-        <w:pStyle w:val="Compact"/>
-      </w:pPr>
-      <w:r>
-        <w:t xml:space="preserve">Отзыв после завершения заказа, ответ продавца на отзыв.</w:t>
-      </w:r>
-    </w:p>
-    <w:p>
-      <w:pPr>
-        <w:numPr>
-          <w:ilvl w:val="0"/>
-          <w:numId w:val="1008"/>
-        </w:numPr>
-        <w:pStyle w:val="Compact"/>
-      </w:pPr>
-      <w:r>
-        <w:t xml:space="preserve">Избранное: добавление, счётчик у продавца.</w:t>
-      </w:r>
-    </w:p>
-    <w:p>
-      <w:pPr>
-        <w:numPr>
-          <w:ilvl w:val="0"/>
-          <w:numId w:val="1008"/>
+          <w:numId w:val="1006"/>
         </w:numPr>
         <w:pStyle w:val="Compact"/>
       </w:pPr>
@@ -2659,12 +2796,6 @@
     <w:abstractNumId w:val="991"/>
   </w:num>
   <w:num w:numId="1006">
-    <w:abstractNumId w:val="991"/>
-  </w:num>
-  <w:num w:numId="1007">
-    <w:abstractNumId w:val="991"/>
-  </w:num>
-  <w:num w:numId="1008">
     <w:abstractNumId w:val="991"/>
   </w:num>
 </w:numbering>

</xml_diff>

<commit_message>
Add draft legal documents (user agreement, privacy policy, agency offer, seller terms)
AI-drafted starting points based on decisions in docs/tz-amendments.md
— explicitly marked as requiring lawyer review before publication.
Each file lists {{PLACEHOLDER}} fields to fill in (legal entity,
payment provider, commission %, deadlines) and flags where a decision
needs code changes too (cancellation penalty schedule), not just text.
</commit_message>
<xml_diff>
--- a/docs/release-plan.docx
+++ b/docs/release-plan.docx
@@ -841,171 +841,65 @@
       <w:r>
         <w:t xml:space="preserve">Блокирует Фазу 4 (платежи) и публичный анонс.</w:t>
       </w:r>
-      <w:r>
-        <w:t xml:space="preserve"> </w:t>
-      </w:r>
-      <w:r>
-        <w:t xml:space="preserve">- Подтвердить у бизнеса пункты 1, 2, 4, 15 из</w:t>
-      </w:r>
-      <w:r>
-        <w:t xml:space="preserve"> </w:t>
-      </w:r>
-      <w:r>
-        <w:rPr>
-          <w:rStyle w:val="VerbatimChar"/>
-        </w:rPr>
-        <w:t xml:space="preserve">docs/tz-amendments.md</w:t>
-      </w:r>
-      <w:r>
-        <w:t xml:space="preserve"> </w:t>
-      </w:r>
-      <w:r>
-        <w:t xml:space="preserve">(агентская схема эскроу, чеки для самозанятых, обязательность</w:t>
-      </w:r>
-      <w:r>
-        <w:t xml:space="preserve"> </w:t>
-      </w:r>
-      <w:r>
-        <w:t xml:space="preserve">верификации продавца перед выплатами, модель «один продавец = одно</w:t>
-      </w:r>
-      <w:r>
-        <w:t xml:space="preserve"> </w:t>
-      </w:r>
-      <w:r>
-        <w:t xml:space="preserve">физлицо + бренд-имя»).</w:t>
-      </w:r>
-      <w:r>
-        <w:t xml:space="preserve"> </w:t>
-      </w:r>
-      <w:r>
-        <w:t xml:space="preserve">- Выбрать реального платёжного провайдера (ЮKassa «Безопасная сделка»</w:t>
-      </w:r>
-      <w:r>
-        <w:t xml:space="preserve"> </w:t>
-      </w:r>
-      <w:r>
-        <w:t xml:space="preserve">или аналог с поддержкой самозанятых), заключить договор.</w:t>
-      </w:r>
-      <w:r>
-        <w:t xml:space="preserve"> </w:t>
-      </w:r>
-      <w:r>
-        <w:t xml:space="preserve">- Подготовить и опубликовать: пользовательское соглашение, политику</w:t>
-      </w:r>
-      <w:r>
-        <w:t xml:space="preserve"> </w:t>
-      </w:r>
-      <w:r>
-        <w:t xml:space="preserve">обработки персональных данных (152-ФЗ, локализация ПДн на серверах</w:t>
-      </w:r>
-      <w:r>
-        <w:t xml:space="preserve"> </w:t>
-      </w:r>
-      <w:r>
-        <w:t xml:space="preserve">РФ — уже зафиксировано как требование в tz-amendments п.3), публичную</w:t>
-      </w:r>
-      <w:r>
-        <w:t xml:space="preserve"> </w:t>
-      </w:r>
-      <w:r>
-        <w:t xml:space="preserve">оферту агентской схемы, условия для продавцов.</w:t>
-      </w:r>
-      <w:r>
-        <w:t xml:space="preserve"> </w:t>
-      </w:r>
-      <w:r>
-        <w:t xml:space="preserve">- Определить юрлицо/ИП площадки, налоговый режим, реквизиты.</w:t>
-      </w:r>
-    </w:p>
-    <w:bookmarkEnd w:id="22"/>
-    <w:bookmarkStart w:id="23" w:name="фаза-1-инфраструктура-и-деплой"/>
-    <w:p>
-      <w:pPr>
-        <w:pStyle w:val="Heading3"/>
-      </w:pPr>
-      <w:r>
-        <w:t xml:space="preserve">Фаза 1 — Инфраструктура и деплой</w:t>
-      </w:r>
-    </w:p>
-    <w:p>
-      <w:pPr>
-        <w:pStyle w:val="FirstParagraph"/>
+    </w:p>
+    <w:p>
+      <w:pPr>
+        <w:pStyle w:val="BodyText"/>
       </w:pPr>
       <w:r>
         <w:rPr>
           <w:bCs/>
           <w:b/>
         </w:rPr>
-        <w:t xml:space="preserve">Готово (2026-08-27):</w:t>
-      </w:r>
-      <w:r>
-        <w:t xml:space="preserve"> </w:t>
-      </w:r>
-      <w:r>
-        <w:t xml:space="preserve">переезд на выделенный сервер (Timeweb) —</w:t>
-      </w:r>
-      <w:r>
-        <w:t xml:space="preserve"> </w:t>
-      </w:r>
-      <w:r>
-        <w:rPr>
-          <w:rStyle w:val="VerbatimChar"/>
-        </w:rPr>
-        <w:t xml:space="preserve">scripts/server-bootstrap.sh</w:t>
-      </w:r>
-      <w:r>
-        <w:t xml:space="preserve"> </w:t>
-      </w:r>
-      <w:r>
-        <w:t xml:space="preserve">(Node/PostgreSQL+PostGIS/MinIO/Caddy/ufw/</w:t>
-      </w:r>
-      <w:r>
-        <w:t xml:space="preserve"> </w:t>
-      </w:r>
-      <w:r>
-        <w:t xml:space="preserve">непривилегированный пользователь</w:t>
-      </w:r>
-      <w:r>
-        <w:t xml:space="preserve"> </w:t>
-      </w:r>
-      <w:r>
-        <w:rPr>
-          <w:rStyle w:val="VerbatimChar"/>
-        </w:rPr>
-        <w:t xml:space="preserve">hobbyhub</w:t>
-      </w:r>
-      <w:r>
-        <w:t xml:space="preserve">, идемпотентно) +</w:t>
-      </w:r>
-      <w:r>
-        <w:t xml:space="preserve"> </w:t>
-      </w:r>
-      <w:r>
-        <w:rPr>
-          <w:rStyle w:val="VerbatimChar"/>
-        </w:rPr>
-        <w:t xml:space="preserve">scripts/deploy.sh</w:t>
-      </w:r>
-      <w:r>
-        <w:t xml:space="preserve"> </w:t>
-      </w:r>
-      <w:r>
-        <w:t xml:space="preserve">(git clone/pull, сборка, миграции, systemd-юниты,</w:t>
-      </w:r>
-      <w:r>
-        <w:t xml:space="preserve"> </w:t>
-      </w:r>
-      <w:r>
-        <w:t xml:space="preserve">Caddyfile под домен).</w:t>
-      </w:r>
-      <w:r>
-        <w:t xml:space="preserve"> </w:t>
-      </w:r>
-      <w:r>
-        <w:rPr>
-          <w:strike/>
-        </w:rPr>
-        <w:t xml:space="preserve">Домен + TLS</w:t>
+        <w:t xml:space="preserve">Черновики готовы (2026-08-28):</w:t>
+      </w:r>
+      <w:r>
+        <w:t xml:space="preserve"> </w:t>
+      </w:r>
+      <w:r>
+        <w:rPr>
+          <w:rStyle w:val="VerbatimChar"/>
+        </w:rPr>
+        <w:t xml:space="preserve">docs/legal/</w:t>
+      </w:r>
+      <w:r>
+        <w:t xml:space="preserve"> </w:t>
+      </w:r>
+      <w:r>
+        <w:t xml:space="preserve">— пользовательское</w:t>
+      </w:r>
+      <w:r>
+        <w:t xml:space="preserve"> </w:t>
+      </w:r>
+      <w:r>
+        <w:t xml:space="preserve">соглашение, политика ПДн (152-ФЗ), оферта агентской схемы, условия для</w:t>
+      </w:r>
+      <w:r>
+        <w:t xml:space="preserve"> </w:t>
+      </w:r>
+      <w:r>
+        <w:t xml:space="preserve">продавцов (+</w:t>
+      </w:r>
+      <w:r>
+        <w:t xml:space="preserve"> </w:t>
+      </w:r>
+      <w:r>
+        <w:rPr>
+          <w:rStyle w:val="VerbatimChar"/>
+        </w:rPr>
+        <w:t xml:space="preserve">.docx</w:t>
+      </w:r>
+      <w:r>
+        <w:t xml:space="preserve">-версии). Это AI-черновики на основе решений из</w:t>
+      </w:r>
+      <w:r>
+        <w:t xml:space="preserve"> </w:t>
+      </w:r>
+      <w:r>
+        <w:rPr>
+          <w:rStyle w:val="VerbatimChar"/>
+        </w:rPr>
+        <w:t xml:space="preserve">docs/tz-amendments.md</w:t>
       </w:r>
       <w:r>
         <w:t xml:space="preserve">,</w:t>
@@ -1015,177 +909,55 @@
       </w:r>
       <w:r>
         <w:rPr>
-          <w:strike/>
-        </w:rPr>
-        <w:t xml:space="preserve">backend/frontend под root</w:t>
-      </w:r>
-      <w:r>
-        <w:t xml:space="preserve"> </w:t>
-      </w:r>
-      <w:r>
-        <w:t xml:space="preserve">—</w:t>
-      </w:r>
-      <w:r>
-        <w:t xml:space="preserve"> </w:t>
-      </w:r>
-      <w:r>
-        <w:t xml:space="preserve">оба закрыты этим же переездом (backend/frontend теперь</w:t>
-      </w:r>
-      <w:r>
-        <w:t xml:space="preserve"> </w:t>
-      </w:r>
-      <w:r>
-        <w:rPr>
-          <w:rStyle w:val="VerbatimChar"/>
-        </w:rPr>
-        <w:t xml:space="preserve">User=hobbyhub</w:t>
-      </w:r>
-      <w:r>
-        <w:t xml:space="preserve">,</w:t>
-      </w:r>
-      <w:r>
-        <w:t xml:space="preserve"> </w:t>
-      </w:r>
-      <w:r>
-        <w:t xml:space="preserve">не root). Пошаговая шпаргалка по типовым операциям —</w:t>
-      </w:r>
-      <w:r>
-        <w:t xml:space="preserve"> </w:t>
-      </w:r>
-      <w:r>
-        <w:rPr>
-          <w:rStyle w:val="VerbatimChar"/>
-        </w:rPr>
-        <w:t xml:space="preserve">docs/server-cheatsheet.md</w:t>
-      </w:r>
-      <w:r>
-        <w:t xml:space="preserve">.</w:t>
-      </w:r>
-    </w:p>
-    <w:p>
-      <w:pPr>
-        <w:pStyle w:val="BodyText"/>
-      </w:pPr>
-      <w:r>
-        <w:t xml:space="preserve">Осталось:</w:t>
-      </w:r>
-      <w:r>
-        <w:t xml:space="preserve"> </w:t>
-      </w:r>
-      <w:r>
-        <w:t xml:space="preserve">- Хостинг: рассмотреть managed-сервисы (уже рекомендовано в</w:t>
-      </w:r>
-      <w:r>
-        <w:t xml:space="preserve"> </w:t>
-      </w:r>
-      <w:r>
-        <w:t xml:space="preserve">tz-amendments п.9) — Managed PostgreSQL с автобэкапами и PITR,</w:t>
-      </w:r>
-      <w:r>
-        <w:t xml:space="preserve"> </w:t>
-      </w:r>
-      <w:r>
-        <w:t xml:space="preserve">S3-совместимое хранилище вместо self-hosted MinIO. Не блокирует</w:t>
-      </w:r>
-      <w:r>
-        <w:t xml:space="preserve"> </w:t>
-      </w:r>
-      <w:r>
-        <w:t xml:space="preserve">запуск при разумном трафике, но снижает риск при росте нагрузки —</w:t>
-      </w:r>
-      <w:r>
-        <w:t xml:space="preserve"> </w:t>
-      </w:r>
-      <w:r>
-        <w:t xml:space="preserve">решить по факту, не обязательно до первого релиза.</w:t>
-      </w:r>
-      <w:r>
-        <w:t xml:space="preserve"> </w:t>
-      </w:r>
-      <w:r>
-        <w:t xml:space="preserve">- CI/CD (GitHub Actions, раз репозиторий уже на GitHub): lint + typecheck</w:t>
-      </w:r>
-      <w:r>
-        <w:t xml:space="preserve"> </w:t>
-      </w:r>
-      <w:r>
-        <w:t xml:space="preserve">+ build на каждый PR, ручной или автоматический деплой на push в main</w:t>
-      </w:r>
-      <w:r>
-        <w:t xml:space="preserve"> </w:t>
-      </w:r>
-      <w:r>
-        <w:t xml:space="preserve">(сейчас деплой — ручной запуск</w:t>
-      </w:r>
-      <w:r>
-        <w:t xml:space="preserve"> </w:t>
-      </w:r>
-      <w:r>
-        <w:rPr>
-          <w:rStyle w:val="VerbatimChar"/>
-        </w:rPr>
-        <w:t xml:space="preserve">deploy.sh</w:t>
-      </w:r>
-      <w:r>
-        <w:t xml:space="preserve"> </w:t>
-      </w:r>
-      <w:r>
-        <w:t xml:space="preserve">по SSH).</w:t>
-      </w:r>
-      <w:r>
-        <w:t xml:space="preserve"> </w:t>
-      </w:r>
-      <w:r>
-        <w:t xml:space="preserve">- Секреты: сейчас</w:t>
-      </w:r>
-      <w:r>
-        <w:t xml:space="preserve"> </w:t>
-      </w:r>
-      <w:r>
-        <w:rPr>
-          <w:rStyle w:val="VerbatimChar"/>
-        </w:rPr>
-        <w:t xml:space="preserve">.env</w:t>
-      </w:r>
-      <w:r>
-        <w:t xml:space="preserve"> </w:t>
-      </w:r>
-      <w:r>
-        <w:t xml:space="preserve">с правами 600, свежесгенерированы при</w:t>
-      </w:r>
-      <w:r>
-        <w:t xml:space="preserve"> </w:t>
-      </w:r>
-      <w:r>
-        <w:t xml:space="preserve">bootstrap — приемлемо для старта; секрет-менеджер хостинг-провайдера</w:t>
-      </w:r>
-      <w:r>
-        <w:t xml:space="preserve"> </w:t>
-      </w:r>
-      <w:r>
-        <w:t xml:space="preserve">можно добавить позже, не блокер.</w:t>
-      </w:r>
-      <w:r>
-        <w:t xml:space="preserve"> </w:t>
-      </w:r>
-      <w:r>
-        <w:t xml:space="preserve">- resource limits в systemd-юнитах (сейчас без ограничений по</w:t>
-      </w:r>
-      <w:r>
-        <w:t xml:space="preserve"> </w:t>
-      </w:r>
-      <w:r>
-        <w:t xml:space="preserve">памяти/CPU) — желательно перед реальной нагрузкой, не блокер MVP.</w:t>
-      </w:r>
-    </w:p>
-    <w:bookmarkEnd w:id="23"/>
-    <w:bookmarkStart w:id="24" w:name="фаза-2-надёжность-данных"/>
-    <w:p>
-      <w:pPr>
-        <w:pStyle w:val="Heading3"/>
-      </w:pPr>
-      <w:r>
-        <w:t xml:space="preserve">Фаза 2 — Надёжность данных</w:t>
+          <w:bCs/>
+          <w:b/>
+        </w:rPr>
+        <w:t xml:space="preserve">не готовы к публикации без юриста</w:t>
+      </w:r>
+      <w:r>
+        <w:t xml:space="preserve"> </w:t>
+      </w:r>
+      <w:r>
+        <w:t xml:space="preserve">— в каждом</w:t>
+      </w:r>
+      <w:r>
+        <w:t xml:space="preserve"> </w:t>
+      </w:r>
+      <w:r>
+        <w:t xml:space="preserve">файле внизу список</w:t>
+      </w:r>
+      <w:r>
+        <w:t xml:space="preserve"> </w:t>
+      </w:r>
+      <w:r>
+        <w:rPr>
+          <w:rStyle w:val="VerbatimChar"/>
+        </w:rPr>
+        <w:t xml:space="preserve">{{ПЕРЕМЕННЫХ}}</w:t>
+      </w:r>
+      <w:r>
+        <w:t xml:space="preserve"> </w:t>
+      </w:r>
+      <w:r>
+        <w:t xml:space="preserve">под конкретные реквизиты/провайдера</w:t>
+      </w:r>
+      <w:r>
+        <w:t xml:space="preserve"> </w:t>
+      </w:r>
+      <w:r>
+        <w:t xml:space="preserve">и отдельно отмечено, где решение чисто юридическое, а где ещё и требует</w:t>
+      </w:r>
+      <w:r>
+        <w:t xml:space="preserve"> </w:t>
+      </w:r>
+      <w:r>
+        <w:t xml:space="preserve">доработки кода (шкала штрафов за отмену брони, дедлайн подтверждения</w:t>
+      </w:r>
+      <w:r>
+        <w:t xml:space="preserve"> </w:t>
+      </w:r>
+      <w:r>
+        <w:t xml:space="preserve">заявки).</w:t>
       </w:r>
     </w:p>
     <w:p>
@@ -1197,13 +969,34 @@
         <w:pStyle w:val="Compact"/>
       </w:pPr>
       <w:r>
-        <w:t xml:space="preserve">Проверить и протестировать восстановление из бэкапов БД (не просто</w:t>
-      </w:r>
-      <w:r>
-        <w:t xml:space="preserve"> </w:t>
-      </w:r>
-      <w:r>
-        <w:t xml:space="preserve">включить автобэкап, а реально прогнать restore на staging).</w:t>
+        <w:t xml:space="preserve">Подтвердить у бизнеса пункты 1, 2, 4, 15 из</w:t>
+      </w:r>
+      <w:r>
+        <w:t xml:space="preserve"> </w:t>
+      </w:r>
+      <w:r>
+        <w:rPr>
+          <w:rStyle w:val="VerbatimChar"/>
+        </w:rPr>
+        <w:t xml:space="preserve">docs/tz-amendments.md</w:t>
+      </w:r>
+      <w:r>
+        <w:t xml:space="preserve"> </w:t>
+      </w:r>
+      <w:r>
+        <w:t xml:space="preserve">(агентская схема эскроу, чеки для самозанятых, обязательность</w:t>
+      </w:r>
+      <w:r>
+        <w:t xml:space="preserve"> </w:t>
+      </w:r>
+      <w:r>
+        <w:t xml:space="preserve">верификации продавца перед выплатами, модель «один продавец = одно</w:t>
+      </w:r>
+      <w:r>
+        <w:t xml:space="preserve"> </w:t>
+      </w:r>
+      <w:r>
+        <w:t xml:space="preserve">физлицо + бренд-имя»).</w:t>
       </w:r>
     </w:p>
     <w:p>
@@ -1215,7 +1008,40 @@
         <w:pStyle w:val="Compact"/>
       </w:pPr>
       <w:r>
-        <w:t xml:space="preserve">Бэкап object storage (фото услуг, аватары, фото в отзывах).</w:t>
+        <w:t xml:space="preserve">Выбрать реального платёжного провайдера (ЮKassa «Безопасная сделка»</w:t>
+      </w:r>
+      <w:r>
+        <w:t xml:space="preserve"> </w:t>
+      </w:r>
+      <w:r>
+        <w:t xml:space="preserve">или аналог с поддержкой самозанятых), заключить договор — от этого</w:t>
+      </w:r>
+      <w:r>
+        <w:t xml:space="preserve"> </w:t>
+      </w:r>
+      <w:r>
+        <w:t xml:space="preserve">зависит финальный текст</w:t>
+      </w:r>
+      <w:r>
+        <w:t xml:space="preserve"> </w:t>
+      </w:r>
+      <w:r>
+        <w:rPr>
+          <w:rStyle w:val="VerbatimChar"/>
+        </w:rPr>
+        <w:t xml:space="preserve">agency-offer.md</w:t>
+      </w:r>
+      <w:r>
+        <w:t xml:space="preserve"> </w:t>
+      </w:r>
+      <w:r>
+        <w:t xml:space="preserve">(у провайдера обычно есть</w:t>
+      </w:r>
+      <w:r>
+        <w:t xml:space="preserve"> </w:t>
+      </w:r>
+      <w:r>
+        <w:t xml:space="preserve">готовый шаблон под их продукт).</w:t>
       </w:r>
     </w:p>
     <w:p>
@@ -1227,13 +1053,40 @@
         <w:pStyle w:val="Compact"/>
       </w:pPr>
       <w:r>
-        <w:t xml:space="preserve">Health-check эндпоинты + аптайм-мониторинг + сбор ошибок (Sentry или</w:t>
-      </w:r>
-      <w:r>
-        <w:t xml:space="preserve"> </w:t>
-      </w:r>
-      <w:r>
-        <w:t xml:space="preserve">аналог) — сейчас никакого мониторинга ошибок в проде нет.</w:t>
+        <w:t xml:space="preserve">Отдать черновики из</w:t>
+      </w:r>
+      <w:r>
+        <w:t xml:space="preserve"> </w:t>
+      </w:r>
+      <w:r>
+        <w:rPr>
+          <w:rStyle w:val="VerbatimChar"/>
+        </w:rPr>
+        <w:t xml:space="preserve">docs/legal/</w:t>
+      </w:r>
+      <w:r>
+        <w:t xml:space="preserve"> </w:t>
+      </w:r>
+      <w:r>
+        <w:t xml:space="preserve">юристу на проверку, заполнить</w:t>
+      </w:r>
+      <w:r>
+        <w:t xml:space="preserve"> </w:t>
+      </w:r>
+      <w:r>
+        <w:t xml:space="preserve">реквизиты, опубликовать на сайте (сейчас на сайте нет страниц с этими</w:t>
+      </w:r>
+      <w:r>
+        <w:t xml:space="preserve"> </w:t>
+      </w:r>
+      <w:r>
+        <w:t xml:space="preserve">документами — понадобится доработка фронтенда, когда тексты будут</w:t>
+      </w:r>
+      <w:r>
+        <w:t xml:space="preserve"> </w:t>
+      </w:r>
+      <w:r>
+        <w:t xml:space="preserve">готовы).</w:t>
       </w:r>
     </w:p>
     <w:p>
@@ -1245,17 +1098,35 @@
         <w:pStyle w:val="Compact"/>
       </w:pPr>
       <w:r>
-        <w:t xml:space="preserve">Логирование: структурированные логи backend с ротацией.</w:t>
-      </w:r>
-    </w:p>
-    <w:bookmarkEnd w:id="24"/>
-    <w:bookmarkStart w:id="25" w:name="фаза-3-email"/>
+        <w:t xml:space="preserve">Определить юрлицо/ИП площадки, налоговый режим, реквизиты.</w:t>
+      </w:r>
+    </w:p>
+    <w:p>
+      <w:pPr>
+        <w:numPr>
+          <w:ilvl w:val="0"/>
+          <w:numId w:val="1001"/>
+        </w:numPr>
+        <w:pStyle w:val="Compact"/>
+      </w:pPr>
+      <w:r>
+        <w:t xml:space="preserve">Подать уведомление в Роскомнадзор об обработке ПДн (после регистрации</w:t>
+      </w:r>
+      <w:r>
+        <w:t xml:space="preserve"> </w:t>
+      </w:r>
+      <w:r>
+        <w:t xml:space="preserve">юрлица, до начала реальной обработки данных пользователей).</w:t>
+      </w:r>
+    </w:p>
+    <w:bookmarkEnd w:id="22"/>
+    <w:bookmarkStart w:id="23" w:name="фаза-1-инфраструктура-и-деплой"/>
     <w:p>
       <w:pPr>
         <w:pStyle w:val="Heading3"/>
       </w:pPr>
       <w:r>
-        <w:t xml:space="preserve">Фаза 3 — Email</w:t>
+        <w:t xml:space="preserve">Фаза 1 — Инфраструктура и деплой</w:t>
       </w:r>
     </w:p>
     <w:p>
@@ -1263,22 +1134,260 @@
         <w:pStyle w:val="FirstParagraph"/>
       </w:pPr>
       <w:r>
-        <w:t xml:space="preserve">Ранее откладывали до появления домена (SPF/DKIM/DMARC не настроить без</w:t>
-      </w:r>
-      <w:r>
-        <w:t xml:space="preserve"> </w:t>
-      </w:r>
-      <w:r>
-        <w:t xml:space="preserve">него) — теперь домен есть (</w:t>
-      </w:r>
-      <w:r>
-        <w:rPr>
-          <w:rStyle w:val="VerbatimChar"/>
-        </w:rPr>
-        <w:t xml:space="preserve">hobbyhub.ru</w:t>
-      </w:r>
-      <w:r>
-        <w:t xml:space="preserve">), блокер снят, можно начинать.</w:t>
+        <w:rPr>
+          <w:bCs/>
+          <w:b/>
+        </w:rPr>
+        <w:t xml:space="preserve">Готово (2026-08-27):</w:t>
+      </w:r>
+      <w:r>
+        <w:t xml:space="preserve"> </w:t>
+      </w:r>
+      <w:r>
+        <w:t xml:space="preserve">переезд на выделенный сервер (Timeweb) —</w:t>
+      </w:r>
+      <w:r>
+        <w:t xml:space="preserve"> </w:t>
+      </w:r>
+      <w:r>
+        <w:rPr>
+          <w:rStyle w:val="VerbatimChar"/>
+        </w:rPr>
+        <w:t xml:space="preserve">scripts/server-bootstrap.sh</w:t>
+      </w:r>
+      <w:r>
+        <w:t xml:space="preserve"> </w:t>
+      </w:r>
+      <w:r>
+        <w:t xml:space="preserve">(Node/PostgreSQL+PostGIS/MinIO/Caddy/ufw/</w:t>
+      </w:r>
+      <w:r>
+        <w:t xml:space="preserve"> </w:t>
+      </w:r>
+      <w:r>
+        <w:t xml:space="preserve">непривилегированный пользователь</w:t>
+      </w:r>
+      <w:r>
+        <w:t xml:space="preserve"> </w:t>
+      </w:r>
+      <w:r>
+        <w:rPr>
+          <w:rStyle w:val="VerbatimChar"/>
+        </w:rPr>
+        <w:t xml:space="preserve">hobbyhub</w:t>
+      </w:r>
+      <w:r>
+        <w:t xml:space="preserve">, идемпотентно) +</w:t>
+      </w:r>
+      <w:r>
+        <w:t xml:space="preserve"> </w:t>
+      </w:r>
+      <w:r>
+        <w:rPr>
+          <w:rStyle w:val="VerbatimChar"/>
+        </w:rPr>
+        <w:t xml:space="preserve">scripts/deploy.sh</w:t>
+      </w:r>
+      <w:r>
+        <w:t xml:space="preserve"> </w:t>
+      </w:r>
+      <w:r>
+        <w:t xml:space="preserve">(git clone/pull, сборка, миграции, systemd-юниты,</w:t>
+      </w:r>
+      <w:r>
+        <w:t xml:space="preserve"> </w:t>
+      </w:r>
+      <w:r>
+        <w:t xml:space="preserve">Caddyfile под домен).</w:t>
+      </w:r>
+      <w:r>
+        <w:t xml:space="preserve"> </w:t>
+      </w:r>
+      <w:r>
+        <w:rPr>
+          <w:strike/>
+        </w:rPr>
+        <w:t xml:space="preserve">Домен + TLS</w:t>
+      </w:r>
+      <w:r>
+        <w:t xml:space="preserve">,</w:t>
+      </w:r>
+      <w:r>
+        <w:t xml:space="preserve"> </w:t>
+      </w:r>
+      <w:r>
+        <w:rPr>
+          <w:strike/>
+        </w:rPr>
+        <w:t xml:space="preserve">backend/frontend под root</w:t>
+      </w:r>
+      <w:r>
+        <w:t xml:space="preserve"> </w:t>
+      </w:r>
+      <w:r>
+        <w:t xml:space="preserve">—</w:t>
+      </w:r>
+      <w:r>
+        <w:t xml:space="preserve"> </w:t>
+      </w:r>
+      <w:r>
+        <w:t xml:space="preserve">оба закрыты этим же переездом (backend/frontend теперь</w:t>
+      </w:r>
+      <w:r>
+        <w:t xml:space="preserve"> </w:t>
+      </w:r>
+      <w:r>
+        <w:rPr>
+          <w:rStyle w:val="VerbatimChar"/>
+        </w:rPr>
+        <w:t xml:space="preserve">User=hobbyhub</w:t>
+      </w:r>
+      <w:r>
+        <w:t xml:space="preserve">,</w:t>
+      </w:r>
+      <w:r>
+        <w:t xml:space="preserve"> </w:t>
+      </w:r>
+      <w:r>
+        <w:t xml:space="preserve">не root). Пошаговая шпаргалка по типовым операциям —</w:t>
+      </w:r>
+      <w:r>
+        <w:t xml:space="preserve"> </w:t>
+      </w:r>
+      <w:r>
+        <w:rPr>
+          <w:rStyle w:val="VerbatimChar"/>
+        </w:rPr>
+        <w:t xml:space="preserve">docs/server-cheatsheet.md</w:t>
+      </w:r>
+      <w:r>
+        <w:t xml:space="preserve">.</w:t>
+      </w:r>
+    </w:p>
+    <w:p>
+      <w:pPr>
+        <w:pStyle w:val="BodyText"/>
+      </w:pPr>
+      <w:r>
+        <w:t xml:space="preserve">Осталось:</w:t>
+      </w:r>
+      <w:r>
+        <w:t xml:space="preserve"> </w:t>
+      </w:r>
+      <w:r>
+        <w:t xml:space="preserve">- Хостинг: рассмотреть managed-сервисы (уже рекомендовано в</w:t>
+      </w:r>
+      <w:r>
+        <w:t xml:space="preserve"> </w:t>
+      </w:r>
+      <w:r>
+        <w:t xml:space="preserve">tz-amendments п.9) — Managed PostgreSQL с автобэкапами и PITR,</w:t>
+      </w:r>
+      <w:r>
+        <w:t xml:space="preserve"> </w:t>
+      </w:r>
+      <w:r>
+        <w:t xml:space="preserve">S3-совместимое хранилище вместо self-hosted MinIO. Не блокирует</w:t>
+      </w:r>
+      <w:r>
+        <w:t xml:space="preserve"> </w:t>
+      </w:r>
+      <w:r>
+        <w:t xml:space="preserve">запуск при разумном трафике, но снижает риск при росте нагрузки —</w:t>
+      </w:r>
+      <w:r>
+        <w:t xml:space="preserve"> </w:t>
+      </w:r>
+      <w:r>
+        <w:t xml:space="preserve">решить по факту, не обязательно до первого релиза.</w:t>
+      </w:r>
+      <w:r>
+        <w:t xml:space="preserve"> </w:t>
+      </w:r>
+      <w:r>
+        <w:t xml:space="preserve">- CI/CD (GitHub Actions, раз репозиторий уже на GitHub): lint + typecheck</w:t>
+      </w:r>
+      <w:r>
+        <w:t xml:space="preserve"> </w:t>
+      </w:r>
+      <w:r>
+        <w:t xml:space="preserve">+ build на каждый PR, ручной или автоматический деплой на push в main</w:t>
+      </w:r>
+      <w:r>
+        <w:t xml:space="preserve"> </w:t>
+      </w:r>
+      <w:r>
+        <w:t xml:space="preserve">(сейчас деплой — ручной запуск</w:t>
+      </w:r>
+      <w:r>
+        <w:t xml:space="preserve"> </w:t>
+      </w:r>
+      <w:r>
+        <w:rPr>
+          <w:rStyle w:val="VerbatimChar"/>
+        </w:rPr>
+        <w:t xml:space="preserve">deploy.sh</w:t>
+      </w:r>
+      <w:r>
+        <w:t xml:space="preserve"> </w:t>
+      </w:r>
+      <w:r>
+        <w:t xml:space="preserve">по SSH).</w:t>
+      </w:r>
+      <w:r>
+        <w:t xml:space="preserve"> </w:t>
+      </w:r>
+      <w:r>
+        <w:t xml:space="preserve">- Секреты: сейчас</w:t>
+      </w:r>
+      <w:r>
+        <w:t xml:space="preserve"> </w:t>
+      </w:r>
+      <w:r>
+        <w:rPr>
+          <w:rStyle w:val="VerbatimChar"/>
+        </w:rPr>
+        <w:t xml:space="preserve">.env</w:t>
+      </w:r>
+      <w:r>
+        <w:t xml:space="preserve"> </w:t>
+      </w:r>
+      <w:r>
+        <w:t xml:space="preserve">с правами 600, свежесгенерированы при</w:t>
+      </w:r>
+      <w:r>
+        <w:t xml:space="preserve"> </w:t>
+      </w:r>
+      <w:r>
+        <w:t xml:space="preserve">bootstrap — приемлемо для старта; секрет-менеджер хостинг-провайдера</w:t>
+      </w:r>
+      <w:r>
+        <w:t xml:space="preserve"> </w:t>
+      </w:r>
+      <w:r>
+        <w:t xml:space="preserve">можно добавить позже, не блокер.</w:t>
+      </w:r>
+      <w:r>
+        <w:t xml:space="preserve"> </w:t>
+      </w:r>
+      <w:r>
+        <w:t xml:space="preserve">- resource limits в systemd-юнитах (сейчас без ограничений по</w:t>
+      </w:r>
+      <w:r>
+        <w:t xml:space="preserve"> </w:t>
+      </w:r>
+      <w:r>
+        <w:t xml:space="preserve">памяти/CPU) — желательно перед реальной нагрузкой, не блокер MVP.</w:t>
+      </w:r>
+    </w:p>
+    <w:bookmarkEnd w:id="23"/>
+    <w:bookmarkStart w:id="24" w:name="фаза-2-надёжность-данных"/>
+    <w:p>
+      <w:pPr>
+        <w:pStyle w:val="Heading3"/>
+      </w:pPr>
+      <w:r>
+        <w:t xml:space="preserve">Фаза 2 — Надёжность данных</w:t>
       </w:r>
     </w:p>
     <w:p>
@@ -1290,64 +1399,13 @@
         <w:pStyle w:val="Compact"/>
       </w:pPr>
       <w:r>
-        <w:t xml:space="preserve">Подключить реального провайдера (SendGrid / Mailgun / Yandex Cloud</w:t>
-      </w:r>
-      <w:r>
-        <w:t xml:space="preserve"> </w:t>
-      </w:r>
-      <w:r>
-        <w:t xml:space="preserve">почтовый сервис) вместо</w:t>
-      </w:r>
-      <w:r>
-        <w:t xml:space="preserve"> </w:t>
-      </w:r>
-      <w:r>
-        <w:rPr>
-          <w:rStyle w:val="VerbatimChar"/>
-        </w:rPr>
-        <w:t xml:space="preserve">mail.service.ts</w:t>
-      </w:r>
-      <w:r>
-        <w:t xml:space="preserve">-заглушки — интерфейс методов</w:t>
-      </w:r>
-      <w:r>
-        <w:t xml:space="preserve"> </w:t>
-      </w:r>
-      <w:r>
-        <w:t xml:space="preserve">менять не нужно, только реализацию (например, через</w:t>
-      </w:r>
-      <w:r>
-        <w:t xml:space="preserve"> </w:t>
-      </w:r>
-      <w:r>
-        <w:rPr>
-          <w:rStyle w:val="VerbatimChar"/>
-        </w:rPr>
-        <w:t xml:space="preserve">nodemailer</w:t>
-      </w:r>
-      <w:r>
-        <w:t xml:space="preserve"> </w:t>
-      </w:r>
-      <w:r>
-        <w:t xml:space="preserve">+ SMTP,</w:t>
-      </w:r>
-      <w:r>
-        <w:t xml:space="preserve"> </w:t>
-      </w:r>
-      <w:r>
-        <w:t xml:space="preserve">настраиваемое через env —</w:t>
-      </w:r>
-      <w:r>
-        <w:t xml:space="preserve"> </w:t>
-      </w:r>
-      <w:r>
-        <w:rPr>
-          <w:rStyle w:val="VerbatimChar"/>
-        </w:rPr>
-        <w:t xml:space="preserve">SMTP_HOST/PORT/USER/PASSWORD/MAIL_FROM</w:t>
-      </w:r>
-      <w:r>
-        <w:t xml:space="preserve">).</w:t>
+        <w:t xml:space="preserve">Проверить и протестировать восстановление из бэкапов БД (не просто</w:t>
+      </w:r>
+      <w:r>
+        <w:t xml:space="preserve"> </w:t>
+      </w:r>
+      <w:r>
+        <w:t xml:space="preserve">включить автобэкап, а реально прогнать restore на staging).</w:t>
       </w:r>
     </w:p>
     <w:p>
@@ -1359,34 +1417,7 @@
         <w:pStyle w:val="Compact"/>
       </w:pPr>
       <w:r>
-        <w:t xml:space="preserve">Настроить SPF/DKIM/DMARC для</w:t>
-      </w:r>
-      <w:r>
-        <w:t xml:space="preserve"> </w:t>
-      </w:r>
-      <w:r>
-        <w:rPr>
-          <w:rStyle w:val="VerbatimChar"/>
-        </w:rPr>
-        <w:t xml:space="preserve">hobbyhub.ru</w:t>
-      </w:r>
-      <w:r>
-        <w:t xml:space="preserve"> </w:t>
-      </w:r>
-      <w:r>
-        <w:t xml:space="preserve">(DNS-записи у регистратора</w:t>
-      </w:r>
-      <w:r>
-        <w:t xml:space="preserve"> </w:t>
-      </w:r>
-      <w:r>
-        <w:t xml:space="preserve">или через NS-хостинг Timeweb, куда уже переключены NS-серверы домена),</w:t>
-      </w:r>
-      <w:r>
-        <w:t xml:space="preserve"> </w:t>
-      </w:r>
-      <w:r>
-        <w:t xml:space="preserve">иначе письма будут попадать в спам.</w:t>
+        <w:t xml:space="preserve">Бэкап object storage (фото услуг, аватары, фото в отзывах).</w:t>
       </w:r>
     </w:p>
     <w:p>
@@ -1398,29 +1429,35 @@
         <w:pStyle w:val="Compact"/>
       </w:pPr>
       <w:r>
-        <w:t xml:space="preserve">До подключения провайдера можно проверить саму реализацию на бесплатном</w:t>
-      </w:r>
-      <w:r>
-        <w:t xml:space="preserve"> </w:t>
-      </w:r>
-      <w:r>
-        <w:t xml:space="preserve">тестовом SMTP вроде Ethereal Email — письма никуда не уходят, но код и</w:t>
-      </w:r>
-      <w:r>
-        <w:t xml:space="preserve"> </w:t>
-      </w:r>
-      <w:r>
-        <w:t xml:space="preserve">flow проверяются end-to-end.</w:t>
-      </w:r>
-    </w:p>
-    <w:bookmarkEnd w:id="25"/>
-    <w:bookmarkStart w:id="26" w:name="фаза-4-реальные-платежи"/>
+        <w:t xml:space="preserve">Health-check эндпоинты + аптайм-мониторинг + сбор ошибок (Sentry или</w:t>
+      </w:r>
+      <w:r>
+        <w:t xml:space="preserve"> </w:t>
+      </w:r>
+      <w:r>
+        <w:t xml:space="preserve">аналог) — сейчас никакого мониторинга ошибок в проде нет.</w:t>
+      </w:r>
+    </w:p>
+    <w:p>
+      <w:pPr>
+        <w:numPr>
+          <w:ilvl w:val="0"/>
+          <w:numId w:val="1002"/>
+        </w:numPr>
+        <w:pStyle w:val="Compact"/>
+      </w:pPr>
+      <w:r>
+        <w:t xml:space="preserve">Логирование: структурированные логи backend с ротацией.</w:t>
+      </w:r>
+    </w:p>
+    <w:bookmarkEnd w:id="24"/>
+    <w:bookmarkStart w:id="25" w:name="фаза-3-email"/>
     <w:p>
       <w:pPr>
         <w:pStyle w:val="Heading3"/>
       </w:pPr>
       <w:r>
-        <w:t xml:space="preserve">Фаза 4 — Реальные платежи</w:t>
+        <w:t xml:space="preserve">Фаза 3 — Email</w:t>
       </w:r>
     </w:p>
     <w:p>
@@ -1428,631 +1465,22 @@
         <w:pStyle w:val="FirstParagraph"/>
       </w:pPr>
       <w:r>
-        <w:t xml:space="preserve">Возможна только после Фазы 0. До этой фазы бронирование скрыто флагом</w:t>
-      </w:r>
-      <w:r>
-        <w:t xml:space="preserve"> </w:t>
-      </w:r>
-      <w:r>
-        <w:rPr>
-          <w:rStyle w:val="VerbatimChar"/>
-        </w:rPr>
-        <w:t xml:space="preserve">ORDERS_DISABLED</w:t>
-      </w:r>
-      <w:r>
-        <w:t xml:space="preserve"> </w:t>
-      </w:r>
-      <w:r>
-        <w:t xml:space="preserve">(backend</w:t>
-      </w:r>
-      <w:r>
-        <w:t xml:space="preserve"> </w:t>
-      </w:r>
-      <w:r>
-        <w:rPr>
-          <w:rStyle w:val="VerbatimChar"/>
-        </w:rPr>
-        <w:t xml:space="preserve">.env</w:t>
-      </w:r>
-      <w:r>
-        <w:t xml:space="preserve">) /</w:t>
-      </w:r>
-      <w:r>
-        <w:t xml:space="preserve"> </w:t>
-      </w:r>
-      <w:r>
-        <w:rPr>
-          <w:rStyle w:val="VerbatimChar"/>
-        </w:rPr>
-        <w:t xml:space="preserve">NEXT_PUBLIC_ORDERS_DISABLED</w:t>
-      </w:r>
-      <w:r>
-        <w:t xml:space="preserve"> </w:t>
-      </w:r>
-      <w:r>
-        <w:t xml:space="preserve">(frontend</w:t>
-      </w:r>
-      <w:r>
-        <w:t xml:space="preserve"> </w:t>
-      </w:r>
-      <w:r>
-        <w:rPr>
-          <w:rStyle w:val="VerbatimChar"/>
-        </w:rPr>
-        <w:t xml:space="preserve">.env.local</w:t>
-      </w:r>
-      <w:r>
-        <w:t xml:space="preserve">) — сайт открыт для просмотра/регистрации, но</w:t>
-      </w:r>
-      <w:r>
-        <w:t xml:space="preserve"> </w:t>
-      </w:r>
-      <w:r>
-        <w:t xml:space="preserve">попытка оформить бронь показывает «сайт в разработке». Снимается без</w:t>
-      </w:r>
-      <w:r>
-        <w:t xml:space="preserve"> </w:t>
-      </w:r>
-      <w:r>
-        <w:t xml:space="preserve">правок кода — убрать обе переменные и передеплоить.</w:t>
-      </w:r>
-      <w:r>
-        <w:t xml:space="preserve"> </w:t>
-      </w:r>
-      <w:r>
-        <w:t xml:space="preserve">- Реализовать реальный класс</w:t>
-      </w:r>
-      <w:r>
-        <w:t xml:space="preserve"> </w:t>
-      </w:r>
-      <w:r>
-        <w:rPr>
-          <w:rStyle w:val="VerbatimChar"/>
-        </w:rPr>
-        <w:t xml:space="preserve">PaymentProvider</w:t>
-      </w:r>
-      <w:r>
-        <w:t xml:space="preserve"> </w:t>
-      </w:r>
-      <w:r>
-        <w:t xml:space="preserve">вместо</w:t>
-      </w:r>
-      <w:r>
-        <w:t xml:space="preserve"> </w:t>
-      </w:r>
-      <w:r>
-        <w:rPr>
-          <w:rStyle w:val="VerbatimChar"/>
-        </w:rPr>
-        <w:t xml:space="preserve">MockYookassaProvider</w:t>
-      </w:r>
-      <w:r>
-        <w:t xml:space="preserve"> </w:t>
-      </w:r>
-      <w:r>
-        <w:t xml:space="preserve">— архитектурно уже готово (весь остальной код</w:t>
-      </w:r>
-      <w:r>
-        <w:t xml:space="preserve"> </w:t>
-      </w:r>
-      <w:r>
-        <w:t xml:space="preserve">работает через интерфейс, подстановка класса под токеном</w:t>
-      </w:r>
-      <w:r>
-        <w:t xml:space="preserve"> </w:t>
-      </w:r>
-      <w:r>
-        <w:rPr>
-          <w:rStyle w:val="VerbatimChar"/>
-        </w:rPr>
-        <w:t xml:space="preserve">PAYMENT_PROVIDER</w:t>
-      </w:r>
-      <w:r>
-        <w:t xml:space="preserve"> </w:t>
-      </w:r>
-      <w:r>
-        <w:t xml:space="preserve">не требует правок в бронированиях/эскроу-логике).</w:t>
-      </w:r>
-      <w:r>
-        <w:t xml:space="preserve"> </w:t>
-      </w:r>
-      <w:r>
-        <w:t xml:space="preserve">- Реализовать флоу верификации продавца перед первой выплатой (поле</w:t>
-      </w:r>
-      <w:r>
-        <w:t xml:space="preserve"> </w:t>
-      </w:r>
-      <w:r>
-        <w:rPr>
-          <w:rStyle w:val="VerbatimChar"/>
-        </w:rPr>
-        <w:t xml:space="preserve">isSellerVerified</w:t>
-      </w:r>
-      <w:r>
-        <w:t xml:space="preserve"> </w:t>
-      </w:r>
-      <w:r>
-        <w:t xml:space="preserve">в модели уже есть, самого KYC-процесса — нет).</w:t>
-      </w:r>
-      <w:r>
-        <w:t xml:space="preserve"> </w:t>
-      </w:r>
-      <w:r>
-        <w:t xml:space="preserve">- Прогнать сквозной тест реальных платежей в sandbox-режиме провайдера</w:t>
-      </w:r>
-      <w:r>
-        <w:t xml:space="preserve"> </w:t>
-      </w:r>
-      <w:r>
-        <w:t xml:space="preserve">перед боевым переключением.</w:t>
-      </w:r>
-    </w:p>
-    <w:bookmarkEnd w:id="26"/>
-    <w:bookmarkStart w:id="27" w:name="фаза-5-тестирование-и-безопасность"/>
-    <w:p>
-      <w:pPr>
-        <w:pStyle w:val="Heading3"/>
-      </w:pPr>
-      <w:r>
-        <w:t xml:space="preserve">Фаза 5 — Тестирование и безопасность</w:t>
-      </w:r>
-    </w:p>
-    <w:p>
-      <w:pPr>
-        <w:pStyle w:val="FirstParagraph"/>
-      </w:pPr>
-      <w:r>
-        <w:rPr>
-          <w:bCs/>
-          <w:b/>
-        </w:rPr>
-        <w:t xml:space="preserve">Готово (2026-08-27):</w:t>
-      </w:r>
-      <w:r>
-        <w:t xml:space="preserve"> </w:t>
-      </w:r>
-      <w:r>
-        <w:t xml:space="preserve">полный аудит безопасности перед релизом (auth/authz,</w:t>
-      </w:r>
-      <w:r>
-        <w:t xml:space="preserve"> </w:t>
-      </w:r>
-      <w:r>
-        <w:t xml:space="preserve">инъекции, загрузка файлов, секреты, CORS, rate limiting, эскроу-логика,</w:t>
-      </w:r>
-      <w:r>
-        <w:t xml:space="preserve"> </w:t>
-      </w:r>
-      <w:r>
-        <w:t xml:space="preserve">админка, зависимости). Найденное и исправленное:</w:t>
-      </w:r>
-      <w:r>
-        <w:t xml:space="preserve"> </w:t>
-      </w:r>
-      <w:r>
-        <w:t xml:space="preserve">- Basic Auth гейт обходился подделкой</w:t>
-      </w:r>
-      <w:r>
-        <w:t xml:space="preserve"> </w:t>
-      </w:r>
-      <w:r>
-        <w:rPr>
-          <w:rStyle w:val="VerbatimChar"/>
-        </w:rPr>
-        <w:t xml:space="preserve">Authorization: Bearer x</w:t>
-      </w:r>
-      <w:r>
-        <w:t xml:space="preserve"> </w:t>
-      </w:r>
-      <w:r>
-        <w:t xml:space="preserve">— гейт</w:t>
-      </w:r>
-      <w:r>
-        <w:t xml:space="preserve"> </w:t>
-      </w:r>
-      <w:r>
-        <w:t xml:space="preserve">снят полностью (см. блокер №4 выше).</w:t>
-      </w:r>
-      <w:r>
-        <w:t xml:space="preserve"> </w:t>
-      </w:r>
-      <w:r>
-        <w:t xml:space="preserve">- Токены сброса пароля/подтверждения email писались в лог в открытом виде</w:t>
-      </w:r>
-      <w:r>
-        <w:t xml:space="preserve"> </w:t>
-      </w:r>
-      <w:r>
-        <w:t xml:space="preserve">в проде — теперь логируются только вне</w:t>
-      </w:r>
-      <w:r>
-        <w:t xml:space="preserve"> </w:t>
-      </w:r>
-      <w:r>
-        <w:rPr>
-          <w:rStyle w:val="VerbatimChar"/>
-        </w:rPr>
-        <w:t xml:space="preserve">NODE_ENV=production</w:t>
-      </w:r>
-      <w:r>
-        <w:t xml:space="preserve"> </w:t>
-      </w:r>
-      <w:r>
-        <w:t xml:space="preserve">(</w:t>
-      </w:r>
-      <w:r>
-        <w:rPr>
-          <w:rStyle w:val="VerbatimChar"/>
-        </w:rPr>
-        <w:t xml:space="preserve">backend/src/mail/mail.service.ts</w:t>
-      </w:r>
-      <w:r>
-        <w:t xml:space="preserve">); сама отправка писем по-прежнему</w:t>
-      </w:r>
-      <w:r>
-        <w:t xml:space="preserve"> </w:t>
-      </w:r>
-      <w:r>
-        <w:t xml:space="preserve">не реализована (см. Фазу 3).</w:t>
-      </w:r>
-      <w:r>
-        <w:t xml:space="preserve"> </w:t>
-      </w:r>
-      <w:r>
-        <w:t xml:space="preserve">- WebSocket</w:t>
-      </w:r>
-      <w:r>
-        <w:t xml:space="preserve"> </w:t>
-      </w:r>
-      <w:r>
-        <w:rPr>
-          <w:rStyle w:val="VerbatimChar"/>
-        </w:rPr>
-        <w:t xml:space="preserve">chat:join</w:t>
-      </w:r>
-      <w:r>
-        <w:t xml:space="preserve"> </w:t>
-      </w:r>
-      <w:r>
-        <w:t xml:space="preserve">пускал в комнату любого чата без проверки, что</w:t>
-      </w:r>
-      <w:r>
-        <w:t xml:space="preserve"> </w:t>
-      </w:r>
-      <w:r>
-        <w:t xml:space="preserve">пользователь — участник (можно было слушать чужую переписку по</w:t>
-      </w:r>
-      <w:r>
-        <w:t xml:space="preserve"> </w:t>
-      </w:r>
-      <w:r>
-        <w:t xml:space="preserve">известному chatId) — добавлена проверка через</w:t>
-      </w:r>
-      <w:r>
-        <w:t xml:space="preserve"> </w:t>
-      </w:r>
-      <w:r>
-        <w:rPr>
-          <w:rStyle w:val="VerbatimChar"/>
-        </w:rPr>
-        <w:t xml:space="preserve">getChatForParticipant</w:t>
-      </w:r>
-      <w:r>
-        <w:t xml:space="preserve"> </w:t>
-      </w:r>
-      <w:r>
-        <w:t xml:space="preserve">(</w:t>
-      </w:r>
-      <w:r>
-        <w:rPr>
-          <w:rStyle w:val="VerbatimChar"/>
-        </w:rPr>
-        <w:t xml:space="preserve">backend/src/chats/chats.gateway.ts</w:t>
-      </w:r>
-      <w:r>
-        <w:t xml:space="preserve">).</w:t>
-      </w:r>
-      <w:r>
-        <w:t xml:space="preserve"> </w:t>
-      </w:r>
-      <w:r>
-        <w:t xml:space="preserve">- Presigned upload в MinIO принимал</w:t>
-      </w:r>
-      <w:r>
-        <w:t xml:space="preserve"> </w:t>
-      </w:r>
-      <w:r>
-        <w:rPr>
-          <w:rStyle w:val="VerbatimChar"/>
-        </w:rPr>
-        <w:t xml:space="preserve">Content-Type</w:t>
-      </w:r>
-      <w:r>
-        <w:t xml:space="preserve"> </w:t>
-      </w:r>
-      <w:r>
-        <w:t xml:space="preserve">по префиксу</w:t>
-      </w:r>
-      <w:r>
-        <w:t xml:space="preserve"> </w:t>
-      </w:r>
-      <w:r>
-        <w:rPr>
-          <w:rStyle w:val="VerbatimChar"/>
-        </w:rPr>
-        <w:t xml:space="preserve">image/</w:t>
-      </w:r>
-      <w:r>
-        <w:t xml:space="preserve"> </w:t>
-      </w:r>
-      <w:r>
-        <w:t xml:space="preserve">(пропускал</w:t>
-      </w:r>
-      <w:r>
-        <w:t xml:space="preserve"> </w:t>
-      </w:r>
-      <w:r>
-        <w:rPr>
-          <w:rStyle w:val="VerbatimChar"/>
-        </w:rPr>
-        <w:t xml:space="preserve">image/svg+xml</w:t>
-      </w:r>
-      <w:r>
-        <w:t xml:space="preserve"> </w:t>
-      </w:r>
-      <w:r>
-        <w:t xml:space="preserve">— потенциальный stored XSS) — заменено на</w:t>
-      </w:r>
-      <w:r>
-        <w:t xml:space="preserve"> </w:t>
-      </w:r>
-      <w:r>
-        <w:t xml:space="preserve">точное совпадение (</w:t>
-      </w:r>
-      <w:r>
-        <w:rPr>
-          <w:rStyle w:val="VerbatimChar"/>
-        </w:rPr>
-        <w:t xml:space="preserve">backend/src/uploads/uploads.service.ts</w:t>
-      </w:r>
-      <w:r>
-        <w:t xml:space="preserve">).</w:t>
-      </w:r>
-      <w:r>
-        <w:t xml:space="preserve"> </w:t>
-      </w:r>
-      <w:r>
-        <w:t xml:space="preserve">-</w:t>
-      </w:r>
-      <w:r>
-        <w:t xml:space="preserve"> </w:t>
-      </w:r>
-      <w:r>
-        <w:rPr>
-          <w:rStyle w:val="VerbatimChar"/>
-        </w:rPr>
-        <w:t xml:space="preserve">fixedAmount</w:t>
-      </w:r>
-      <w:r>
-        <w:t xml:space="preserve"> </w:t>
-      </w:r>
-      <w:r>
-        <w:t xml:space="preserve">при подтверждении брони с договорной ценой не проверялся</w:t>
-      </w:r>
-      <w:r>
-        <w:t xml:space="preserve"> </w:t>
-      </w:r>
-      <w:r>
-        <w:t xml:space="preserve">на положительность — добавлена валидация</w:t>
-      </w:r>
-      <w:r>
-        <w:t xml:space="preserve"> </w:t>
-      </w:r>
-      <w:r>
-        <w:t xml:space="preserve">(</w:t>
-      </w:r>
-      <w:r>
-        <w:rPr>
-          <w:rStyle w:val="VerbatimChar"/>
-        </w:rPr>
-        <w:t xml:space="preserve">backend/src/bookings/dto/confirm-booking.dto.ts</w:t>
-      </w:r>
-      <w:r>
-        <w:t xml:space="preserve">).</w:t>
-      </w:r>
-      <w:r>
-        <w:t xml:space="preserve"> </w:t>
-      </w:r>
-      <w:r>
-        <w:t xml:space="preserve">-</w:t>
-      </w:r>
-      <w:r>
-        <w:t xml:space="preserve"> </w:t>
-      </w:r>
-      <w:r>
-        <w:rPr>
-          <w:rStyle w:val="VerbatimChar"/>
-        </w:rPr>
-        <w:t xml:space="preserve">npm audit</w:t>
-      </w:r>
-      <w:r>
-        <w:t xml:space="preserve"> </w:t>
-      </w:r>
-      <w:r>
-        <w:t xml:space="preserve">(backend и frontend) — 0 уязвимостей после</w:t>
-      </w:r>
-      <w:r>
-        <w:t xml:space="preserve"> </w:t>
-      </w:r>
-      <w:r>
-        <w:rPr>
-          <w:rStyle w:val="VerbatimChar"/>
-        </w:rPr>
-        <w:t xml:space="preserve">npm audit fix</w:t>
-      </w:r>
-      <w:r>
-        <w:t xml:space="preserve">.</w:t>
-      </w:r>
-    </w:p>
-    <w:p>
-      <w:pPr>
-        <w:pStyle w:val="BodyText"/>
-      </w:pPr>
-      <w:r>
-        <w:t xml:space="preserve">Не исправлено, осознанно отложено:</w:t>
-      </w:r>
-      <w:r>
-        <w:t xml:space="preserve"> </w:t>
-      </w:r>
-      <w:r>
-        <w:t xml:space="preserve">- Внешние URL для аватара/фото услуг/фото отзывов не ограничены доменом</w:t>
-      </w:r>
-      <w:r>
-        <w:t xml:space="preserve"> </w:t>
-      </w:r>
-      <w:r>
-        <w:t xml:space="preserve">собственного хранилища (можно подменить контент после модерации) —</w:t>
-      </w:r>
-      <w:r>
-        <w:t xml:space="preserve"> </w:t>
-      </w:r>
-      <w:r>
-        <w:t xml:space="preserve">требует решения, ограничивать ли строго</w:t>
-      </w:r>
-      <w:r>
-        <w:t xml:space="preserve"> </w:t>
-      </w:r>
-      <w:r>
-        <w:rPr>
-          <w:rStyle w:val="VerbatimChar"/>
-        </w:rPr>
-        <w:t xml:space="preserve">S3_PUBLIC_URL</w:t>
-      </w:r>
-      <w:r>
-        <w:t xml:space="preserve"> </w:t>
-      </w:r>
-      <w:r>
-        <w:t xml:space="preserve">или разрешить</w:t>
-      </w:r>
-      <w:r>
-        <w:t xml:space="preserve"> </w:t>
-      </w:r>
-      <w:r>
-        <w:t xml:space="preserve">внешние ссылки как фичу.</w:t>
-      </w:r>
-      <w:r>
-        <w:t xml:space="preserve"> </w:t>
-      </w:r>
-      <w:r>
-        <w:t xml:space="preserve">-</w:t>
-      </w:r>
-      <w:r>
-        <w:t xml:space="preserve"> </w:t>
-      </w:r>
-      <w:r>
-        <w:rPr>
-          <w:rStyle w:val="VerbatimChar"/>
-        </w:rPr>
-        <w:t xml:space="preserve">accessToken</w:t>
-      </w:r>
-      <w:r>
-        <w:t xml:space="preserve">/</w:t>
-      </w:r>
-      <w:r>
-        <w:rPr>
-          <w:rStyle w:val="VerbatimChar"/>
-        </w:rPr>
-        <w:t xml:space="preserve">refreshToken</w:t>
-      </w:r>
-      <w:r>
-        <w:t xml:space="preserve"> </w:t>
-      </w:r>
-      <w:r>
-        <w:t xml:space="preserve">в</w:t>
-      </w:r>
-      <w:r>
-        <w:t xml:space="preserve"> </w:t>
-      </w:r>
-      <w:r>
-        <w:rPr>
-          <w:rStyle w:val="VerbatimChar"/>
-        </w:rPr>
-        <w:t xml:space="preserve">localStorage</w:t>
-      </w:r>
-      <w:r>
-        <w:t xml:space="preserve"> </w:t>
-      </w:r>
-      <w:r>
-        <w:t xml:space="preserve">вместо</w:t>
-      </w:r>
-      <w:r>
-        <w:t xml:space="preserve"> </w:t>
-      </w:r>
-      <w:r>
-        <w:rPr>
-          <w:rStyle w:val="VerbatimChar"/>
-        </w:rPr>
-        <w:t xml:space="preserve">httpOnly</w:t>
-      </w:r>
-      <w:r>
-        <w:t xml:space="preserve">-cookie —</w:t>
-      </w:r>
-      <w:r>
-        <w:t xml:space="preserve"> </w:t>
-      </w:r>
-      <w:r>
-        <w:t xml:space="preserve">архитектурная правка, требует отдельного захода.</w:t>
-      </w:r>
-      <w:r>
-        <w:t xml:space="preserve"> </w:t>
-      </w:r>
-      <w:r>
-        <w:t xml:space="preserve">- Нет</w:t>
-      </w:r>
-      <w:r>
-        <w:t xml:space="preserve"> </w:t>
-      </w:r>
-      <w:r>
-        <w:rPr>
-          <w:rStyle w:val="VerbatimChar"/>
-        </w:rPr>
-        <w:t xml:space="preserve">helmet</w:t>
-      </w:r>
-      <w:r>
-        <w:t xml:space="preserve">/security headers в backend, нет rate limit на</w:t>
-      </w:r>
-      <w:r>
-        <w:t xml:space="preserve"> </w:t>
-      </w:r>
-      <w:r>
-        <w:rPr>
-          <w:rStyle w:val="VerbatimChar"/>
-        </w:rPr>
-        <w:t xml:space="preserve">/api/auth/refresh</w:t>
-      </w:r>
-      <w:r>
-        <w:t xml:space="preserve">, MinIO service-account с</w:t>
-      </w:r>
-      <w:r>
-        <w:t xml:space="preserve"> </w:t>
-      </w:r>
-      <w:r>
-        <w:rPr>
-          <w:rStyle w:val="VerbatimChar"/>
-        </w:rPr>
-        <w:t xml:space="preserve">readwrite</w:t>
-      </w:r>
-      <w:r>
-        <w:t xml:space="preserve"> </w:t>
-      </w:r>
-      <w:r>
-        <w:t xml:space="preserve">на весь</w:t>
-      </w:r>
-      <w:r>
-        <w:t xml:space="preserve"> </w:t>
-      </w:r>
-      <w:r>
-        <w:t xml:space="preserve">инстанс вместо одного бакета — низкий приоритет, до релиза не блокирует.</w:t>
+        <w:t xml:space="preserve">Ранее откладывали до появления домена (SPF/DKIM/DMARC не настроить без</w:t>
+      </w:r>
+      <w:r>
+        <w:t xml:space="preserve"> </w:t>
+      </w:r>
+      <w:r>
+        <w:t xml:space="preserve">него) — теперь домен есть (</w:t>
+      </w:r>
+      <w:r>
+        <w:rPr>
+          <w:rStyle w:val="VerbatimChar"/>
+        </w:rPr>
+        <w:t xml:space="preserve">hobbyhub.ru</w:t>
+      </w:r>
+      <w:r>
+        <w:t xml:space="preserve">), блокер снят, можно начинать.</w:t>
       </w:r>
     </w:p>
     <w:p>
@@ -2064,25 +1492,61 @@
         <w:pStyle w:val="Compact"/>
       </w:pPr>
       <w:r>
-        <w:t xml:space="preserve">Написать smoke/e2e-тесты на критичные пути (регистрация, бронирование,</w:t>
-      </w:r>
-      <w:r>
-        <w:t xml:space="preserve"> </w:t>
-      </w:r>
-      <w:r>
-        <w:t xml:space="preserve">оплата, чат) — сейчас в проекте нет тестов, кроме дефолтного</w:t>
-      </w:r>
-      <w:r>
-        <w:t xml:space="preserve"> </w:t>
-      </w:r>
-      <w:r>
-        <w:t xml:space="preserve">Nest-boilerplate (</w:t>
-      </w:r>
-      <w:r>
-        <w:rPr>
-          <w:rStyle w:val="VerbatimChar"/>
-        </w:rPr>
-        <w:t xml:space="preserve">app.controller.spec.ts</w:t>
+        <w:t xml:space="preserve">Подключить реального провайдера (SendGrid / Mailgun / Yandex Cloud</w:t>
+      </w:r>
+      <w:r>
+        <w:t xml:space="preserve"> </w:t>
+      </w:r>
+      <w:r>
+        <w:t xml:space="preserve">почтовый сервис) вместо</w:t>
+      </w:r>
+      <w:r>
+        <w:t xml:space="preserve"> </w:t>
+      </w:r>
+      <w:r>
+        <w:rPr>
+          <w:rStyle w:val="VerbatimChar"/>
+        </w:rPr>
+        <w:t xml:space="preserve">mail.service.ts</w:t>
+      </w:r>
+      <w:r>
+        <w:t xml:space="preserve">-заглушки — интерфейс методов</w:t>
+      </w:r>
+      <w:r>
+        <w:t xml:space="preserve"> </w:t>
+      </w:r>
+      <w:r>
+        <w:t xml:space="preserve">менять не нужно, только реализацию (например, через</w:t>
+      </w:r>
+      <w:r>
+        <w:t xml:space="preserve"> </w:t>
+      </w:r>
+      <w:r>
+        <w:rPr>
+          <w:rStyle w:val="VerbatimChar"/>
+        </w:rPr>
+        <w:t xml:space="preserve">nodemailer</w:t>
+      </w:r>
+      <w:r>
+        <w:t xml:space="preserve"> </w:t>
+      </w:r>
+      <w:r>
+        <w:t xml:space="preserve">+ SMTP,</w:t>
+      </w:r>
+      <w:r>
+        <w:t xml:space="preserve"> </w:t>
+      </w:r>
+      <w:r>
+        <w:t xml:space="preserve">настраиваемое через env —</w:t>
+      </w:r>
+      <w:r>
+        <w:t xml:space="preserve"> </w:t>
+      </w:r>
+      <w:r>
+        <w:rPr>
+          <w:rStyle w:val="VerbatimChar"/>
+        </w:rPr>
+        <w:t xml:space="preserve">SMTP_HOST/PORT/USER/PASSWORD/MAIL_FROM</w:t>
       </w:r>
       <w:r>
         <w:t xml:space="preserve">).</w:t>
@@ -2097,13 +1561,34 @@
         <w:pStyle w:val="Compact"/>
       </w:pPr>
       <w:r>
-        <w:t xml:space="preserve">Нагрузочное тестирование на целевые 1000+ одновременных пользователей</w:t>
-      </w:r>
-      <w:r>
-        <w:t xml:space="preserve"> </w:t>
-      </w:r>
-      <w:r>
-        <w:t xml:space="preserve">(зафиксировано в tz-amendments п.11).</w:t>
+        <w:t xml:space="preserve">Настроить SPF/DKIM/DMARC для</w:t>
+      </w:r>
+      <w:r>
+        <w:t xml:space="preserve"> </w:t>
+      </w:r>
+      <w:r>
+        <w:rPr>
+          <w:rStyle w:val="VerbatimChar"/>
+        </w:rPr>
+        <w:t xml:space="preserve">hobbyhub.ru</w:t>
+      </w:r>
+      <w:r>
+        <w:t xml:space="preserve"> </w:t>
+      </w:r>
+      <w:r>
+        <w:t xml:space="preserve">(DNS-записи у регистратора</w:t>
+      </w:r>
+      <w:r>
+        <w:t xml:space="preserve"> </w:t>
+      </w:r>
+      <w:r>
+        <w:t xml:space="preserve">или через NS-хостинг Timeweb, куда уже переключены NS-серверы домена),</w:t>
+      </w:r>
+      <w:r>
+        <w:t xml:space="preserve"> </w:t>
+      </w:r>
+      <w:r>
+        <w:t xml:space="preserve">иначе письма будут попадать в спам.</w:t>
       </w:r>
     </w:p>
     <w:p>
@@ -2115,50 +1600,661 @@
         <w:pStyle w:val="Compact"/>
       </w:pPr>
       <w:r>
-        <w:t xml:space="preserve">Security review: OWASP top 10, аудит прав доступа (</w:t>
-      </w:r>
-      <w:r>
-        <w:rPr>
-          <w:rStyle w:val="VerbatimChar"/>
-        </w:rPr>
-        <w:t xml:space="preserve">JwtAuthGuard</w:t>
-      </w:r>
-      <w:r>
-        <w:t xml:space="preserve">,</w:t>
-      </w:r>
-      <w:r>
-        <w:t xml:space="preserve"> </w:t>
-      </w:r>
-      <w:r>
-        <w:t xml:space="preserve">admin-гварды), проверка что секреты не попали в git, что Basic Auth</w:t>
-      </w:r>
-      <w:r>
-        <w:t xml:space="preserve"> </w:t>
-      </w:r>
-      <w:r>
-        <w:t xml:space="preserve">гейт действительно снят.</w:t>
-      </w:r>
-    </w:p>
-    <w:p>
-      <w:pPr>
-        <w:numPr>
-          <w:ilvl w:val="0"/>
-          <w:numId w:val="1003"/>
-        </w:numPr>
-        <w:pStyle w:val="Compact"/>
-      </w:pPr>
-      <w:r>
-        <w:t xml:space="preserve">Ручной регресс по ключевым пользовательским сценариям (чек-лист ниже).</w:t>
-      </w:r>
-    </w:p>
-    <w:bookmarkEnd w:id="27"/>
-    <w:bookmarkStart w:id="28" w:name="фаза-6-контент-и-запуск"/>
+        <w:t xml:space="preserve">До подключения провайдера можно проверить саму реализацию на бесплатном</w:t>
+      </w:r>
+      <w:r>
+        <w:t xml:space="preserve"> </w:t>
+      </w:r>
+      <w:r>
+        <w:t xml:space="preserve">тестовом SMTP вроде Ethereal Email — письма никуда не уходят, но код и</w:t>
+      </w:r>
+      <w:r>
+        <w:t xml:space="preserve"> </w:t>
+      </w:r>
+      <w:r>
+        <w:t xml:space="preserve">flow проверяются end-to-end.</w:t>
+      </w:r>
+    </w:p>
+    <w:bookmarkEnd w:id="25"/>
+    <w:bookmarkStart w:id="26" w:name="фаза-4-реальные-платежи"/>
     <w:p>
       <w:pPr>
         <w:pStyle w:val="Heading3"/>
       </w:pPr>
       <w:r>
-        <w:t xml:space="preserve">Фаза 6 — Контент и запуск</w:t>
+        <w:t xml:space="preserve">Фаза 4 — Реальные платежи</w:t>
+      </w:r>
+    </w:p>
+    <w:p>
+      <w:pPr>
+        <w:pStyle w:val="FirstParagraph"/>
+      </w:pPr>
+      <w:r>
+        <w:t xml:space="preserve">Возможна только после Фазы 0. До этой фазы бронирование скрыто флагом</w:t>
+      </w:r>
+      <w:r>
+        <w:t xml:space="preserve"> </w:t>
+      </w:r>
+      <w:r>
+        <w:rPr>
+          <w:rStyle w:val="VerbatimChar"/>
+        </w:rPr>
+        <w:t xml:space="preserve">ORDERS_DISABLED</w:t>
+      </w:r>
+      <w:r>
+        <w:t xml:space="preserve"> </w:t>
+      </w:r>
+      <w:r>
+        <w:t xml:space="preserve">(backend</w:t>
+      </w:r>
+      <w:r>
+        <w:t xml:space="preserve"> </w:t>
+      </w:r>
+      <w:r>
+        <w:rPr>
+          <w:rStyle w:val="VerbatimChar"/>
+        </w:rPr>
+        <w:t xml:space="preserve">.env</w:t>
+      </w:r>
+      <w:r>
+        <w:t xml:space="preserve">) /</w:t>
+      </w:r>
+      <w:r>
+        <w:t xml:space="preserve"> </w:t>
+      </w:r>
+      <w:r>
+        <w:rPr>
+          <w:rStyle w:val="VerbatimChar"/>
+        </w:rPr>
+        <w:t xml:space="preserve">NEXT_PUBLIC_ORDERS_DISABLED</w:t>
+      </w:r>
+      <w:r>
+        <w:t xml:space="preserve"> </w:t>
+      </w:r>
+      <w:r>
+        <w:t xml:space="preserve">(frontend</w:t>
+      </w:r>
+      <w:r>
+        <w:t xml:space="preserve"> </w:t>
+      </w:r>
+      <w:r>
+        <w:rPr>
+          <w:rStyle w:val="VerbatimChar"/>
+        </w:rPr>
+        <w:t xml:space="preserve">.env.local</w:t>
+      </w:r>
+      <w:r>
+        <w:t xml:space="preserve">) — сайт открыт для просмотра/регистрации, но</w:t>
+      </w:r>
+      <w:r>
+        <w:t xml:space="preserve"> </w:t>
+      </w:r>
+      <w:r>
+        <w:t xml:space="preserve">попытка оформить бронь показывает «сайт в разработке». Снимается без</w:t>
+      </w:r>
+      <w:r>
+        <w:t xml:space="preserve"> </w:t>
+      </w:r>
+      <w:r>
+        <w:t xml:space="preserve">правок кода — убрать обе переменные и передеплоить.</w:t>
+      </w:r>
+      <w:r>
+        <w:t xml:space="preserve"> </w:t>
+      </w:r>
+      <w:r>
+        <w:t xml:space="preserve">- Реализовать реальный класс</w:t>
+      </w:r>
+      <w:r>
+        <w:t xml:space="preserve"> </w:t>
+      </w:r>
+      <w:r>
+        <w:rPr>
+          <w:rStyle w:val="VerbatimChar"/>
+        </w:rPr>
+        <w:t xml:space="preserve">PaymentProvider</w:t>
+      </w:r>
+      <w:r>
+        <w:t xml:space="preserve"> </w:t>
+      </w:r>
+      <w:r>
+        <w:t xml:space="preserve">вместо</w:t>
+      </w:r>
+      <w:r>
+        <w:t xml:space="preserve"> </w:t>
+      </w:r>
+      <w:r>
+        <w:rPr>
+          <w:rStyle w:val="VerbatimChar"/>
+        </w:rPr>
+        <w:t xml:space="preserve">MockYookassaProvider</w:t>
+      </w:r>
+      <w:r>
+        <w:t xml:space="preserve"> </w:t>
+      </w:r>
+      <w:r>
+        <w:t xml:space="preserve">— архитектурно уже готово (весь остальной код</w:t>
+      </w:r>
+      <w:r>
+        <w:t xml:space="preserve"> </w:t>
+      </w:r>
+      <w:r>
+        <w:t xml:space="preserve">работает через интерфейс, подстановка класса под токеном</w:t>
+      </w:r>
+      <w:r>
+        <w:t xml:space="preserve"> </w:t>
+      </w:r>
+      <w:r>
+        <w:rPr>
+          <w:rStyle w:val="VerbatimChar"/>
+        </w:rPr>
+        <w:t xml:space="preserve">PAYMENT_PROVIDER</w:t>
+      </w:r>
+      <w:r>
+        <w:t xml:space="preserve"> </w:t>
+      </w:r>
+      <w:r>
+        <w:t xml:space="preserve">не требует правок в бронированиях/эскроу-логике).</w:t>
+      </w:r>
+      <w:r>
+        <w:t xml:space="preserve"> </w:t>
+      </w:r>
+      <w:r>
+        <w:t xml:space="preserve">- Реализовать флоу верификации продавца перед первой выплатой (поле</w:t>
+      </w:r>
+      <w:r>
+        <w:t xml:space="preserve"> </w:t>
+      </w:r>
+      <w:r>
+        <w:rPr>
+          <w:rStyle w:val="VerbatimChar"/>
+        </w:rPr>
+        <w:t xml:space="preserve">isSellerVerified</w:t>
+      </w:r>
+      <w:r>
+        <w:t xml:space="preserve"> </w:t>
+      </w:r>
+      <w:r>
+        <w:t xml:space="preserve">в модели уже есть, самого KYC-процесса — нет).</w:t>
+      </w:r>
+      <w:r>
+        <w:t xml:space="preserve"> </w:t>
+      </w:r>
+      <w:r>
+        <w:t xml:space="preserve">- Прогнать сквозной тест реальных платежей в sandbox-режиме провайдера</w:t>
+      </w:r>
+      <w:r>
+        <w:t xml:space="preserve"> </w:t>
+      </w:r>
+      <w:r>
+        <w:t xml:space="preserve">перед боевым переключением.</w:t>
+      </w:r>
+    </w:p>
+    <w:bookmarkEnd w:id="26"/>
+    <w:bookmarkStart w:id="27" w:name="фаза-5-тестирование-и-безопасность"/>
+    <w:p>
+      <w:pPr>
+        <w:pStyle w:val="Heading3"/>
+      </w:pPr>
+      <w:r>
+        <w:t xml:space="preserve">Фаза 5 — Тестирование и безопасность</w:t>
+      </w:r>
+    </w:p>
+    <w:p>
+      <w:pPr>
+        <w:pStyle w:val="FirstParagraph"/>
+      </w:pPr>
+      <w:r>
+        <w:rPr>
+          <w:bCs/>
+          <w:b/>
+        </w:rPr>
+        <w:t xml:space="preserve">Готово (2026-08-27):</w:t>
+      </w:r>
+      <w:r>
+        <w:t xml:space="preserve"> </w:t>
+      </w:r>
+      <w:r>
+        <w:t xml:space="preserve">полный аудит безопасности перед релизом (auth/authz,</w:t>
+      </w:r>
+      <w:r>
+        <w:t xml:space="preserve"> </w:t>
+      </w:r>
+      <w:r>
+        <w:t xml:space="preserve">инъекции, загрузка файлов, секреты, CORS, rate limiting, эскроу-логика,</w:t>
+      </w:r>
+      <w:r>
+        <w:t xml:space="preserve"> </w:t>
+      </w:r>
+      <w:r>
+        <w:t xml:space="preserve">админка, зависимости). Найденное и исправленное:</w:t>
+      </w:r>
+      <w:r>
+        <w:t xml:space="preserve"> </w:t>
+      </w:r>
+      <w:r>
+        <w:t xml:space="preserve">- Basic Auth гейт обходился подделкой</w:t>
+      </w:r>
+      <w:r>
+        <w:t xml:space="preserve"> </w:t>
+      </w:r>
+      <w:r>
+        <w:rPr>
+          <w:rStyle w:val="VerbatimChar"/>
+        </w:rPr>
+        <w:t xml:space="preserve">Authorization: Bearer x</w:t>
+      </w:r>
+      <w:r>
+        <w:t xml:space="preserve"> </w:t>
+      </w:r>
+      <w:r>
+        <w:t xml:space="preserve">— гейт</w:t>
+      </w:r>
+      <w:r>
+        <w:t xml:space="preserve"> </w:t>
+      </w:r>
+      <w:r>
+        <w:t xml:space="preserve">снят полностью (см. блокер №4 выше).</w:t>
+      </w:r>
+      <w:r>
+        <w:t xml:space="preserve"> </w:t>
+      </w:r>
+      <w:r>
+        <w:t xml:space="preserve">- Токены сброса пароля/подтверждения email писались в лог в открытом виде</w:t>
+      </w:r>
+      <w:r>
+        <w:t xml:space="preserve"> </w:t>
+      </w:r>
+      <w:r>
+        <w:t xml:space="preserve">в проде — теперь логируются только вне</w:t>
+      </w:r>
+      <w:r>
+        <w:t xml:space="preserve"> </w:t>
+      </w:r>
+      <w:r>
+        <w:rPr>
+          <w:rStyle w:val="VerbatimChar"/>
+        </w:rPr>
+        <w:t xml:space="preserve">NODE_ENV=production</w:t>
+      </w:r>
+      <w:r>
+        <w:t xml:space="preserve"> </w:t>
+      </w:r>
+      <w:r>
+        <w:t xml:space="preserve">(</w:t>
+      </w:r>
+      <w:r>
+        <w:rPr>
+          <w:rStyle w:val="VerbatimChar"/>
+        </w:rPr>
+        <w:t xml:space="preserve">backend/src/mail/mail.service.ts</w:t>
+      </w:r>
+      <w:r>
+        <w:t xml:space="preserve">); сама отправка писем по-прежнему</w:t>
+      </w:r>
+      <w:r>
+        <w:t xml:space="preserve"> </w:t>
+      </w:r>
+      <w:r>
+        <w:t xml:space="preserve">не реализована (см. Фазу 3).</w:t>
+      </w:r>
+      <w:r>
+        <w:t xml:space="preserve"> </w:t>
+      </w:r>
+      <w:r>
+        <w:t xml:space="preserve">- WebSocket</w:t>
+      </w:r>
+      <w:r>
+        <w:t xml:space="preserve"> </w:t>
+      </w:r>
+      <w:r>
+        <w:rPr>
+          <w:rStyle w:val="VerbatimChar"/>
+        </w:rPr>
+        <w:t xml:space="preserve">chat:join</w:t>
+      </w:r>
+      <w:r>
+        <w:t xml:space="preserve"> </w:t>
+      </w:r>
+      <w:r>
+        <w:t xml:space="preserve">пускал в комнату любого чата без проверки, что</w:t>
+      </w:r>
+      <w:r>
+        <w:t xml:space="preserve"> </w:t>
+      </w:r>
+      <w:r>
+        <w:t xml:space="preserve">пользователь — участник (можно было слушать чужую переписку по</w:t>
+      </w:r>
+      <w:r>
+        <w:t xml:space="preserve"> </w:t>
+      </w:r>
+      <w:r>
+        <w:t xml:space="preserve">известному chatId) — добавлена проверка через</w:t>
+      </w:r>
+      <w:r>
+        <w:t xml:space="preserve"> </w:t>
+      </w:r>
+      <w:r>
+        <w:rPr>
+          <w:rStyle w:val="VerbatimChar"/>
+        </w:rPr>
+        <w:t xml:space="preserve">getChatForParticipant</w:t>
+      </w:r>
+      <w:r>
+        <w:t xml:space="preserve"> </w:t>
+      </w:r>
+      <w:r>
+        <w:t xml:space="preserve">(</w:t>
+      </w:r>
+      <w:r>
+        <w:rPr>
+          <w:rStyle w:val="VerbatimChar"/>
+        </w:rPr>
+        <w:t xml:space="preserve">backend/src/chats/chats.gateway.ts</w:t>
+      </w:r>
+      <w:r>
+        <w:t xml:space="preserve">).</w:t>
+      </w:r>
+      <w:r>
+        <w:t xml:space="preserve"> </w:t>
+      </w:r>
+      <w:r>
+        <w:t xml:space="preserve">- Presigned upload в MinIO принимал</w:t>
+      </w:r>
+      <w:r>
+        <w:t xml:space="preserve"> </w:t>
+      </w:r>
+      <w:r>
+        <w:rPr>
+          <w:rStyle w:val="VerbatimChar"/>
+        </w:rPr>
+        <w:t xml:space="preserve">Content-Type</w:t>
+      </w:r>
+      <w:r>
+        <w:t xml:space="preserve"> </w:t>
+      </w:r>
+      <w:r>
+        <w:t xml:space="preserve">по префиксу</w:t>
+      </w:r>
+      <w:r>
+        <w:t xml:space="preserve"> </w:t>
+      </w:r>
+      <w:r>
+        <w:rPr>
+          <w:rStyle w:val="VerbatimChar"/>
+        </w:rPr>
+        <w:t xml:space="preserve">image/</w:t>
+      </w:r>
+      <w:r>
+        <w:t xml:space="preserve"> </w:t>
+      </w:r>
+      <w:r>
+        <w:t xml:space="preserve">(пропускал</w:t>
+      </w:r>
+      <w:r>
+        <w:t xml:space="preserve"> </w:t>
+      </w:r>
+      <w:r>
+        <w:rPr>
+          <w:rStyle w:val="VerbatimChar"/>
+        </w:rPr>
+        <w:t xml:space="preserve">image/svg+xml</w:t>
+      </w:r>
+      <w:r>
+        <w:t xml:space="preserve"> </w:t>
+      </w:r>
+      <w:r>
+        <w:t xml:space="preserve">— потенциальный stored XSS) — заменено на</w:t>
+      </w:r>
+      <w:r>
+        <w:t xml:space="preserve"> </w:t>
+      </w:r>
+      <w:r>
+        <w:t xml:space="preserve">точное совпадение (</w:t>
+      </w:r>
+      <w:r>
+        <w:rPr>
+          <w:rStyle w:val="VerbatimChar"/>
+        </w:rPr>
+        <w:t xml:space="preserve">backend/src/uploads/uploads.service.ts</w:t>
+      </w:r>
+      <w:r>
+        <w:t xml:space="preserve">).</w:t>
+      </w:r>
+      <w:r>
+        <w:t xml:space="preserve"> </w:t>
+      </w:r>
+      <w:r>
+        <w:t xml:space="preserve">-</w:t>
+      </w:r>
+      <w:r>
+        <w:t xml:space="preserve"> </w:t>
+      </w:r>
+      <w:r>
+        <w:rPr>
+          <w:rStyle w:val="VerbatimChar"/>
+        </w:rPr>
+        <w:t xml:space="preserve">fixedAmount</w:t>
+      </w:r>
+      <w:r>
+        <w:t xml:space="preserve"> </w:t>
+      </w:r>
+      <w:r>
+        <w:t xml:space="preserve">при подтверждении брони с договорной ценой не проверялся</w:t>
+      </w:r>
+      <w:r>
+        <w:t xml:space="preserve"> </w:t>
+      </w:r>
+      <w:r>
+        <w:t xml:space="preserve">на положительность — добавлена валидация</w:t>
+      </w:r>
+      <w:r>
+        <w:t xml:space="preserve"> </w:t>
+      </w:r>
+      <w:r>
+        <w:t xml:space="preserve">(</w:t>
+      </w:r>
+      <w:r>
+        <w:rPr>
+          <w:rStyle w:val="VerbatimChar"/>
+        </w:rPr>
+        <w:t xml:space="preserve">backend/src/bookings/dto/confirm-booking.dto.ts</w:t>
+      </w:r>
+      <w:r>
+        <w:t xml:space="preserve">).</w:t>
+      </w:r>
+      <w:r>
+        <w:t xml:space="preserve"> </w:t>
+      </w:r>
+      <w:r>
+        <w:t xml:space="preserve">-</w:t>
+      </w:r>
+      <w:r>
+        <w:t xml:space="preserve"> </w:t>
+      </w:r>
+      <w:r>
+        <w:rPr>
+          <w:rStyle w:val="VerbatimChar"/>
+        </w:rPr>
+        <w:t xml:space="preserve">npm audit</w:t>
+      </w:r>
+      <w:r>
+        <w:t xml:space="preserve"> </w:t>
+      </w:r>
+      <w:r>
+        <w:t xml:space="preserve">(backend и frontend) — 0 уязвимостей после</w:t>
+      </w:r>
+      <w:r>
+        <w:t xml:space="preserve"> </w:t>
+      </w:r>
+      <w:r>
+        <w:rPr>
+          <w:rStyle w:val="VerbatimChar"/>
+        </w:rPr>
+        <w:t xml:space="preserve">npm audit fix</w:t>
+      </w:r>
+      <w:r>
+        <w:t xml:space="preserve">.</w:t>
+      </w:r>
+    </w:p>
+    <w:p>
+      <w:pPr>
+        <w:pStyle w:val="BodyText"/>
+      </w:pPr>
+      <w:r>
+        <w:t xml:space="preserve">Не исправлено, осознанно отложено:</w:t>
+      </w:r>
+      <w:r>
+        <w:t xml:space="preserve"> </w:t>
+      </w:r>
+      <w:r>
+        <w:t xml:space="preserve">- Внешние URL для аватара/фото услуг/фото отзывов не ограничены доменом</w:t>
+      </w:r>
+      <w:r>
+        <w:t xml:space="preserve"> </w:t>
+      </w:r>
+      <w:r>
+        <w:t xml:space="preserve">собственного хранилища (можно подменить контент после модерации) —</w:t>
+      </w:r>
+      <w:r>
+        <w:t xml:space="preserve"> </w:t>
+      </w:r>
+      <w:r>
+        <w:t xml:space="preserve">требует решения, ограничивать ли строго</w:t>
+      </w:r>
+      <w:r>
+        <w:t xml:space="preserve"> </w:t>
+      </w:r>
+      <w:r>
+        <w:rPr>
+          <w:rStyle w:val="VerbatimChar"/>
+        </w:rPr>
+        <w:t xml:space="preserve">S3_PUBLIC_URL</w:t>
+      </w:r>
+      <w:r>
+        <w:t xml:space="preserve"> </w:t>
+      </w:r>
+      <w:r>
+        <w:t xml:space="preserve">или разрешить</w:t>
+      </w:r>
+      <w:r>
+        <w:t xml:space="preserve"> </w:t>
+      </w:r>
+      <w:r>
+        <w:t xml:space="preserve">внешние ссылки как фичу.</w:t>
+      </w:r>
+      <w:r>
+        <w:t xml:space="preserve"> </w:t>
+      </w:r>
+      <w:r>
+        <w:t xml:space="preserve">-</w:t>
+      </w:r>
+      <w:r>
+        <w:t xml:space="preserve"> </w:t>
+      </w:r>
+      <w:r>
+        <w:rPr>
+          <w:rStyle w:val="VerbatimChar"/>
+        </w:rPr>
+        <w:t xml:space="preserve">accessToken</w:t>
+      </w:r>
+      <w:r>
+        <w:t xml:space="preserve">/</w:t>
+      </w:r>
+      <w:r>
+        <w:rPr>
+          <w:rStyle w:val="VerbatimChar"/>
+        </w:rPr>
+        <w:t xml:space="preserve">refreshToken</w:t>
+      </w:r>
+      <w:r>
+        <w:t xml:space="preserve"> </w:t>
+      </w:r>
+      <w:r>
+        <w:t xml:space="preserve">в</w:t>
+      </w:r>
+      <w:r>
+        <w:t xml:space="preserve"> </w:t>
+      </w:r>
+      <w:r>
+        <w:rPr>
+          <w:rStyle w:val="VerbatimChar"/>
+        </w:rPr>
+        <w:t xml:space="preserve">localStorage</w:t>
+      </w:r>
+      <w:r>
+        <w:t xml:space="preserve"> </w:t>
+      </w:r>
+      <w:r>
+        <w:t xml:space="preserve">вместо</w:t>
+      </w:r>
+      <w:r>
+        <w:t xml:space="preserve"> </w:t>
+      </w:r>
+      <w:r>
+        <w:rPr>
+          <w:rStyle w:val="VerbatimChar"/>
+        </w:rPr>
+        <w:t xml:space="preserve">httpOnly</w:t>
+      </w:r>
+      <w:r>
+        <w:t xml:space="preserve">-cookie —</w:t>
+      </w:r>
+      <w:r>
+        <w:t xml:space="preserve"> </w:t>
+      </w:r>
+      <w:r>
+        <w:t xml:space="preserve">архитектурная правка, требует отдельного захода.</w:t>
+      </w:r>
+      <w:r>
+        <w:t xml:space="preserve"> </w:t>
+      </w:r>
+      <w:r>
+        <w:t xml:space="preserve">- Нет</w:t>
+      </w:r>
+      <w:r>
+        <w:t xml:space="preserve"> </w:t>
+      </w:r>
+      <w:r>
+        <w:rPr>
+          <w:rStyle w:val="VerbatimChar"/>
+        </w:rPr>
+        <w:t xml:space="preserve">helmet</w:t>
+      </w:r>
+      <w:r>
+        <w:t xml:space="preserve">/security headers в backend, нет rate limit на</w:t>
+      </w:r>
+      <w:r>
+        <w:t xml:space="preserve"> </w:t>
+      </w:r>
+      <w:r>
+        <w:rPr>
+          <w:rStyle w:val="VerbatimChar"/>
+        </w:rPr>
+        <w:t xml:space="preserve">/api/auth/refresh</w:t>
+      </w:r>
+      <w:r>
+        <w:t xml:space="preserve">, MinIO service-account с</w:t>
+      </w:r>
+      <w:r>
+        <w:t xml:space="preserve"> </w:t>
+      </w:r>
+      <w:r>
+        <w:rPr>
+          <w:rStyle w:val="VerbatimChar"/>
+        </w:rPr>
+        <w:t xml:space="preserve">readwrite</w:t>
+      </w:r>
+      <w:r>
+        <w:t xml:space="preserve"> </w:t>
+      </w:r>
+      <w:r>
+        <w:t xml:space="preserve">на весь</w:t>
+      </w:r>
+      <w:r>
+        <w:t xml:space="preserve"> </w:t>
+      </w:r>
+      <w:r>
+        <w:t xml:space="preserve">инстанс вместо одного бакета — низкий приоритет, до релиза не блокирует.</w:t>
       </w:r>
     </w:p>
     <w:p>
@@ -2170,13 +2266,28 @@
         <w:pStyle w:val="Compact"/>
       </w:pPr>
       <w:r>
-        <w:t xml:space="preserve">Очистить тестовые данные (услуги вида «Скриншот-тест…», тестовые</w:t>
-      </w:r>
-      <w:r>
-        <w:t xml:space="preserve"> </w:t>
-      </w:r>
-      <w:r>
-        <w:t xml:space="preserve">аккаунты) перед показом реальным пользователям.</w:t>
+        <w:t xml:space="preserve">Написать smoke/e2e-тесты на критичные пути (регистрация, бронирование,</w:t>
+      </w:r>
+      <w:r>
+        <w:t xml:space="preserve"> </w:t>
+      </w:r>
+      <w:r>
+        <w:t xml:space="preserve">оплата, чат) — сейчас в проекте нет тестов, кроме дефолтного</w:t>
+      </w:r>
+      <w:r>
+        <w:t xml:space="preserve"> </w:t>
+      </w:r>
+      <w:r>
+        <w:t xml:space="preserve">Nest-boilerplate (</w:t>
+      </w:r>
+      <w:r>
+        <w:rPr>
+          <w:rStyle w:val="VerbatimChar"/>
+        </w:rPr>
+        <w:t xml:space="preserve">app.controller.spec.ts</w:t>
+      </w:r>
+      <w:r>
+        <w:t xml:space="preserve">).</w:t>
       </w:r>
     </w:p>
     <w:p>
@@ -2188,13 +2299,13 @@
         <w:pStyle w:val="Compact"/>
       </w:pPr>
       <w:r>
-        <w:t xml:space="preserve">Убедиться, что модерация объявлений отработана на реальном потоке</w:t>
-      </w:r>
-      <w:r>
-        <w:t xml:space="preserve"> </w:t>
-      </w:r>
-      <w:r>
-        <w:t xml:space="preserve">(сам механизм уже реализован).</w:t>
+        <w:t xml:space="preserve">Нагрузочное тестирование на целевые 1000+ одновременных пользователей</w:t>
+      </w:r>
+      <w:r>
+        <w:t xml:space="preserve"> </w:t>
+      </w:r>
+      <w:r>
+        <w:t xml:space="preserve">(зафиксировано в tz-amendments п.11).</w:t>
       </w:r>
     </w:p>
     <w:p>
@@ -2206,13 +2317,28 @@
         <w:pStyle w:val="Compact"/>
       </w:pPr>
       <w:r>
-        <w:t xml:space="preserve">Мягкий запуск: ограниченный круг пользователей/один город перед</w:t>
-      </w:r>
-      <w:r>
-        <w:t xml:space="preserve"> </w:t>
-      </w:r>
-      <w:r>
-        <w:t xml:space="preserve">широким анонсом.</w:t>
+        <w:t xml:space="preserve">Security review: OWASP top 10, аудит прав доступа (</w:t>
+      </w:r>
+      <w:r>
+        <w:rPr>
+          <w:rStyle w:val="VerbatimChar"/>
+        </w:rPr>
+        <w:t xml:space="preserve">JwtAuthGuard</w:t>
+      </w:r>
+      <w:r>
+        <w:t xml:space="preserve">,</w:t>
+      </w:r>
+      <w:r>
+        <w:t xml:space="preserve"> </w:t>
+      </w:r>
+      <w:r>
+        <w:t xml:space="preserve">admin-гварды), проверка что секреты не попали в git, что Basic Auth</w:t>
+      </w:r>
+      <w:r>
+        <w:t xml:space="preserve"> </w:t>
+      </w:r>
+      <w:r>
+        <w:t xml:space="preserve">гейт действительно снят.</w:t>
       </w:r>
     </w:p>
     <w:p>
@@ -2224,17 +2350,17 @@
         <w:pStyle w:val="Compact"/>
       </w:pPr>
       <w:r>
-        <w:t xml:space="preserve">План отката: как быстро откатить деплой/миграцию при критичном баге.</w:t>
-      </w:r>
-    </w:p>
-    <w:bookmarkEnd w:id="28"/>
-    <w:bookmarkStart w:id="29" w:name="фаза-7-после-запуска"/>
+        <w:t xml:space="preserve">Ручной регресс по ключевым пользовательским сценариям (чек-лист ниже).</w:t>
+      </w:r>
+    </w:p>
+    <w:bookmarkEnd w:id="27"/>
+    <w:bookmarkStart w:id="28" w:name="фаза-6-контент-и-запуск"/>
     <w:p>
       <w:pPr>
         <w:pStyle w:val="Heading3"/>
       </w:pPr>
       <w:r>
-        <w:t xml:space="preserve">Фаза 7 — После запуска</w:t>
+        <w:t xml:space="preserve">Фаза 6 — Контент и запуск</w:t>
       </w:r>
     </w:p>
     <w:p>
@@ -2246,13 +2372,13 @@
         <w:pStyle w:val="Compact"/>
       </w:pPr>
       <w:r>
-        <w:t xml:space="preserve">Мониторинг первую неделю: ошибки, конверсия регистрация → бронирование</w:t>
-      </w:r>
-      <w:r>
-        <w:t xml:space="preserve"> </w:t>
-      </w:r>
-      <w:r>
-        <w:t xml:space="preserve">→ оплата.</w:t>
+        <w:t xml:space="preserve">Очистить тестовые данные (услуги вида «Скриншот-тест…», тестовые</w:t>
+      </w:r>
+      <w:r>
+        <w:t xml:space="preserve"> </w:t>
+      </w:r>
+      <w:r>
+        <w:t xml:space="preserve">аккаунты) перед показом реальным пользователям.</w:t>
       </w:r>
     </w:p>
     <w:p>
@@ -2264,153 +2390,53 @@
         <w:pStyle w:val="Compact"/>
       </w:pPr>
       <w:r>
-        <w:t xml:space="preserve">Возврат к пост-MVP пунктам из tz-amendments («продуктовые дополнения»:</w:t>
-      </w:r>
-      <w:r>
-        <w:t xml:space="preserve"> </w:t>
-      </w:r>
-      <w:r>
-        <w:t xml:space="preserve">двусторонние отзывы и т.п.) и к остальным пожеланиям из бэклога.</w:t>
-      </w:r>
-    </w:p>
-    <w:p>
-      <w:pPr>
-        <w:pStyle w:val="FirstParagraph"/>
-      </w:pPr>
-      <w:r>
-        <w:rPr>
-          <w:bCs/>
-          <w:b/>
-        </w:rPr>
-        <w:t xml:space="preserve">Готово:</w:t>
-      </w:r>
-      <w:r>
-        <w:t xml:space="preserve"> </w:t>
-      </w:r>
-      <w:r>
-        <w:t xml:space="preserve">канал поддержки пользователей — реализован поверх</w:t>
-      </w:r>
-      <w:r>
-        <w:t xml:space="preserve"> </w:t>
-      </w:r>
-      <w:r>
-        <w:t xml:space="preserve">существующего чата. Один аккаунт помечается флагом</w:t>
-      </w:r>
-      <w:r>
-        <w:t xml:space="preserve"> </w:t>
-      </w:r>
-      <w:r>
-        <w:rPr>
-          <w:rStyle w:val="VerbatimChar"/>
-        </w:rPr>
-        <w:t xml:space="preserve">User.isSupport</w:t>
-      </w:r>
-      <w:r>
-        <w:t xml:space="preserve"> </w:t>
-      </w:r>
-      <w:r>
-        <w:t xml:space="preserve">(сейчас — напрямую в БД, тем же способом, что и</w:t>
-      </w:r>
-      <w:r>
-        <w:t xml:space="preserve"> </w:t>
-      </w:r>
-      <w:r>
-        <w:rPr>
-          <w:rStyle w:val="VerbatimChar"/>
-        </w:rPr>
-        <w:t xml:space="preserve">isAdmin</w:t>
-      </w:r>
-      <w:r>
-        <w:t xml:space="preserve">; отдельной</w:t>
-      </w:r>
-      <w:r>
-        <w:t xml:space="preserve"> </w:t>
-      </w:r>
-      <w:r>
-        <w:t xml:space="preserve">админ-панели управления пользователями в проекте нет). Публичный</w:t>
-      </w:r>
-      <w:r>
-        <w:t xml:space="preserve"> </w:t>
-      </w:r>
-      <w:r>
-        <w:t xml:space="preserve">эндпоинт</w:t>
-      </w:r>
-      <w:r>
-        <w:t xml:space="preserve"> </w:t>
-      </w:r>
-      <w:r>
-        <w:rPr>
-          <w:rStyle w:val="VerbatimChar"/>
-        </w:rPr>
-        <w:t xml:space="preserve">GET /api/support/contact</w:t>
-      </w:r>
-      <w:r>
-        <w:t xml:space="preserve"> </w:t>
-      </w:r>
-      <w:r>
-        <w:t xml:space="preserve">отдаёт его id, плавающий</w:t>
-      </w:r>
-      <w:r>
-        <w:t xml:space="preserve"> </w:t>
-      </w:r>
-      <w:r>
-        <w:t xml:space="preserve">чат-виджет показывает закреплённую строку «Поддержка» сверху списка</w:t>
-      </w:r>
-      <w:r>
-        <w:t xml:space="preserve"> </w:t>
-      </w:r>
-      <w:r>
-        <w:t xml:space="preserve">диалогов — переиспользует уже готовую инфраструктуру чата (WS,</w:t>
-      </w:r>
-      <w:r>
-        <w:t xml:space="preserve"> </w:t>
-      </w:r>
-      <w:r>
-        <w:t xml:space="preserve">REST-фолбэк, бейдж непрочитанных), отдельной системы тикетов не</w:t>
-      </w:r>
-      <w:r>
-        <w:t xml:space="preserve"> </w:t>
-      </w:r>
-      <w:r>
-        <w:t xml:space="preserve">потребовалось. На новом сервере поддержку сейчас ведёт аккаунт</w:t>
-      </w:r>
-      <w:r>
-        <w:t xml:space="preserve"> </w:t>
-      </w:r>
-      <w:r>
-        <w:rPr>
-          <w:rStyle w:val="VerbatimChar"/>
-        </w:rPr>
-        <w:t xml:space="preserve">support@hobbyhub.ru</w:t>
-      </w:r>
-      <w:r>
-        <w:t xml:space="preserve"> </w:t>
-      </w:r>
-      <w:r>
-        <w:t xml:space="preserve">— перед реальным запуском решить, кто и по какому</w:t>
-      </w:r>
-      <w:r>
-        <w:t xml:space="preserve"> </w:t>
-      </w:r>
-      <w:r>
-        <w:t xml:space="preserve">графику на него отвечает (или завести несколько таких аккаунтов, если</w:t>
-      </w:r>
-      <w:r>
-        <w:t xml:space="preserve"> </w:t>
-      </w:r>
-      <w:r>
-        <w:t xml:space="preserve">нагрузка потребует).</w:t>
-      </w:r>
-    </w:p>
-    <w:bookmarkEnd w:id="29"/>
-    <w:bookmarkEnd w:id="30"/>
-    <w:bookmarkStart w:id="31" w:name="Xbed8038e2bfc6adc28336f0e4406830b9b72dd2"/>
-    <w:p>
-      <w:pPr>
-        <w:pStyle w:val="Heading2"/>
-      </w:pPr>
-      <w:r>
-        <w:t xml:space="preserve">3. Чек-лист регресс-тестирования перед запуском (минимум)</w:t>
+        <w:t xml:space="preserve">Убедиться, что модерация объявлений отработана на реальном потоке</w:t>
+      </w:r>
+      <w:r>
+        <w:t xml:space="preserve"> </w:t>
+      </w:r>
+      <w:r>
+        <w:t xml:space="preserve">(сам механизм уже реализован).</w:t>
+      </w:r>
+    </w:p>
+    <w:p>
+      <w:pPr>
+        <w:numPr>
+          <w:ilvl w:val="0"/>
+          <w:numId w:val="1005"/>
+        </w:numPr>
+        <w:pStyle w:val="Compact"/>
+      </w:pPr>
+      <w:r>
+        <w:t xml:space="preserve">Мягкий запуск: ограниченный круг пользователей/один город перед</w:t>
+      </w:r>
+      <w:r>
+        <w:t xml:space="preserve"> </w:t>
+      </w:r>
+      <w:r>
+        <w:t xml:space="preserve">широким анонсом.</w:t>
+      </w:r>
+    </w:p>
+    <w:p>
+      <w:pPr>
+        <w:numPr>
+          <w:ilvl w:val="0"/>
+          <w:numId w:val="1005"/>
+        </w:numPr>
+        <w:pStyle w:val="Compact"/>
+      </w:pPr>
+      <w:r>
+        <w:t xml:space="preserve">План отката: как быстро откатить деплой/миграцию при критичном баге.</w:t>
+      </w:r>
+    </w:p>
+    <w:bookmarkEnd w:id="28"/>
+    <w:bookmarkStart w:id="29" w:name="фаза-7-после-запуска"/>
+    <w:p>
+      <w:pPr>
+        <w:pStyle w:val="Heading3"/>
+      </w:pPr>
+      <w:r>
+        <w:t xml:space="preserve">Фаза 7 — После запуска</w:t>
       </w:r>
     </w:p>
     <w:p>
@@ -2422,13 +2448,13 @@
         <w:pStyle w:val="Compact"/>
       </w:pPr>
       <w:r>
-        <w:t xml:space="preserve">Регистрация покупателя и продавца, подтверждение email, вход, сброс</w:t>
-      </w:r>
-      <w:r>
-        <w:t xml:space="preserve"> </w:t>
-      </w:r>
-      <w:r>
-        <w:t xml:space="preserve">пароля.</w:t>
+        <w:t xml:space="preserve">Мониторинг первую неделю: ошибки, конверсия регистрация → бронирование</w:t>
+      </w:r>
+      <w:r>
+        <w:t xml:space="preserve"> </w:t>
+      </w:r>
+      <w:r>
+        <w:t xml:space="preserve">→ оплата.</w:t>
       </w:r>
     </w:p>
     <w:p>
@@ -2440,110 +2466,286 @@
         <w:pStyle w:val="Compact"/>
       </w:pPr>
       <w:r>
-        <w:t xml:space="preserve">Создание услуги продавцом → прохождение модерации → публикация.</w:t>
+        <w:t xml:space="preserve">Возврат к пост-MVP пунктам из tz-amendments («продуктовые дополнения»:</w:t>
+      </w:r>
+      <w:r>
+        <w:t xml:space="preserve"> </w:t>
+      </w:r>
+      <w:r>
+        <w:t xml:space="preserve">двусторонние отзывы и т.п.) и к остальным пожеланиям из бэклога.</w:t>
+      </w:r>
+    </w:p>
+    <w:p>
+      <w:pPr>
+        <w:pStyle w:val="FirstParagraph"/>
+      </w:pPr>
+      <w:r>
+        <w:rPr>
+          <w:bCs/>
+          <w:b/>
+        </w:rPr>
+        <w:t xml:space="preserve">Готово:</w:t>
+      </w:r>
+      <w:r>
+        <w:t xml:space="preserve"> </w:t>
+      </w:r>
+      <w:r>
+        <w:t xml:space="preserve">канал поддержки пользователей — реализован поверх</w:t>
+      </w:r>
+      <w:r>
+        <w:t xml:space="preserve"> </w:t>
+      </w:r>
+      <w:r>
+        <w:t xml:space="preserve">существующего чата. Один аккаунт помечается флагом</w:t>
+      </w:r>
+      <w:r>
+        <w:t xml:space="preserve"> </w:t>
+      </w:r>
+      <w:r>
+        <w:rPr>
+          <w:rStyle w:val="VerbatimChar"/>
+        </w:rPr>
+        <w:t xml:space="preserve">User.isSupport</w:t>
+      </w:r>
+      <w:r>
+        <w:t xml:space="preserve"> </w:t>
+      </w:r>
+      <w:r>
+        <w:t xml:space="preserve">(сейчас — напрямую в БД, тем же способом, что и</w:t>
+      </w:r>
+      <w:r>
+        <w:t xml:space="preserve"> </w:t>
+      </w:r>
+      <w:r>
+        <w:rPr>
+          <w:rStyle w:val="VerbatimChar"/>
+        </w:rPr>
+        <w:t xml:space="preserve">isAdmin</w:t>
+      </w:r>
+      <w:r>
+        <w:t xml:space="preserve">; отдельной</w:t>
+      </w:r>
+      <w:r>
+        <w:t xml:space="preserve"> </w:t>
+      </w:r>
+      <w:r>
+        <w:t xml:space="preserve">админ-панели управления пользователями в проекте нет). Публичный</w:t>
+      </w:r>
+      <w:r>
+        <w:t xml:space="preserve"> </w:t>
+      </w:r>
+      <w:r>
+        <w:t xml:space="preserve">эндпоинт</w:t>
+      </w:r>
+      <w:r>
+        <w:t xml:space="preserve"> </w:t>
+      </w:r>
+      <w:r>
+        <w:rPr>
+          <w:rStyle w:val="VerbatimChar"/>
+        </w:rPr>
+        <w:t xml:space="preserve">GET /api/support/contact</w:t>
+      </w:r>
+      <w:r>
+        <w:t xml:space="preserve"> </w:t>
+      </w:r>
+      <w:r>
+        <w:t xml:space="preserve">отдаёт его id, плавающий</w:t>
+      </w:r>
+      <w:r>
+        <w:t xml:space="preserve"> </w:t>
+      </w:r>
+      <w:r>
+        <w:t xml:space="preserve">чат-виджет показывает закреплённую строку «Поддержка» сверху списка</w:t>
+      </w:r>
+      <w:r>
+        <w:t xml:space="preserve"> </w:t>
+      </w:r>
+      <w:r>
+        <w:t xml:space="preserve">диалогов — переиспользует уже готовую инфраструктуру чата (WS,</w:t>
+      </w:r>
+      <w:r>
+        <w:t xml:space="preserve"> </w:t>
+      </w:r>
+      <w:r>
+        <w:t xml:space="preserve">REST-фолбэк, бейдж непрочитанных), отдельной системы тикетов не</w:t>
+      </w:r>
+      <w:r>
+        <w:t xml:space="preserve"> </w:t>
+      </w:r>
+      <w:r>
+        <w:t xml:space="preserve">потребовалось. На новом сервере поддержку сейчас ведёт аккаунт</w:t>
+      </w:r>
+      <w:r>
+        <w:t xml:space="preserve"> </w:t>
+      </w:r>
+      <w:r>
+        <w:rPr>
+          <w:rStyle w:val="VerbatimChar"/>
+        </w:rPr>
+        <w:t xml:space="preserve">support@hobbyhub.ru</w:t>
+      </w:r>
+      <w:r>
+        <w:t xml:space="preserve"> </w:t>
+      </w:r>
+      <w:r>
+        <w:t xml:space="preserve">— перед реальным запуском решить, кто и по какому</w:t>
+      </w:r>
+      <w:r>
+        <w:t xml:space="preserve"> </w:t>
+      </w:r>
+      <w:r>
+        <w:t xml:space="preserve">графику на него отвечает (или завести несколько таких аккаунтов, если</w:t>
+      </w:r>
+      <w:r>
+        <w:t xml:space="preserve"> </w:t>
+      </w:r>
+      <w:r>
+        <w:t xml:space="preserve">нагрузка потребует).</w:t>
+      </w:r>
+    </w:p>
+    <w:bookmarkEnd w:id="29"/>
+    <w:bookmarkEnd w:id="30"/>
+    <w:bookmarkStart w:id="31" w:name="Xbed8038e2bfc6adc28336f0e4406830b9b72dd2"/>
+    <w:p>
+      <w:pPr>
+        <w:pStyle w:val="Heading2"/>
+      </w:pPr>
+      <w:r>
+        <w:t xml:space="preserve">3. Чек-лист регресс-тестирования перед запуском (минимум)</w:t>
       </w:r>
     </w:p>
     <w:p>
       <w:pPr>
         <w:numPr>
           <w:ilvl w:val="0"/>
-          <w:numId w:val="1006"/>
+          <w:numId w:val="1007"/>
         </w:numPr>
         <w:pStyle w:val="Compact"/>
       </w:pPr>
       <w:r>
-        <w:t xml:space="preserve">Поиск/фильтрация в каталоге, просмотр на карте.</w:t>
+        <w:t xml:space="preserve">Регистрация покупателя и продавца, подтверждение email, вход, сброс</w:t>
+      </w:r>
+      <w:r>
+        <w:t xml:space="preserve"> </w:t>
+      </w:r>
+      <w:r>
+        <w:t xml:space="preserve">пароля.</w:t>
       </w:r>
     </w:p>
     <w:p>
       <w:pPr>
         <w:numPr>
           <w:ilvl w:val="0"/>
-          <w:numId w:val="1006"/>
+          <w:numId w:val="1007"/>
         </w:numPr>
         <w:pStyle w:val="Compact"/>
       </w:pPr>
       <w:r>
-        <w:t xml:space="preserve">Бронирование по слотам (включая групповую вместимость) и по запросу.</w:t>
+        <w:t xml:space="preserve">Создание услуги продавцом → прохождение модерации → публикация.</w:t>
       </w:r>
     </w:p>
     <w:p>
       <w:pPr>
         <w:numPr>
           <w:ilvl w:val="0"/>
-          <w:numId w:val="1006"/>
+          <w:numId w:val="1007"/>
         </w:numPr>
         <w:pStyle w:val="Compact"/>
       </w:pPr>
       <w:r>
-        <w:t xml:space="preserve">Полный цикл оплаты: холдирование → подтверждение продавцом →</w:t>
-      </w:r>
-      <w:r>
-        <w:t xml:space="preserve"> </w:t>
-      </w:r>
-      <w:r>
-        <w:t xml:space="preserve">освобождение эскроу → чек покупателю.</w:t>
+        <w:t xml:space="preserve">Поиск/фильтрация в каталоге, просмотр на карте.</w:t>
       </w:r>
     </w:p>
     <w:p>
       <w:pPr>
         <w:numPr>
           <w:ilvl w:val="0"/>
-          <w:numId w:val="1006"/>
+          <w:numId w:val="1007"/>
         </w:numPr>
         <w:pStyle w:val="Compact"/>
       </w:pPr>
       <w:r>
-        <w:t xml:space="preserve">Отмена брони, спор, разрешение спора администратором.</w:t>
+        <w:t xml:space="preserve">Бронирование по слотам (включая групповую вместимость) и по запросу.</w:t>
       </w:r>
     </w:p>
     <w:p>
       <w:pPr>
         <w:numPr>
           <w:ilvl w:val="0"/>
-          <w:numId w:val="1006"/>
+          <w:numId w:val="1007"/>
         </w:numPr>
         <w:pStyle w:val="Compact"/>
       </w:pPr>
       <w:r>
-        <w:t xml:space="preserve">Чат: сообщения, жалоба на сообщение, плавающий виджет и полная</w:t>
-      </w:r>
-      <w:r>
-        <w:t xml:space="preserve"> </w:t>
-      </w:r>
-      <w:r>
-        <w:t xml:space="preserve">страница.</w:t>
+        <w:t xml:space="preserve">Полный цикл оплаты: холдирование → подтверждение продавцом →</w:t>
+      </w:r>
+      <w:r>
+        <w:t xml:space="preserve"> </w:t>
+      </w:r>
+      <w:r>
+        <w:t xml:space="preserve">освобождение эскроу → чек покупателю.</w:t>
       </w:r>
     </w:p>
     <w:p>
       <w:pPr>
         <w:numPr>
           <w:ilvl w:val="0"/>
-          <w:numId w:val="1006"/>
+          <w:numId w:val="1007"/>
         </w:numPr>
         <w:pStyle w:val="Compact"/>
       </w:pPr>
       <w:r>
-        <w:t xml:space="preserve">Отзыв после завершения заказа, ответ продавца на отзыв.</w:t>
+        <w:t xml:space="preserve">Отмена брони, спор, разрешение спора администратором.</w:t>
       </w:r>
     </w:p>
     <w:p>
       <w:pPr>
         <w:numPr>
           <w:ilvl w:val="0"/>
-          <w:numId w:val="1006"/>
+          <w:numId w:val="1007"/>
         </w:numPr>
         <w:pStyle w:val="Compact"/>
       </w:pPr>
       <w:r>
-        <w:t xml:space="preserve">Избранное: добавление, счётчик у продавца.</w:t>
+        <w:t xml:space="preserve">Чат: сообщения, жалоба на сообщение, плавающий виджет и полная</w:t>
+      </w:r>
+      <w:r>
+        <w:t xml:space="preserve"> </w:t>
+      </w:r>
+      <w:r>
+        <w:t xml:space="preserve">страница.</w:t>
       </w:r>
     </w:p>
     <w:p>
       <w:pPr>
         <w:numPr>
           <w:ilvl w:val="0"/>
-          <w:numId w:val="1006"/>
+          <w:numId w:val="1007"/>
+        </w:numPr>
+        <w:pStyle w:val="Compact"/>
+      </w:pPr>
+      <w:r>
+        <w:t xml:space="preserve">Отзыв после завершения заказа, ответ продавца на отзыв.</w:t>
+      </w:r>
+    </w:p>
+    <w:p>
+      <w:pPr>
+        <w:numPr>
+          <w:ilvl w:val="0"/>
+          <w:numId w:val="1007"/>
+        </w:numPr>
+        <w:pStyle w:val="Compact"/>
+      </w:pPr>
+      <w:r>
+        <w:t xml:space="preserve">Избранное: добавление, счётчик у продавца.</w:t>
+      </w:r>
+    </w:p>
+    <w:p>
+      <w:pPr>
+        <w:numPr>
+          <w:ilvl w:val="0"/>
+          <w:numId w:val="1007"/>
         </w:numPr>
         <w:pStyle w:val="Compact"/>
       </w:pPr>
@@ -2796,6 +2998,9 @@
     <w:abstractNumId w:val="991"/>
   </w:num>
   <w:num w:numId="1006">
+    <w:abstractNumId w:val="991"/>
+  </w:num>
+  <w:num w:numId="1007">
     <w:abstractNumId w:val="991"/>
   </w:num>
 </w:numbering>

</xml_diff>

<commit_message>
Update release plan: real email delivery done
</commit_message>
<xml_diff>
--- a/docs/release-plan.docx
+++ b/docs/release-plan.docx
@@ -1465,22 +1465,886 @@
         <w:pStyle w:val="FirstParagraph"/>
       </w:pPr>
       <w:r>
-        <w:t xml:space="preserve">Ранее откладывали до появления домена (SPF/DKIM/DMARC не настроить без</w:t>
-      </w:r>
-      <w:r>
-        <w:t xml:space="preserve"> </w:t>
-      </w:r>
-      <w:r>
-        <w:t xml:space="preserve">него) — теперь домен есть (</w:t>
-      </w:r>
-      <w:r>
-        <w:rPr>
-          <w:rStyle w:val="VerbatimChar"/>
-        </w:rPr>
-        <w:t xml:space="preserve">hobbyhub.ru</w:t>
-      </w:r>
-      <w:r>
-        <w:t xml:space="preserve">), блокер снят, можно начинать.</w:t>
+        <w:rPr>
+          <w:bCs/>
+          <w:b/>
+        </w:rPr>
+        <w:t xml:space="preserve">Готово (2026-08-28):</w:t>
+      </w:r>
+      <w:r>
+        <w:t xml:space="preserve"> </w:t>
+      </w:r>
+      <w:r>
+        <w:rPr>
+          <w:rStyle w:val="VerbatimChar"/>
+        </w:rPr>
+        <w:t xml:space="preserve">mail.service.ts</w:t>
+      </w:r>
+      <w:r>
+        <w:t xml:space="preserve"> </w:t>
+      </w:r>
+      <w:r>
+        <w:t xml:space="preserve">переписан на реальную отправку</w:t>
+      </w:r>
+      <w:r>
+        <w:t xml:space="preserve"> </w:t>
+      </w:r>
+      <w:r>
+        <w:t xml:space="preserve">через SMTP (nodemailer), почтовый ящик</w:t>
+      </w:r>
+      <w:r>
+        <w:t xml:space="preserve"> </w:t>
+      </w:r>
+      <w:r>
+        <w:rPr>
+          <w:rStyle w:val="VerbatimChar"/>
+        </w:rPr>
+        <w:t xml:space="preserve">support@hobbyhub.ru</w:t>
+      </w:r>
+      <w:r>
+        <w:t xml:space="preserve"> </w:t>
+      </w:r>
+      <w:r>
+        <w:t xml:space="preserve">заведён в</w:t>
+      </w:r>
+      <w:r>
+        <w:t xml:space="preserve"> </w:t>
+      </w:r>
+      <w:r>
+        <w:t xml:space="preserve">Timeweb (DKIM у Timeweb настраивается автоматически при делегировании</w:t>
+      </w:r>
+      <w:r>
+        <w:t xml:space="preserve"> </w:t>
+      </w:r>
+      <w:r>
+        <w:t xml:space="preserve">NS на Timeweb — уже так и есть). Заодно обнаружилось и закрыто: у</w:t>
+      </w:r>
+      <w:r>
+        <w:t xml:space="preserve"> </w:t>
+      </w:r>
+      <w:r>
+        <w:t xml:space="preserve">бэкенда были рабочие эндпоинты</w:t>
+      </w:r>
+      <w:r>
+        <w:t xml:space="preserve"> </w:t>
+      </w:r>
+      <w:r>
+        <w:rPr>
+          <w:rStyle w:val="VerbatimChar"/>
+        </w:rPr>
+        <w:t xml:space="preserve">forgot-password</w:t>
+      </w:r>
+      <w:r>
+        <w:t xml:space="preserve">/</w:t>
+      </w:r>
+      <w:r>
+        <w:rPr>
+          <w:rStyle w:val="VerbatimChar"/>
+        </w:rPr>
+        <w:t xml:space="preserve">reset-password</w:t>
+      </w:r>
+      <w:r>
+        <w:t xml:space="preserve">/</w:t>
+      </w:r>
+      <w:r>
+        <w:t xml:space="preserve"> </w:t>
+      </w:r>
+      <w:r>
+        <w:rPr>
+          <w:rStyle w:val="VerbatimChar"/>
+        </w:rPr>
+        <w:t xml:space="preserve">verify-email</w:t>
+      </w:r>
+      <w:r>
+        <w:t xml:space="preserve">, но на фронтенде не было ни одной страницы под них —</w:t>
+      </w:r>
+      <w:r>
+        <w:t xml:space="preserve"> </w:t>
+      </w:r>
+      <w:r>
+        <w:t xml:space="preserve">письма со ссылками вели бы в никуда. Добавлены страницы</w:t>
+      </w:r>
+      <w:r>
+        <w:t xml:space="preserve"> </w:t>
+      </w:r>
+      <w:r>
+        <w:rPr>
+          <w:rStyle w:val="VerbatimChar"/>
+        </w:rPr>
+        <w:t xml:space="preserve">/forgot-password</w:t>
+      </w:r>
+      <w:r>
+        <w:t xml:space="preserve">,</w:t>
+      </w:r>
+      <w:r>
+        <w:t xml:space="preserve"> </w:t>
+      </w:r>
+      <w:r>
+        <w:rPr>
+          <w:rStyle w:val="VerbatimChar"/>
+        </w:rPr>
+        <w:t xml:space="preserve">/reset-password</w:t>
+      </w:r>
+      <w:r>
+        <w:t xml:space="preserve">,</w:t>
+      </w:r>
+      <w:r>
+        <w:t xml:space="preserve"> </w:t>
+      </w:r>
+      <w:r>
+        <w:rPr>
+          <w:rStyle w:val="VerbatimChar"/>
+        </w:rPr>
+        <w:t xml:space="preserve">/verify-email</w:t>
+      </w:r>
+      <w:r>
+        <w:t xml:space="preserve"> </w:t>
+      </w:r>
+      <w:r>
+        <w:t xml:space="preserve">+ ссылка «Забыли</w:t>
+      </w:r>
+      <w:r>
+        <w:t xml:space="preserve"> </w:t>
+      </w:r>
+      <w:r>
+        <w:t xml:space="preserve">пароль?» на странице входа.</w:t>
+      </w:r>
+    </w:p>
+    <w:p>
+      <w:pPr>
+        <w:pStyle w:val="BodyText"/>
+      </w:pPr>
+      <w:r>
+        <w:t xml:space="preserve">Осталось:</w:t>
+      </w:r>
+      <w:r>
+        <w:t xml:space="preserve"> </w:t>
+      </w:r>
+      <w:r>
+        <w:t xml:space="preserve">- На сервере в</w:t>
+      </w:r>
+      <w:r>
+        <w:t xml:space="preserve"> </w:t>
+      </w:r>
+      <w:r>
+        <w:rPr>
+          <w:rStyle w:val="VerbatimChar"/>
+        </w:rPr>
+        <w:t xml:space="preserve">backend/.env</w:t>
+      </w:r>
+      <w:r>
+        <w:t xml:space="preserve"> </w:t>
+      </w:r>
+      <w:r>
+        <w:t xml:space="preserve">прописать</w:t>
+      </w:r>
+      <w:r>
+        <w:t xml:space="preserve"> </w:t>
+      </w:r>
+      <w:r>
+        <w:rPr>
+          <w:rStyle w:val="VerbatimChar"/>
+        </w:rPr>
+        <w:t xml:space="preserve">SMTP_PASSWORD</w:t>
+      </w:r>
+      <w:r>
+        <w:t xml:space="preserve"> </w:t>
+      </w:r>
+      <w:r>
+        <w:t xml:space="preserve">от ящика</w:t>
+      </w:r>
+      <w:r>
+        <w:t xml:space="preserve"> </w:t>
+      </w:r>
+      <w:r>
+        <w:rPr>
+          <w:rStyle w:val="VerbatimChar"/>
+        </w:rPr>
+        <w:t xml:space="preserve">support@hobbyhub.ru</w:t>
+      </w:r>
+      <w:r>
+        <w:t xml:space="preserve"> </w:t>
+      </w:r>
+      <w:r>
+        <w:t xml:space="preserve">(пароль приложения/SMTP, не обычный пароль веб-почты,</w:t>
+      </w:r>
+      <w:r>
+        <w:t xml:space="preserve"> </w:t>
+      </w:r>
+      <w:r>
+        <w:t xml:space="preserve">если Timeweb их разделяет — проверить в панели) и передеплоить.</w:t>
+      </w:r>
+      <w:r>
+        <w:t xml:space="preserve"> </w:t>
+      </w:r>
+      <w:r>
+        <w:t xml:space="preserve">- Проверить SPF (Timeweb требует конкретную запись — см. их документацию</w:t>
+      </w:r>
+      <w:r>
+        <w:t xml:space="preserve"> </w:t>
+      </w:r>
+      <w:r>
+        <w:t xml:space="preserve">по DKIM/SPF) и DMARC — иначе письма будут попадать в спам даже при</w:t>
+      </w:r>
+      <w:r>
+        <w:t xml:space="preserve"> </w:t>
+      </w:r>
+      <w:r>
+        <w:t xml:space="preserve">рабочем SMTP.</w:t>
+      </w:r>
+      <w:r>
+        <w:t xml:space="preserve"> </w:t>
+      </w:r>
+      <w:r>
+        <w:t xml:space="preserve">- Прогнать реальный тест: регистрация → письмо пришло → ссылка работает</w:t>
+      </w:r>
+      <w:r>
+        <w:t xml:space="preserve"> </w:t>
+      </w:r>
+      <w:r>
+        <w:t xml:space="preserve">→ email подтверждён; то же для сброса пароля.</w:t>
+      </w:r>
+    </w:p>
+    <w:bookmarkEnd w:id="25"/>
+    <w:bookmarkStart w:id="26" w:name="фаза-4-реальные-платежи"/>
+    <w:p>
+      <w:pPr>
+        <w:pStyle w:val="Heading3"/>
+      </w:pPr>
+      <w:r>
+        <w:t xml:space="preserve">Фаза 4 — Реальные платежи</w:t>
+      </w:r>
+    </w:p>
+    <w:p>
+      <w:pPr>
+        <w:pStyle w:val="FirstParagraph"/>
+      </w:pPr>
+      <w:r>
+        <w:t xml:space="preserve">Возможна только после Фазы 0. До этой фазы бронирование скрыто флагом</w:t>
+      </w:r>
+      <w:r>
+        <w:t xml:space="preserve"> </w:t>
+      </w:r>
+      <w:r>
+        <w:rPr>
+          <w:rStyle w:val="VerbatimChar"/>
+        </w:rPr>
+        <w:t xml:space="preserve">ORDERS_DISABLED</w:t>
+      </w:r>
+      <w:r>
+        <w:t xml:space="preserve"> </w:t>
+      </w:r>
+      <w:r>
+        <w:t xml:space="preserve">(backend</w:t>
+      </w:r>
+      <w:r>
+        <w:t xml:space="preserve"> </w:t>
+      </w:r>
+      <w:r>
+        <w:rPr>
+          <w:rStyle w:val="VerbatimChar"/>
+        </w:rPr>
+        <w:t xml:space="preserve">.env</w:t>
+      </w:r>
+      <w:r>
+        <w:t xml:space="preserve">) /</w:t>
+      </w:r>
+      <w:r>
+        <w:t xml:space="preserve"> </w:t>
+      </w:r>
+      <w:r>
+        <w:rPr>
+          <w:rStyle w:val="VerbatimChar"/>
+        </w:rPr>
+        <w:t xml:space="preserve">NEXT_PUBLIC_ORDERS_DISABLED</w:t>
+      </w:r>
+      <w:r>
+        <w:t xml:space="preserve"> </w:t>
+      </w:r>
+      <w:r>
+        <w:t xml:space="preserve">(frontend</w:t>
+      </w:r>
+      <w:r>
+        <w:t xml:space="preserve"> </w:t>
+      </w:r>
+      <w:r>
+        <w:rPr>
+          <w:rStyle w:val="VerbatimChar"/>
+        </w:rPr>
+        <w:t xml:space="preserve">.env.local</w:t>
+      </w:r>
+      <w:r>
+        <w:t xml:space="preserve">) — сайт открыт для просмотра/регистрации, но</w:t>
+      </w:r>
+      <w:r>
+        <w:t xml:space="preserve"> </w:t>
+      </w:r>
+      <w:r>
+        <w:t xml:space="preserve">попытка оформить бронь показывает «сайт в разработке». Снимается без</w:t>
+      </w:r>
+      <w:r>
+        <w:t xml:space="preserve"> </w:t>
+      </w:r>
+      <w:r>
+        <w:t xml:space="preserve">правок кода — убрать обе переменные и передеплоить.</w:t>
+      </w:r>
+      <w:r>
+        <w:t xml:space="preserve"> </w:t>
+      </w:r>
+      <w:r>
+        <w:t xml:space="preserve">- Реализовать реальный класс</w:t>
+      </w:r>
+      <w:r>
+        <w:t xml:space="preserve"> </w:t>
+      </w:r>
+      <w:r>
+        <w:rPr>
+          <w:rStyle w:val="VerbatimChar"/>
+        </w:rPr>
+        <w:t xml:space="preserve">PaymentProvider</w:t>
+      </w:r>
+      <w:r>
+        <w:t xml:space="preserve"> </w:t>
+      </w:r>
+      <w:r>
+        <w:t xml:space="preserve">вместо</w:t>
+      </w:r>
+      <w:r>
+        <w:t xml:space="preserve"> </w:t>
+      </w:r>
+      <w:r>
+        <w:rPr>
+          <w:rStyle w:val="VerbatimChar"/>
+        </w:rPr>
+        <w:t xml:space="preserve">MockYookassaProvider</w:t>
+      </w:r>
+      <w:r>
+        <w:t xml:space="preserve"> </w:t>
+      </w:r>
+      <w:r>
+        <w:t xml:space="preserve">— архитектурно уже готово (весь остальной код</w:t>
+      </w:r>
+      <w:r>
+        <w:t xml:space="preserve"> </w:t>
+      </w:r>
+      <w:r>
+        <w:t xml:space="preserve">работает через интерфейс, подстановка класса под токеном</w:t>
+      </w:r>
+      <w:r>
+        <w:t xml:space="preserve"> </w:t>
+      </w:r>
+      <w:r>
+        <w:rPr>
+          <w:rStyle w:val="VerbatimChar"/>
+        </w:rPr>
+        <w:t xml:space="preserve">PAYMENT_PROVIDER</w:t>
+      </w:r>
+      <w:r>
+        <w:t xml:space="preserve"> </w:t>
+      </w:r>
+      <w:r>
+        <w:t xml:space="preserve">не требует правок в бронированиях/эскроу-логике).</w:t>
+      </w:r>
+      <w:r>
+        <w:t xml:space="preserve"> </w:t>
+      </w:r>
+      <w:r>
+        <w:t xml:space="preserve">- Реализовать флоу верификации продавца перед первой выплатой (поле</w:t>
+      </w:r>
+      <w:r>
+        <w:t xml:space="preserve"> </w:t>
+      </w:r>
+      <w:r>
+        <w:rPr>
+          <w:rStyle w:val="VerbatimChar"/>
+        </w:rPr>
+        <w:t xml:space="preserve">isSellerVerified</w:t>
+      </w:r>
+      <w:r>
+        <w:t xml:space="preserve"> </w:t>
+      </w:r>
+      <w:r>
+        <w:t xml:space="preserve">в модели уже есть, самого KYC-процесса — нет).</w:t>
+      </w:r>
+      <w:r>
+        <w:t xml:space="preserve"> </w:t>
+      </w:r>
+      <w:r>
+        <w:t xml:space="preserve">- Прогнать сквозной тест реальных платежей в sandbox-режиме провайдера</w:t>
+      </w:r>
+      <w:r>
+        <w:t xml:space="preserve"> </w:t>
+      </w:r>
+      <w:r>
+        <w:t xml:space="preserve">перед боевым переключением.</w:t>
+      </w:r>
+    </w:p>
+    <w:bookmarkEnd w:id="26"/>
+    <w:bookmarkStart w:id="27" w:name="фаза-5-тестирование-и-безопасность"/>
+    <w:p>
+      <w:pPr>
+        <w:pStyle w:val="Heading3"/>
+      </w:pPr>
+      <w:r>
+        <w:t xml:space="preserve">Фаза 5 — Тестирование и безопасность</w:t>
+      </w:r>
+    </w:p>
+    <w:p>
+      <w:pPr>
+        <w:pStyle w:val="FirstParagraph"/>
+      </w:pPr>
+      <w:r>
+        <w:rPr>
+          <w:bCs/>
+          <w:b/>
+        </w:rPr>
+        <w:t xml:space="preserve">Готово (2026-08-27):</w:t>
+      </w:r>
+      <w:r>
+        <w:t xml:space="preserve"> </w:t>
+      </w:r>
+      <w:r>
+        <w:t xml:space="preserve">полный аудит безопасности перед релизом (auth/authz,</w:t>
+      </w:r>
+      <w:r>
+        <w:t xml:space="preserve"> </w:t>
+      </w:r>
+      <w:r>
+        <w:t xml:space="preserve">инъекции, загрузка файлов, секреты, CORS, rate limiting, эскроу-логика,</w:t>
+      </w:r>
+      <w:r>
+        <w:t xml:space="preserve"> </w:t>
+      </w:r>
+      <w:r>
+        <w:t xml:space="preserve">админка, зависимости). Найденное и исправленное:</w:t>
+      </w:r>
+      <w:r>
+        <w:t xml:space="preserve"> </w:t>
+      </w:r>
+      <w:r>
+        <w:t xml:space="preserve">- Basic Auth гейт обходился подделкой</w:t>
+      </w:r>
+      <w:r>
+        <w:t xml:space="preserve"> </w:t>
+      </w:r>
+      <w:r>
+        <w:rPr>
+          <w:rStyle w:val="VerbatimChar"/>
+        </w:rPr>
+        <w:t xml:space="preserve">Authorization: Bearer x</w:t>
+      </w:r>
+      <w:r>
+        <w:t xml:space="preserve"> </w:t>
+      </w:r>
+      <w:r>
+        <w:t xml:space="preserve">— гейт</w:t>
+      </w:r>
+      <w:r>
+        <w:t xml:space="preserve"> </w:t>
+      </w:r>
+      <w:r>
+        <w:t xml:space="preserve">снят полностью (см. блокер №4 выше).</w:t>
+      </w:r>
+      <w:r>
+        <w:t xml:space="preserve"> </w:t>
+      </w:r>
+      <w:r>
+        <w:t xml:space="preserve">- Токены сброса пароля/подтверждения email писались в лог в открытом виде</w:t>
+      </w:r>
+      <w:r>
+        <w:t xml:space="preserve"> </w:t>
+      </w:r>
+      <w:r>
+        <w:t xml:space="preserve">в проде — теперь логируются только вне</w:t>
+      </w:r>
+      <w:r>
+        <w:t xml:space="preserve"> </w:t>
+      </w:r>
+      <w:r>
+        <w:rPr>
+          <w:rStyle w:val="VerbatimChar"/>
+        </w:rPr>
+        <w:t xml:space="preserve">NODE_ENV=production</w:t>
+      </w:r>
+      <w:r>
+        <w:t xml:space="preserve"> </w:t>
+      </w:r>
+      <w:r>
+        <w:t xml:space="preserve">(</w:t>
+      </w:r>
+      <w:r>
+        <w:rPr>
+          <w:rStyle w:val="VerbatimChar"/>
+        </w:rPr>
+        <w:t xml:space="preserve">backend/src/mail/mail.service.ts</w:t>
+      </w:r>
+      <w:r>
+        <w:t xml:space="preserve">); сама отправка писем по-прежнему</w:t>
+      </w:r>
+      <w:r>
+        <w:t xml:space="preserve"> </w:t>
+      </w:r>
+      <w:r>
+        <w:t xml:space="preserve">не реализована (см. Фазу 3).</w:t>
+      </w:r>
+      <w:r>
+        <w:t xml:space="preserve"> </w:t>
+      </w:r>
+      <w:r>
+        <w:t xml:space="preserve">- WebSocket</w:t>
+      </w:r>
+      <w:r>
+        <w:t xml:space="preserve"> </w:t>
+      </w:r>
+      <w:r>
+        <w:rPr>
+          <w:rStyle w:val="VerbatimChar"/>
+        </w:rPr>
+        <w:t xml:space="preserve">chat:join</w:t>
+      </w:r>
+      <w:r>
+        <w:t xml:space="preserve"> </w:t>
+      </w:r>
+      <w:r>
+        <w:t xml:space="preserve">пускал в комнату любого чата без проверки, что</w:t>
+      </w:r>
+      <w:r>
+        <w:t xml:space="preserve"> </w:t>
+      </w:r>
+      <w:r>
+        <w:t xml:space="preserve">пользователь — участник (можно было слушать чужую переписку по</w:t>
+      </w:r>
+      <w:r>
+        <w:t xml:space="preserve"> </w:t>
+      </w:r>
+      <w:r>
+        <w:t xml:space="preserve">известному chatId) — добавлена проверка через</w:t>
+      </w:r>
+      <w:r>
+        <w:t xml:space="preserve"> </w:t>
+      </w:r>
+      <w:r>
+        <w:rPr>
+          <w:rStyle w:val="VerbatimChar"/>
+        </w:rPr>
+        <w:t xml:space="preserve">getChatForParticipant</w:t>
+      </w:r>
+      <w:r>
+        <w:t xml:space="preserve"> </w:t>
+      </w:r>
+      <w:r>
+        <w:t xml:space="preserve">(</w:t>
+      </w:r>
+      <w:r>
+        <w:rPr>
+          <w:rStyle w:val="VerbatimChar"/>
+        </w:rPr>
+        <w:t xml:space="preserve">backend/src/chats/chats.gateway.ts</w:t>
+      </w:r>
+      <w:r>
+        <w:t xml:space="preserve">).</w:t>
+      </w:r>
+      <w:r>
+        <w:t xml:space="preserve"> </w:t>
+      </w:r>
+      <w:r>
+        <w:t xml:space="preserve">- Presigned upload в MinIO принимал</w:t>
+      </w:r>
+      <w:r>
+        <w:t xml:space="preserve"> </w:t>
+      </w:r>
+      <w:r>
+        <w:rPr>
+          <w:rStyle w:val="VerbatimChar"/>
+        </w:rPr>
+        <w:t xml:space="preserve">Content-Type</w:t>
+      </w:r>
+      <w:r>
+        <w:t xml:space="preserve"> </w:t>
+      </w:r>
+      <w:r>
+        <w:t xml:space="preserve">по префиксу</w:t>
+      </w:r>
+      <w:r>
+        <w:t xml:space="preserve"> </w:t>
+      </w:r>
+      <w:r>
+        <w:rPr>
+          <w:rStyle w:val="VerbatimChar"/>
+        </w:rPr>
+        <w:t xml:space="preserve">image/</w:t>
+      </w:r>
+      <w:r>
+        <w:t xml:space="preserve"> </w:t>
+      </w:r>
+      <w:r>
+        <w:t xml:space="preserve">(пропускал</w:t>
+      </w:r>
+      <w:r>
+        <w:t xml:space="preserve"> </w:t>
+      </w:r>
+      <w:r>
+        <w:rPr>
+          <w:rStyle w:val="VerbatimChar"/>
+        </w:rPr>
+        <w:t xml:space="preserve">image/svg+xml</w:t>
+      </w:r>
+      <w:r>
+        <w:t xml:space="preserve"> </w:t>
+      </w:r>
+      <w:r>
+        <w:t xml:space="preserve">— потенциальный stored XSS) — заменено на</w:t>
+      </w:r>
+      <w:r>
+        <w:t xml:space="preserve"> </w:t>
+      </w:r>
+      <w:r>
+        <w:t xml:space="preserve">точное совпадение (</w:t>
+      </w:r>
+      <w:r>
+        <w:rPr>
+          <w:rStyle w:val="VerbatimChar"/>
+        </w:rPr>
+        <w:t xml:space="preserve">backend/src/uploads/uploads.service.ts</w:t>
+      </w:r>
+      <w:r>
+        <w:t xml:space="preserve">).</w:t>
+      </w:r>
+      <w:r>
+        <w:t xml:space="preserve"> </w:t>
+      </w:r>
+      <w:r>
+        <w:t xml:space="preserve">-</w:t>
+      </w:r>
+      <w:r>
+        <w:t xml:space="preserve"> </w:t>
+      </w:r>
+      <w:r>
+        <w:rPr>
+          <w:rStyle w:val="VerbatimChar"/>
+        </w:rPr>
+        <w:t xml:space="preserve">fixedAmount</w:t>
+      </w:r>
+      <w:r>
+        <w:t xml:space="preserve"> </w:t>
+      </w:r>
+      <w:r>
+        <w:t xml:space="preserve">при подтверждении брони с договорной ценой не проверялся</w:t>
+      </w:r>
+      <w:r>
+        <w:t xml:space="preserve"> </w:t>
+      </w:r>
+      <w:r>
+        <w:t xml:space="preserve">на положительность — добавлена валидация</w:t>
+      </w:r>
+      <w:r>
+        <w:t xml:space="preserve"> </w:t>
+      </w:r>
+      <w:r>
+        <w:t xml:space="preserve">(</w:t>
+      </w:r>
+      <w:r>
+        <w:rPr>
+          <w:rStyle w:val="VerbatimChar"/>
+        </w:rPr>
+        <w:t xml:space="preserve">backend/src/bookings/dto/confirm-booking.dto.ts</w:t>
+      </w:r>
+      <w:r>
+        <w:t xml:space="preserve">).</w:t>
+      </w:r>
+      <w:r>
+        <w:t xml:space="preserve"> </w:t>
+      </w:r>
+      <w:r>
+        <w:t xml:space="preserve">-</w:t>
+      </w:r>
+      <w:r>
+        <w:t xml:space="preserve"> </w:t>
+      </w:r>
+      <w:r>
+        <w:rPr>
+          <w:rStyle w:val="VerbatimChar"/>
+        </w:rPr>
+        <w:t xml:space="preserve">npm audit</w:t>
+      </w:r>
+      <w:r>
+        <w:t xml:space="preserve"> </w:t>
+      </w:r>
+      <w:r>
+        <w:t xml:space="preserve">(backend и frontend) — 0 уязвимостей после</w:t>
+      </w:r>
+      <w:r>
+        <w:t xml:space="preserve"> </w:t>
+      </w:r>
+      <w:r>
+        <w:rPr>
+          <w:rStyle w:val="VerbatimChar"/>
+        </w:rPr>
+        <w:t xml:space="preserve">npm audit fix</w:t>
+      </w:r>
+      <w:r>
+        <w:t xml:space="preserve">.</w:t>
+      </w:r>
+    </w:p>
+    <w:p>
+      <w:pPr>
+        <w:pStyle w:val="BodyText"/>
+      </w:pPr>
+      <w:r>
+        <w:t xml:space="preserve">Не исправлено, осознанно отложено:</w:t>
+      </w:r>
+      <w:r>
+        <w:t xml:space="preserve"> </w:t>
+      </w:r>
+      <w:r>
+        <w:t xml:space="preserve">- Внешние URL для аватара/фото услуг/фото отзывов не ограничены доменом</w:t>
+      </w:r>
+      <w:r>
+        <w:t xml:space="preserve"> </w:t>
+      </w:r>
+      <w:r>
+        <w:t xml:space="preserve">собственного хранилища (можно подменить контент после модерации) —</w:t>
+      </w:r>
+      <w:r>
+        <w:t xml:space="preserve"> </w:t>
+      </w:r>
+      <w:r>
+        <w:t xml:space="preserve">требует решения, ограничивать ли строго</w:t>
+      </w:r>
+      <w:r>
+        <w:t xml:space="preserve"> </w:t>
+      </w:r>
+      <w:r>
+        <w:rPr>
+          <w:rStyle w:val="VerbatimChar"/>
+        </w:rPr>
+        <w:t xml:space="preserve">S3_PUBLIC_URL</w:t>
+      </w:r>
+      <w:r>
+        <w:t xml:space="preserve"> </w:t>
+      </w:r>
+      <w:r>
+        <w:t xml:space="preserve">или разрешить</w:t>
+      </w:r>
+      <w:r>
+        <w:t xml:space="preserve"> </w:t>
+      </w:r>
+      <w:r>
+        <w:t xml:space="preserve">внешние ссылки как фичу.</w:t>
+      </w:r>
+      <w:r>
+        <w:t xml:space="preserve"> </w:t>
+      </w:r>
+      <w:r>
+        <w:t xml:space="preserve">-</w:t>
+      </w:r>
+      <w:r>
+        <w:t xml:space="preserve"> </w:t>
+      </w:r>
+      <w:r>
+        <w:rPr>
+          <w:rStyle w:val="VerbatimChar"/>
+        </w:rPr>
+        <w:t xml:space="preserve">accessToken</w:t>
+      </w:r>
+      <w:r>
+        <w:t xml:space="preserve">/</w:t>
+      </w:r>
+      <w:r>
+        <w:rPr>
+          <w:rStyle w:val="VerbatimChar"/>
+        </w:rPr>
+        <w:t xml:space="preserve">refreshToken</w:t>
+      </w:r>
+      <w:r>
+        <w:t xml:space="preserve"> </w:t>
+      </w:r>
+      <w:r>
+        <w:t xml:space="preserve">в</w:t>
+      </w:r>
+      <w:r>
+        <w:t xml:space="preserve"> </w:t>
+      </w:r>
+      <w:r>
+        <w:rPr>
+          <w:rStyle w:val="VerbatimChar"/>
+        </w:rPr>
+        <w:t xml:space="preserve">localStorage</w:t>
+      </w:r>
+      <w:r>
+        <w:t xml:space="preserve"> </w:t>
+      </w:r>
+      <w:r>
+        <w:t xml:space="preserve">вместо</w:t>
+      </w:r>
+      <w:r>
+        <w:t xml:space="preserve"> </w:t>
+      </w:r>
+      <w:r>
+        <w:rPr>
+          <w:rStyle w:val="VerbatimChar"/>
+        </w:rPr>
+        <w:t xml:space="preserve">httpOnly</w:t>
+      </w:r>
+      <w:r>
+        <w:t xml:space="preserve">-cookie —</w:t>
+      </w:r>
+      <w:r>
+        <w:t xml:space="preserve"> </w:t>
+      </w:r>
+      <w:r>
+        <w:t xml:space="preserve">архитектурная правка, требует отдельного захода.</w:t>
+      </w:r>
+      <w:r>
+        <w:t xml:space="preserve"> </w:t>
+      </w:r>
+      <w:r>
+        <w:t xml:space="preserve">- Нет</w:t>
+      </w:r>
+      <w:r>
+        <w:t xml:space="preserve"> </w:t>
+      </w:r>
+      <w:r>
+        <w:rPr>
+          <w:rStyle w:val="VerbatimChar"/>
+        </w:rPr>
+        <w:t xml:space="preserve">helmet</w:t>
+      </w:r>
+      <w:r>
+        <w:t xml:space="preserve">/security headers в backend, нет rate limit на</w:t>
+      </w:r>
+      <w:r>
+        <w:t xml:space="preserve"> </w:t>
+      </w:r>
+      <w:r>
+        <w:rPr>
+          <w:rStyle w:val="VerbatimChar"/>
+        </w:rPr>
+        <w:t xml:space="preserve">/api/auth/refresh</w:t>
+      </w:r>
+      <w:r>
+        <w:t xml:space="preserve">, MinIO service-account с</w:t>
+      </w:r>
+      <w:r>
+        <w:t xml:space="preserve"> </w:t>
+      </w:r>
+      <w:r>
+        <w:rPr>
+          <w:rStyle w:val="VerbatimChar"/>
+        </w:rPr>
+        <w:t xml:space="preserve">readwrite</w:t>
+      </w:r>
+      <w:r>
+        <w:t xml:space="preserve"> </w:t>
+      </w:r>
+      <w:r>
+        <w:t xml:space="preserve">на весь</w:t>
+      </w:r>
+      <w:r>
+        <w:t xml:space="preserve"> </w:t>
+      </w:r>
+      <w:r>
+        <w:t xml:space="preserve">инстанс вместо одного бакета — низкий приоритет, до релиза не блокирует.</w:t>
       </w:r>
     </w:p>
     <w:p>
@@ -1492,61 +2356,25 @@
         <w:pStyle w:val="Compact"/>
       </w:pPr>
       <w:r>
-        <w:t xml:space="preserve">Подключить реального провайдера (SendGrid / Mailgun / Yandex Cloud</w:t>
-      </w:r>
-      <w:r>
-        <w:t xml:space="preserve"> </w:t>
-      </w:r>
-      <w:r>
-        <w:t xml:space="preserve">почтовый сервис) вместо</w:t>
-      </w:r>
-      <w:r>
-        <w:t xml:space="preserve"> </w:t>
-      </w:r>
-      <w:r>
-        <w:rPr>
-          <w:rStyle w:val="VerbatimChar"/>
-        </w:rPr>
-        <w:t xml:space="preserve">mail.service.ts</w:t>
-      </w:r>
-      <w:r>
-        <w:t xml:space="preserve">-заглушки — интерфейс методов</w:t>
-      </w:r>
-      <w:r>
-        <w:t xml:space="preserve"> </w:t>
-      </w:r>
-      <w:r>
-        <w:t xml:space="preserve">менять не нужно, только реализацию (например, через</w:t>
-      </w:r>
-      <w:r>
-        <w:t xml:space="preserve"> </w:t>
-      </w:r>
-      <w:r>
-        <w:rPr>
-          <w:rStyle w:val="VerbatimChar"/>
-        </w:rPr>
-        <w:t xml:space="preserve">nodemailer</w:t>
-      </w:r>
-      <w:r>
-        <w:t xml:space="preserve"> </w:t>
-      </w:r>
-      <w:r>
-        <w:t xml:space="preserve">+ SMTP,</w:t>
-      </w:r>
-      <w:r>
-        <w:t xml:space="preserve"> </w:t>
-      </w:r>
-      <w:r>
-        <w:t xml:space="preserve">настраиваемое через env —</w:t>
-      </w:r>
-      <w:r>
-        <w:t xml:space="preserve"> </w:t>
-      </w:r>
-      <w:r>
-        <w:rPr>
-          <w:rStyle w:val="VerbatimChar"/>
-        </w:rPr>
-        <w:t xml:space="preserve">SMTP_HOST/PORT/USER/PASSWORD/MAIL_FROM</w:t>
+        <w:t xml:space="preserve">Написать smoke/e2e-тесты на критичные пути (регистрация, бронирование,</w:t>
+      </w:r>
+      <w:r>
+        <w:t xml:space="preserve"> </w:t>
+      </w:r>
+      <w:r>
+        <w:t xml:space="preserve">оплата, чат) — сейчас в проекте нет тестов, кроме дефолтного</w:t>
+      </w:r>
+      <w:r>
+        <w:t xml:space="preserve"> </w:t>
+      </w:r>
+      <w:r>
+        <w:t xml:space="preserve">Nest-boilerplate (</w:t>
+      </w:r>
+      <w:r>
+        <w:rPr>
+          <w:rStyle w:val="VerbatimChar"/>
+        </w:rPr>
+        <w:t xml:space="preserve">app.controller.spec.ts</w:t>
       </w:r>
       <w:r>
         <w:t xml:space="preserve">).</w:t>
@@ -1561,34 +2389,13 @@
         <w:pStyle w:val="Compact"/>
       </w:pPr>
       <w:r>
-        <w:t xml:space="preserve">Настроить SPF/DKIM/DMARC для</w:t>
-      </w:r>
-      <w:r>
-        <w:t xml:space="preserve"> </w:t>
-      </w:r>
-      <w:r>
-        <w:rPr>
-          <w:rStyle w:val="VerbatimChar"/>
-        </w:rPr>
-        <w:t xml:space="preserve">hobbyhub.ru</w:t>
-      </w:r>
-      <w:r>
-        <w:t xml:space="preserve"> </w:t>
-      </w:r>
-      <w:r>
-        <w:t xml:space="preserve">(DNS-записи у регистратора</w:t>
-      </w:r>
-      <w:r>
-        <w:t xml:space="preserve"> </w:t>
-      </w:r>
-      <w:r>
-        <w:t xml:space="preserve">или через NS-хостинг Timeweb, куда уже переключены NS-серверы домена),</w:t>
-      </w:r>
-      <w:r>
-        <w:t xml:space="preserve"> </w:t>
-      </w:r>
-      <w:r>
-        <w:t xml:space="preserve">иначе письма будут попадать в спам.</w:t>
+        <w:t xml:space="preserve">Нагрузочное тестирование на целевые 1000+ одновременных пользователей</w:t>
+      </w:r>
+      <w:r>
+        <w:t xml:space="preserve"> </w:t>
+      </w:r>
+      <w:r>
+        <w:t xml:space="preserve">(зафиксировано в tz-amendments п.11).</w:t>
       </w:r>
     </w:p>
     <w:p>
@@ -1600,661 +2407,50 @@
         <w:pStyle w:val="Compact"/>
       </w:pPr>
       <w:r>
-        <w:t xml:space="preserve">До подключения провайдера можно проверить саму реализацию на бесплатном</w:t>
-      </w:r>
-      <w:r>
-        <w:t xml:space="preserve"> </w:t>
-      </w:r>
-      <w:r>
-        <w:t xml:space="preserve">тестовом SMTP вроде Ethereal Email — письма никуда не уходят, но код и</w:t>
-      </w:r>
-      <w:r>
-        <w:t xml:space="preserve"> </w:t>
-      </w:r>
-      <w:r>
-        <w:t xml:space="preserve">flow проверяются end-to-end.</w:t>
-      </w:r>
-    </w:p>
-    <w:bookmarkEnd w:id="25"/>
-    <w:bookmarkStart w:id="26" w:name="фаза-4-реальные-платежи"/>
+        <w:t xml:space="preserve">Security review: OWASP top 10, аудит прав доступа (</w:t>
+      </w:r>
+      <w:r>
+        <w:rPr>
+          <w:rStyle w:val="VerbatimChar"/>
+        </w:rPr>
+        <w:t xml:space="preserve">JwtAuthGuard</w:t>
+      </w:r>
+      <w:r>
+        <w:t xml:space="preserve">,</w:t>
+      </w:r>
+      <w:r>
+        <w:t xml:space="preserve"> </w:t>
+      </w:r>
+      <w:r>
+        <w:t xml:space="preserve">admin-гварды), проверка что секреты не попали в git, что Basic Auth</w:t>
+      </w:r>
+      <w:r>
+        <w:t xml:space="preserve"> </w:t>
+      </w:r>
+      <w:r>
+        <w:t xml:space="preserve">гейт действительно снят.</w:t>
+      </w:r>
+    </w:p>
+    <w:p>
+      <w:pPr>
+        <w:numPr>
+          <w:ilvl w:val="0"/>
+          <w:numId w:val="1003"/>
+        </w:numPr>
+        <w:pStyle w:val="Compact"/>
+      </w:pPr>
+      <w:r>
+        <w:t xml:space="preserve">Ручной регресс по ключевым пользовательским сценариям (чек-лист ниже).</w:t>
+      </w:r>
+    </w:p>
+    <w:bookmarkEnd w:id="27"/>
+    <w:bookmarkStart w:id="28" w:name="фаза-6-контент-и-запуск"/>
     <w:p>
       <w:pPr>
         <w:pStyle w:val="Heading3"/>
       </w:pPr>
       <w:r>
-        <w:t xml:space="preserve">Фаза 4 — Реальные платежи</w:t>
-      </w:r>
-    </w:p>
-    <w:p>
-      <w:pPr>
-        <w:pStyle w:val="FirstParagraph"/>
-      </w:pPr>
-      <w:r>
-        <w:t xml:space="preserve">Возможна только после Фазы 0. До этой фазы бронирование скрыто флагом</w:t>
-      </w:r>
-      <w:r>
-        <w:t xml:space="preserve"> </w:t>
-      </w:r>
-      <w:r>
-        <w:rPr>
-          <w:rStyle w:val="VerbatimChar"/>
-        </w:rPr>
-        <w:t xml:space="preserve">ORDERS_DISABLED</w:t>
-      </w:r>
-      <w:r>
-        <w:t xml:space="preserve"> </w:t>
-      </w:r>
-      <w:r>
-        <w:t xml:space="preserve">(backend</w:t>
-      </w:r>
-      <w:r>
-        <w:t xml:space="preserve"> </w:t>
-      </w:r>
-      <w:r>
-        <w:rPr>
-          <w:rStyle w:val="VerbatimChar"/>
-        </w:rPr>
-        <w:t xml:space="preserve">.env</w:t>
-      </w:r>
-      <w:r>
-        <w:t xml:space="preserve">) /</w:t>
-      </w:r>
-      <w:r>
-        <w:t xml:space="preserve"> </w:t>
-      </w:r>
-      <w:r>
-        <w:rPr>
-          <w:rStyle w:val="VerbatimChar"/>
-        </w:rPr>
-        <w:t xml:space="preserve">NEXT_PUBLIC_ORDERS_DISABLED</w:t>
-      </w:r>
-      <w:r>
-        <w:t xml:space="preserve"> </w:t>
-      </w:r>
-      <w:r>
-        <w:t xml:space="preserve">(frontend</w:t>
-      </w:r>
-      <w:r>
-        <w:t xml:space="preserve"> </w:t>
-      </w:r>
-      <w:r>
-        <w:rPr>
-          <w:rStyle w:val="VerbatimChar"/>
-        </w:rPr>
-        <w:t xml:space="preserve">.env.local</w:t>
-      </w:r>
-      <w:r>
-        <w:t xml:space="preserve">) — сайт открыт для просмотра/регистрации, но</w:t>
-      </w:r>
-      <w:r>
-        <w:t xml:space="preserve"> </w:t>
-      </w:r>
-      <w:r>
-        <w:t xml:space="preserve">попытка оформить бронь показывает «сайт в разработке». Снимается без</w:t>
-      </w:r>
-      <w:r>
-        <w:t xml:space="preserve"> </w:t>
-      </w:r>
-      <w:r>
-        <w:t xml:space="preserve">правок кода — убрать обе переменные и передеплоить.</w:t>
-      </w:r>
-      <w:r>
-        <w:t xml:space="preserve"> </w:t>
-      </w:r>
-      <w:r>
-        <w:t xml:space="preserve">- Реализовать реальный класс</w:t>
-      </w:r>
-      <w:r>
-        <w:t xml:space="preserve"> </w:t>
-      </w:r>
-      <w:r>
-        <w:rPr>
-          <w:rStyle w:val="VerbatimChar"/>
-        </w:rPr>
-        <w:t xml:space="preserve">PaymentProvider</w:t>
-      </w:r>
-      <w:r>
-        <w:t xml:space="preserve"> </w:t>
-      </w:r>
-      <w:r>
-        <w:t xml:space="preserve">вместо</w:t>
-      </w:r>
-      <w:r>
-        <w:t xml:space="preserve"> </w:t>
-      </w:r>
-      <w:r>
-        <w:rPr>
-          <w:rStyle w:val="VerbatimChar"/>
-        </w:rPr>
-        <w:t xml:space="preserve">MockYookassaProvider</w:t>
-      </w:r>
-      <w:r>
-        <w:t xml:space="preserve"> </w:t>
-      </w:r>
-      <w:r>
-        <w:t xml:space="preserve">— архитектурно уже готово (весь остальной код</w:t>
-      </w:r>
-      <w:r>
-        <w:t xml:space="preserve"> </w:t>
-      </w:r>
-      <w:r>
-        <w:t xml:space="preserve">работает через интерфейс, подстановка класса под токеном</w:t>
-      </w:r>
-      <w:r>
-        <w:t xml:space="preserve"> </w:t>
-      </w:r>
-      <w:r>
-        <w:rPr>
-          <w:rStyle w:val="VerbatimChar"/>
-        </w:rPr>
-        <w:t xml:space="preserve">PAYMENT_PROVIDER</w:t>
-      </w:r>
-      <w:r>
-        <w:t xml:space="preserve"> </w:t>
-      </w:r>
-      <w:r>
-        <w:t xml:space="preserve">не требует правок в бронированиях/эскроу-логике).</w:t>
-      </w:r>
-      <w:r>
-        <w:t xml:space="preserve"> </w:t>
-      </w:r>
-      <w:r>
-        <w:t xml:space="preserve">- Реализовать флоу верификации продавца перед первой выплатой (поле</w:t>
-      </w:r>
-      <w:r>
-        <w:t xml:space="preserve"> </w:t>
-      </w:r>
-      <w:r>
-        <w:rPr>
-          <w:rStyle w:val="VerbatimChar"/>
-        </w:rPr>
-        <w:t xml:space="preserve">isSellerVerified</w:t>
-      </w:r>
-      <w:r>
-        <w:t xml:space="preserve"> </w:t>
-      </w:r>
-      <w:r>
-        <w:t xml:space="preserve">в модели уже есть, самого KYC-процесса — нет).</w:t>
-      </w:r>
-      <w:r>
-        <w:t xml:space="preserve"> </w:t>
-      </w:r>
-      <w:r>
-        <w:t xml:space="preserve">- Прогнать сквозной тест реальных платежей в sandbox-режиме провайдера</w:t>
-      </w:r>
-      <w:r>
-        <w:t xml:space="preserve"> </w:t>
-      </w:r>
-      <w:r>
-        <w:t xml:space="preserve">перед боевым переключением.</w:t>
-      </w:r>
-    </w:p>
-    <w:bookmarkEnd w:id="26"/>
-    <w:bookmarkStart w:id="27" w:name="фаза-5-тестирование-и-безопасность"/>
-    <w:p>
-      <w:pPr>
-        <w:pStyle w:val="Heading3"/>
-      </w:pPr>
-      <w:r>
-        <w:t xml:space="preserve">Фаза 5 — Тестирование и безопасность</w:t>
-      </w:r>
-    </w:p>
-    <w:p>
-      <w:pPr>
-        <w:pStyle w:val="FirstParagraph"/>
-      </w:pPr>
-      <w:r>
-        <w:rPr>
-          <w:bCs/>
-          <w:b/>
-        </w:rPr>
-        <w:t xml:space="preserve">Готово (2026-08-27):</w:t>
-      </w:r>
-      <w:r>
-        <w:t xml:space="preserve"> </w:t>
-      </w:r>
-      <w:r>
-        <w:t xml:space="preserve">полный аудит безопасности перед релизом (auth/authz,</w:t>
-      </w:r>
-      <w:r>
-        <w:t xml:space="preserve"> </w:t>
-      </w:r>
-      <w:r>
-        <w:t xml:space="preserve">инъекции, загрузка файлов, секреты, CORS, rate limiting, эскроу-логика,</w:t>
-      </w:r>
-      <w:r>
-        <w:t xml:space="preserve"> </w:t>
-      </w:r>
-      <w:r>
-        <w:t xml:space="preserve">админка, зависимости). Найденное и исправленное:</w:t>
-      </w:r>
-      <w:r>
-        <w:t xml:space="preserve"> </w:t>
-      </w:r>
-      <w:r>
-        <w:t xml:space="preserve">- Basic Auth гейт обходился подделкой</w:t>
-      </w:r>
-      <w:r>
-        <w:t xml:space="preserve"> </w:t>
-      </w:r>
-      <w:r>
-        <w:rPr>
-          <w:rStyle w:val="VerbatimChar"/>
-        </w:rPr>
-        <w:t xml:space="preserve">Authorization: Bearer x</w:t>
-      </w:r>
-      <w:r>
-        <w:t xml:space="preserve"> </w:t>
-      </w:r>
-      <w:r>
-        <w:t xml:space="preserve">— гейт</w:t>
-      </w:r>
-      <w:r>
-        <w:t xml:space="preserve"> </w:t>
-      </w:r>
-      <w:r>
-        <w:t xml:space="preserve">снят полностью (см. блокер №4 выше).</w:t>
-      </w:r>
-      <w:r>
-        <w:t xml:space="preserve"> </w:t>
-      </w:r>
-      <w:r>
-        <w:t xml:space="preserve">- Токены сброса пароля/подтверждения email писались в лог в открытом виде</w:t>
-      </w:r>
-      <w:r>
-        <w:t xml:space="preserve"> </w:t>
-      </w:r>
-      <w:r>
-        <w:t xml:space="preserve">в проде — теперь логируются только вне</w:t>
-      </w:r>
-      <w:r>
-        <w:t xml:space="preserve"> </w:t>
-      </w:r>
-      <w:r>
-        <w:rPr>
-          <w:rStyle w:val="VerbatimChar"/>
-        </w:rPr>
-        <w:t xml:space="preserve">NODE_ENV=production</w:t>
-      </w:r>
-      <w:r>
-        <w:t xml:space="preserve"> </w:t>
-      </w:r>
-      <w:r>
-        <w:t xml:space="preserve">(</w:t>
-      </w:r>
-      <w:r>
-        <w:rPr>
-          <w:rStyle w:val="VerbatimChar"/>
-        </w:rPr>
-        <w:t xml:space="preserve">backend/src/mail/mail.service.ts</w:t>
-      </w:r>
-      <w:r>
-        <w:t xml:space="preserve">); сама отправка писем по-прежнему</w:t>
-      </w:r>
-      <w:r>
-        <w:t xml:space="preserve"> </w:t>
-      </w:r>
-      <w:r>
-        <w:t xml:space="preserve">не реализована (см. Фазу 3).</w:t>
-      </w:r>
-      <w:r>
-        <w:t xml:space="preserve"> </w:t>
-      </w:r>
-      <w:r>
-        <w:t xml:space="preserve">- WebSocket</w:t>
-      </w:r>
-      <w:r>
-        <w:t xml:space="preserve"> </w:t>
-      </w:r>
-      <w:r>
-        <w:rPr>
-          <w:rStyle w:val="VerbatimChar"/>
-        </w:rPr>
-        <w:t xml:space="preserve">chat:join</w:t>
-      </w:r>
-      <w:r>
-        <w:t xml:space="preserve"> </w:t>
-      </w:r>
-      <w:r>
-        <w:t xml:space="preserve">пускал в комнату любого чата без проверки, что</w:t>
-      </w:r>
-      <w:r>
-        <w:t xml:space="preserve"> </w:t>
-      </w:r>
-      <w:r>
-        <w:t xml:space="preserve">пользователь — участник (можно было слушать чужую переписку по</w:t>
-      </w:r>
-      <w:r>
-        <w:t xml:space="preserve"> </w:t>
-      </w:r>
-      <w:r>
-        <w:t xml:space="preserve">известному chatId) — добавлена проверка через</w:t>
-      </w:r>
-      <w:r>
-        <w:t xml:space="preserve"> </w:t>
-      </w:r>
-      <w:r>
-        <w:rPr>
-          <w:rStyle w:val="VerbatimChar"/>
-        </w:rPr>
-        <w:t xml:space="preserve">getChatForParticipant</w:t>
-      </w:r>
-      <w:r>
-        <w:t xml:space="preserve"> </w:t>
-      </w:r>
-      <w:r>
-        <w:t xml:space="preserve">(</w:t>
-      </w:r>
-      <w:r>
-        <w:rPr>
-          <w:rStyle w:val="VerbatimChar"/>
-        </w:rPr>
-        <w:t xml:space="preserve">backend/src/chats/chats.gateway.ts</w:t>
-      </w:r>
-      <w:r>
-        <w:t xml:space="preserve">).</w:t>
-      </w:r>
-      <w:r>
-        <w:t xml:space="preserve"> </w:t>
-      </w:r>
-      <w:r>
-        <w:t xml:space="preserve">- Presigned upload в MinIO принимал</w:t>
-      </w:r>
-      <w:r>
-        <w:t xml:space="preserve"> </w:t>
-      </w:r>
-      <w:r>
-        <w:rPr>
-          <w:rStyle w:val="VerbatimChar"/>
-        </w:rPr>
-        <w:t xml:space="preserve">Content-Type</w:t>
-      </w:r>
-      <w:r>
-        <w:t xml:space="preserve"> </w:t>
-      </w:r>
-      <w:r>
-        <w:t xml:space="preserve">по префиксу</w:t>
-      </w:r>
-      <w:r>
-        <w:t xml:space="preserve"> </w:t>
-      </w:r>
-      <w:r>
-        <w:rPr>
-          <w:rStyle w:val="VerbatimChar"/>
-        </w:rPr>
-        <w:t xml:space="preserve">image/</w:t>
-      </w:r>
-      <w:r>
-        <w:t xml:space="preserve"> </w:t>
-      </w:r>
-      <w:r>
-        <w:t xml:space="preserve">(пропускал</w:t>
-      </w:r>
-      <w:r>
-        <w:t xml:space="preserve"> </w:t>
-      </w:r>
-      <w:r>
-        <w:rPr>
-          <w:rStyle w:val="VerbatimChar"/>
-        </w:rPr>
-        <w:t xml:space="preserve">image/svg+xml</w:t>
-      </w:r>
-      <w:r>
-        <w:t xml:space="preserve"> </w:t>
-      </w:r>
-      <w:r>
-        <w:t xml:space="preserve">— потенциальный stored XSS) — заменено на</w:t>
-      </w:r>
-      <w:r>
-        <w:t xml:space="preserve"> </w:t>
-      </w:r>
-      <w:r>
-        <w:t xml:space="preserve">точное совпадение (</w:t>
-      </w:r>
-      <w:r>
-        <w:rPr>
-          <w:rStyle w:val="VerbatimChar"/>
-        </w:rPr>
-        <w:t xml:space="preserve">backend/src/uploads/uploads.service.ts</w:t>
-      </w:r>
-      <w:r>
-        <w:t xml:space="preserve">).</w:t>
-      </w:r>
-      <w:r>
-        <w:t xml:space="preserve"> </w:t>
-      </w:r>
-      <w:r>
-        <w:t xml:space="preserve">-</w:t>
-      </w:r>
-      <w:r>
-        <w:t xml:space="preserve"> </w:t>
-      </w:r>
-      <w:r>
-        <w:rPr>
-          <w:rStyle w:val="VerbatimChar"/>
-        </w:rPr>
-        <w:t xml:space="preserve">fixedAmount</w:t>
-      </w:r>
-      <w:r>
-        <w:t xml:space="preserve"> </w:t>
-      </w:r>
-      <w:r>
-        <w:t xml:space="preserve">при подтверждении брони с договорной ценой не проверялся</w:t>
-      </w:r>
-      <w:r>
-        <w:t xml:space="preserve"> </w:t>
-      </w:r>
-      <w:r>
-        <w:t xml:space="preserve">на положительность — добавлена валидация</w:t>
-      </w:r>
-      <w:r>
-        <w:t xml:space="preserve"> </w:t>
-      </w:r>
-      <w:r>
-        <w:t xml:space="preserve">(</w:t>
-      </w:r>
-      <w:r>
-        <w:rPr>
-          <w:rStyle w:val="VerbatimChar"/>
-        </w:rPr>
-        <w:t xml:space="preserve">backend/src/bookings/dto/confirm-booking.dto.ts</w:t>
-      </w:r>
-      <w:r>
-        <w:t xml:space="preserve">).</w:t>
-      </w:r>
-      <w:r>
-        <w:t xml:space="preserve"> </w:t>
-      </w:r>
-      <w:r>
-        <w:t xml:space="preserve">-</w:t>
-      </w:r>
-      <w:r>
-        <w:t xml:space="preserve"> </w:t>
-      </w:r>
-      <w:r>
-        <w:rPr>
-          <w:rStyle w:val="VerbatimChar"/>
-        </w:rPr>
-        <w:t xml:space="preserve">npm audit</w:t>
-      </w:r>
-      <w:r>
-        <w:t xml:space="preserve"> </w:t>
-      </w:r>
-      <w:r>
-        <w:t xml:space="preserve">(backend и frontend) — 0 уязвимостей после</w:t>
-      </w:r>
-      <w:r>
-        <w:t xml:space="preserve"> </w:t>
-      </w:r>
-      <w:r>
-        <w:rPr>
-          <w:rStyle w:val="VerbatimChar"/>
-        </w:rPr>
-        <w:t xml:space="preserve">npm audit fix</w:t>
-      </w:r>
-      <w:r>
-        <w:t xml:space="preserve">.</w:t>
-      </w:r>
-    </w:p>
-    <w:p>
-      <w:pPr>
-        <w:pStyle w:val="BodyText"/>
-      </w:pPr>
-      <w:r>
-        <w:t xml:space="preserve">Не исправлено, осознанно отложено:</w:t>
-      </w:r>
-      <w:r>
-        <w:t xml:space="preserve"> </w:t>
-      </w:r>
-      <w:r>
-        <w:t xml:space="preserve">- Внешние URL для аватара/фото услуг/фото отзывов не ограничены доменом</w:t>
-      </w:r>
-      <w:r>
-        <w:t xml:space="preserve"> </w:t>
-      </w:r>
-      <w:r>
-        <w:t xml:space="preserve">собственного хранилища (можно подменить контент после модерации) —</w:t>
-      </w:r>
-      <w:r>
-        <w:t xml:space="preserve"> </w:t>
-      </w:r>
-      <w:r>
-        <w:t xml:space="preserve">требует решения, ограничивать ли строго</w:t>
-      </w:r>
-      <w:r>
-        <w:t xml:space="preserve"> </w:t>
-      </w:r>
-      <w:r>
-        <w:rPr>
-          <w:rStyle w:val="VerbatimChar"/>
-        </w:rPr>
-        <w:t xml:space="preserve">S3_PUBLIC_URL</w:t>
-      </w:r>
-      <w:r>
-        <w:t xml:space="preserve"> </w:t>
-      </w:r>
-      <w:r>
-        <w:t xml:space="preserve">или разрешить</w:t>
-      </w:r>
-      <w:r>
-        <w:t xml:space="preserve"> </w:t>
-      </w:r>
-      <w:r>
-        <w:t xml:space="preserve">внешние ссылки как фичу.</w:t>
-      </w:r>
-      <w:r>
-        <w:t xml:space="preserve"> </w:t>
-      </w:r>
-      <w:r>
-        <w:t xml:space="preserve">-</w:t>
-      </w:r>
-      <w:r>
-        <w:t xml:space="preserve"> </w:t>
-      </w:r>
-      <w:r>
-        <w:rPr>
-          <w:rStyle w:val="VerbatimChar"/>
-        </w:rPr>
-        <w:t xml:space="preserve">accessToken</w:t>
-      </w:r>
-      <w:r>
-        <w:t xml:space="preserve">/</w:t>
-      </w:r>
-      <w:r>
-        <w:rPr>
-          <w:rStyle w:val="VerbatimChar"/>
-        </w:rPr>
-        <w:t xml:space="preserve">refreshToken</w:t>
-      </w:r>
-      <w:r>
-        <w:t xml:space="preserve"> </w:t>
-      </w:r>
-      <w:r>
-        <w:t xml:space="preserve">в</w:t>
-      </w:r>
-      <w:r>
-        <w:t xml:space="preserve"> </w:t>
-      </w:r>
-      <w:r>
-        <w:rPr>
-          <w:rStyle w:val="VerbatimChar"/>
-        </w:rPr>
-        <w:t xml:space="preserve">localStorage</w:t>
-      </w:r>
-      <w:r>
-        <w:t xml:space="preserve"> </w:t>
-      </w:r>
-      <w:r>
-        <w:t xml:space="preserve">вместо</w:t>
-      </w:r>
-      <w:r>
-        <w:t xml:space="preserve"> </w:t>
-      </w:r>
-      <w:r>
-        <w:rPr>
-          <w:rStyle w:val="VerbatimChar"/>
-        </w:rPr>
-        <w:t xml:space="preserve">httpOnly</w:t>
-      </w:r>
-      <w:r>
-        <w:t xml:space="preserve">-cookie —</w:t>
-      </w:r>
-      <w:r>
-        <w:t xml:space="preserve"> </w:t>
-      </w:r>
-      <w:r>
-        <w:t xml:space="preserve">архитектурная правка, требует отдельного захода.</w:t>
-      </w:r>
-      <w:r>
-        <w:t xml:space="preserve"> </w:t>
-      </w:r>
-      <w:r>
-        <w:t xml:space="preserve">- Нет</w:t>
-      </w:r>
-      <w:r>
-        <w:t xml:space="preserve"> </w:t>
-      </w:r>
-      <w:r>
-        <w:rPr>
-          <w:rStyle w:val="VerbatimChar"/>
-        </w:rPr>
-        <w:t xml:space="preserve">helmet</w:t>
-      </w:r>
-      <w:r>
-        <w:t xml:space="preserve">/security headers в backend, нет rate limit на</w:t>
-      </w:r>
-      <w:r>
-        <w:t xml:space="preserve"> </w:t>
-      </w:r>
-      <w:r>
-        <w:rPr>
-          <w:rStyle w:val="VerbatimChar"/>
-        </w:rPr>
-        <w:t xml:space="preserve">/api/auth/refresh</w:t>
-      </w:r>
-      <w:r>
-        <w:t xml:space="preserve">, MinIO service-account с</w:t>
-      </w:r>
-      <w:r>
-        <w:t xml:space="preserve"> </w:t>
-      </w:r>
-      <w:r>
-        <w:rPr>
-          <w:rStyle w:val="VerbatimChar"/>
-        </w:rPr>
-        <w:t xml:space="preserve">readwrite</w:t>
-      </w:r>
-      <w:r>
-        <w:t xml:space="preserve"> </w:t>
-      </w:r>
-      <w:r>
-        <w:t xml:space="preserve">на весь</w:t>
-      </w:r>
-      <w:r>
-        <w:t xml:space="preserve"> </w:t>
-      </w:r>
-      <w:r>
-        <w:t xml:space="preserve">инстанс вместо одного бакета — низкий приоритет, до релиза не блокирует.</w:t>
+        <w:t xml:space="preserve">Фаза 6 — Контент и запуск</w:t>
       </w:r>
     </w:p>
     <w:p>
@@ -2266,28 +2462,13 @@
         <w:pStyle w:val="Compact"/>
       </w:pPr>
       <w:r>
-        <w:t xml:space="preserve">Написать smoke/e2e-тесты на критичные пути (регистрация, бронирование,</w:t>
-      </w:r>
-      <w:r>
-        <w:t xml:space="preserve"> </w:t>
-      </w:r>
-      <w:r>
-        <w:t xml:space="preserve">оплата, чат) — сейчас в проекте нет тестов, кроме дефолтного</w:t>
-      </w:r>
-      <w:r>
-        <w:t xml:space="preserve"> </w:t>
-      </w:r>
-      <w:r>
-        <w:t xml:space="preserve">Nest-boilerplate (</w:t>
-      </w:r>
-      <w:r>
-        <w:rPr>
-          <w:rStyle w:val="VerbatimChar"/>
-        </w:rPr>
-        <w:t xml:space="preserve">app.controller.spec.ts</w:t>
-      </w:r>
-      <w:r>
-        <w:t xml:space="preserve">).</w:t>
+        <w:t xml:space="preserve">Очистить тестовые данные (услуги вида «Скриншот-тест…», тестовые</w:t>
+      </w:r>
+      <w:r>
+        <w:t xml:space="preserve"> </w:t>
+      </w:r>
+      <w:r>
+        <w:t xml:space="preserve">аккаунты) перед показом реальным пользователям.</w:t>
       </w:r>
     </w:p>
     <w:p>
@@ -2299,13 +2480,13 @@
         <w:pStyle w:val="Compact"/>
       </w:pPr>
       <w:r>
-        <w:t xml:space="preserve">Нагрузочное тестирование на целевые 1000+ одновременных пользователей</w:t>
-      </w:r>
-      <w:r>
-        <w:t xml:space="preserve"> </w:t>
-      </w:r>
-      <w:r>
-        <w:t xml:space="preserve">(зафиксировано в tz-amendments п.11).</w:t>
+        <w:t xml:space="preserve">Убедиться, что модерация объявлений отработана на реальном потоке</w:t>
+      </w:r>
+      <w:r>
+        <w:t xml:space="preserve"> </w:t>
+      </w:r>
+      <w:r>
+        <w:t xml:space="preserve">(сам механизм уже реализован).</w:t>
       </w:r>
     </w:p>
     <w:p>
@@ -2317,28 +2498,13 @@
         <w:pStyle w:val="Compact"/>
       </w:pPr>
       <w:r>
-        <w:t xml:space="preserve">Security review: OWASP top 10, аудит прав доступа (</w:t>
-      </w:r>
-      <w:r>
-        <w:rPr>
-          <w:rStyle w:val="VerbatimChar"/>
-        </w:rPr>
-        <w:t xml:space="preserve">JwtAuthGuard</w:t>
-      </w:r>
-      <w:r>
-        <w:t xml:space="preserve">,</w:t>
-      </w:r>
-      <w:r>
-        <w:t xml:space="preserve"> </w:t>
-      </w:r>
-      <w:r>
-        <w:t xml:space="preserve">admin-гварды), проверка что секреты не попали в git, что Basic Auth</w:t>
-      </w:r>
-      <w:r>
-        <w:t xml:space="preserve"> </w:t>
-      </w:r>
-      <w:r>
-        <w:t xml:space="preserve">гейт действительно снят.</w:t>
+        <w:t xml:space="preserve">Мягкий запуск: ограниченный круг пользователей/один город перед</w:t>
+      </w:r>
+      <w:r>
+        <w:t xml:space="preserve"> </w:t>
+      </w:r>
+      <w:r>
+        <w:t xml:space="preserve">широким анонсом.</w:t>
       </w:r>
     </w:p>
     <w:p>
@@ -2350,17 +2516,17 @@
         <w:pStyle w:val="Compact"/>
       </w:pPr>
       <w:r>
-        <w:t xml:space="preserve">Ручной регресс по ключевым пользовательским сценариям (чек-лист ниже).</w:t>
-      </w:r>
-    </w:p>
-    <w:bookmarkEnd w:id="27"/>
-    <w:bookmarkStart w:id="28" w:name="фаза-6-контент-и-запуск"/>
+        <w:t xml:space="preserve">План отката: как быстро откатить деплой/миграцию при критичном баге.</w:t>
+      </w:r>
+    </w:p>
+    <w:bookmarkEnd w:id="28"/>
+    <w:bookmarkStart w:id="29" w:name="фаза-7-после-запуска"/>
     <w:p>
       <w:pPr>
         <w:pStyle w:val="Heading3"/>
       </w:pPr>
       <w:r>
-        <w:t xml:space="preserve">Фаза 6 — Контент и запуск</w:t>
+        <w:t xml:space="preserve">Фаза 7 — После запуска</w:t>
       </w:r>
     </w:p>
     <w:p>
@@ -2372,13 +2538,13 @@
         <w:pStyle w:val="Compact"/>
       </w:pPr>
       <w:r>
-        <w:t xml:space="preserve">Очистить тестовые данные (услуги вида «Скриншот-тест…», тестовые</w:t>
-      </w:r>
-      <w:r>
-        <w:t xml:space="preserve"> </w:t>
-      </w:r>
-      <w:r>
-        <w:t xml:space="preserve">аккаунты) перед показом реальным пользователям.</w:t>
+        <w:t xml:space="preserve">Мониторинг первую неделю: ошибки, конверсия регистрация → бронирование</w:t>
+      </w:r>
+      <w:r>
+        <w:t xml:space="preserve"> </w:t>
+      </w:r>
+      <w:r>
+        <w:t xml:space="preserve">→ оплата.</w:t>
       </w:r>
     </w:p>
     <w:p>
@@ -2390,53 +2556,153 @@
         <w:pStyle w:val="Compact"/>
       </w:pPr>
       <w:r>
-        <w:t xml:space="preserve">Убедиться, что модерация объявлений отработана на реальном потоке</w:t>
-      </w:r>
-      <w:r>
-        <w:t xml:space="preserve"> </w:t>
-      </w:r>
-      <w:r>
-        <w:t xml:space="preserve">(сам механизм уже реализован).</w:t>
-      </w:r>
-    </w:p>
-    <w:p>
-      <w:pPr>
-        <w:numPr>
-          <w:ilvl w:val="0"/>
-          <w:numId w:val="1005"/>
-        </w:numPr>
-        <w:pStyle w:val="Compact"/>
-      </w:pPr>
-      <w:r>
-        <w:t xml:space="preserve">Мягкий запуск: ограниченный круг пользователей/один город перед</w:t>
-      </w:r>
-      <w:r>
-        <w:t xml:space="preserve"> </w:t>
-      </w:r>
-      <w:r>
-        <w:t xml:space="preserve">широким анонсом.</w:t>
-      </w:r>
-    </w:p>
-    <w:p>
-      <w:pPr>
-        <w:numPr>
-          <w:ilvl w:val="0"/>
-          <w:numId w:val="1005"/>
-        </w:numPr>
-        <w:pStyle w:val="Compact"/>
-      </w:pPr>
-      <w:r>
-        <w:t xml:space="preserve">План отката: как быстро откатить деплой/миграцию при критичном баге.</w:t>
-      </w:r>
-    </w:p>
-    <w:bookmarkEnd w:id="28"/>
-    <w:bookmarkStart w:id="29" w:name="фаза-7-после-запуска"/>
-    <w:p>
-      <w:pPr>
-        <w:pStyle w:val="Heading3"/>
-      </w:pPr>
-      <w:r>
-        <w:t xml:space="preserve">Фаза 7 — После запуска</w:t>
+        <w:t xml:space="preserve">Возврат к пост-MVP пунктам из tz-amendments («продуктовые дополнения»:</w:t>
+      </w:r>
+      <w:r>
+        <w:t xml:space="preserve"> </w:t>
+      </w:r>
+      <w:r>
+        <w:t xml:space="preserve">двусторонние отзывы и т.п.) и к остальным пожеланиям из бэклога.</w:t>
+      </w:r>
+    </w:p>
+    <w:p>
+      <w:pPr>
+        <w:pStyle w:val="FirstParagraph"/>
+      </w:pPr>
+      <w:r>
+        <w:rPr>
+          <w:bCs/>
+          <w:b/>
+        </w:rPr>
+        <w:t xml:space="preserve">Готово:</w:t>
+      </w:r>
+      <w:r>
+        <w:t xml:space="preserve"> </w:t>
+      </w:r>
+      <w:r>
+        <w:t xml:space="preserve">канал поддержки пользователей — реализован поверх</w:t>
+      </w:r>
+      <w:r>
+        <w:t xml:space="preserve"> </w:t>
+      </w:r>
+      <w:r>
+        <w:t xml:space="preserve">существующего чата. Один аккаунт помечается флагом</w:t>
+      </w:r>
+      <w:r>
+        <w:t xml:space="preserve"> </w:t>
+      </w:r>
+      <w:r>
+        <w:rPr>
+          <w:rStyle w:val="VerbatimChar"/>
+        </w:rPr>
+        <w:t xml:space="preserve">User.isSupport</w:t>
+      </w:r>
+      <w:r>
+        <w:t xml:space="preserve"> </w:t>
+      </w:r>
+      <w:r>
+        <w:t xml:space="preserve">(сейчас — напрямую в БД, тем же способом, что и</w:t>
+      </w:r>
+      <w:r>
+        <w:t xml:space="preserve"> </w:t>
+      </w:r>
+      <w:r>
+        <w:rPr>
+          <w:rStyle w:val="VerbatimChar"/>
+        </w:rPr>
+        <w:t xml:space="preserve">isAdmin</w:t>
+      </w:r>
+      <w:r>
+        <w:t xml:space="preserve">; отдельной</w:t>
+      </w:r>
+      <w:r>
+        <w:t xml:space="preserve"> </w:t>
+      </w:r>
+      <w:r>
+        <w:t xml:space="preserve">админ-панели управления пользователями в проекте нет). Публичный</w:t>
+      </w:r>
+      <w:r>
+        <w:t xml:space="preserve"> </w:t>
+      </w:r>
+      <w:r>
+        <w:t xml:space="preserve">эндпоинт</w:t>
+      </w:r>
+      <w:r>
+        <w:t xml:space="preserve"> </w:t>
+      </w:r>
+      <w:r>
+        <w:rPr>
+          <w:rStyle w:val="VerbatimChar"/>
+        </w:rPr>
+        <w:t xml:space="preserve">GET /api/support/contact</w:t>
+      </w:r>
+      <w:r>
+        <w:t xml:space="preserve"> </w:t>
+      </w:r>
+      <w:r>
+        <w:t xml:space="preserve">отдаёт его id, плавающий</w:t>
+      </w:r>
+      <w:r>
+        <w:t xml:space="preserve"> </w:t>
+      </w:r>
+      <w:r>
+        <w:t xml:space="preserve">чат-виджет показывает закреплённую строку «Поддержка» сверху списка</w:t>
+      </w:r>
+      <w:r>
+        <w:t xml:space="preserve"> </w:t>
+      </w:r>
+      <w:r>
+        <w:t xml:space="preserve">диалогов — переиспользует уже готовую инфраструктуру чата (WS,</w:t>
+      </w:r>
+      <w:r>
+        <w:t xml:space="preserve"> </w:t>
+      </w:r>
+      <w:r>
+        <w:t xml:space="preserve">REST-фолбэк, бейдж непрочитанных), отдельной системы тикетов не</w:t>
+      </w:r>
+      <w:r>
+        <w:t xml:space="preserve"> </w:t>
+      </w:r>
+      <w:r>
+        <w:t xml:space="preserve">потребовалось. На новом сервере поддержку сейчас ведёт аккаунт</w:t>
+      </w:r>
+      <w:r>
+        <w:t xml:space="preserve"> </w:t>
+      </w:r>
+      <w:r>
+        <w:rPr>
+          <w:rStyle w:val="VerbatimChar"/>
+        </w:rPr>
+        <w:t xml:space="preserve">support@hobbyhub.ru</w:t>
+      </w:r>
+      <w:r>
+        <w:t xml:space="preserve"> </w:t>
+      </w:r>
+      <w:r>
+        <w:t xml:space="preserve">— перед реальным запуском решить, кто и по какому</w:t>
+      </w:r>
+      <w:r>
+        <w:t xml:space="preserve"> </w:t>
+      </w:r>
+      <w:r>
+        <w:t xml:space="preserve">графику на него отвечает (или завести несколько таких аккаунтов, если</w:t>
+      </w:r>
+      <w:r>
+        <w:t xml:space="preserve"> </w:t>
+      </w:r>
+      <w:r>
+        <w:t xml:space="preserve">нагрузка потребует).</w:t>
+      </w:r>
+    </w:p>
+    <w:bookmarkEnd w:id="29"/>
+    <w:bookmarkEnd w:id="30"/>
+    <w:bookmarkStart w:id="31" w:name="Xbed8038e2bfc6adc28336f0e4406830b9b72dd2"/>
+    <w:p>
+      <w:pPr>
+        <w:pStyle w:val="Heading2"/>
+      </w:pPr>
+      <w:r>
+        <w:t xml:space="preserve">3. Чек-лист регресс-тестирования перед запуском (минимум)</w:t>
       </w:r>
     </w:p>
     <w:p>
@@ -2448,13 +2714,13 @@
         <w:pStyle w:val="Compact"/>
       </w:pPr>
       <w:r>
-        <w:t xml:space="preserve">Мониторинг первую неделю: ошибки, конверсия регистрация → бронирование</w:t>
-      </w:r>
-      <w:r>
-        <w:t xml:space="preserve"> </w:t>
-      </w:r>
-      <w:r>
-        <w:t xml:space="preserve">→ оплата.</w:t>
+        <w:t xml:space="preserve">Регистрация покупателя и продавца, подтверждение email, вход, сброс</w:t>
+      </w:r>
+      <w:r>
+        <w:t xml:space="preserve"> </w:t>
+      </w:r>
+      <w:r>
+        <w:t xml:space="preserve">пароля.</w:t>
       </w:r>
     </w:p>
     <w:p>
@@ -2466,286 +2732,110 @@
         <w:pStyle w:val="Compact"/>
       </w:pPr>
       <w:r>
-        <w:t xml:space="preserve">Возврат к пост-MVP пунктам из tz-amendments («продуктовые дополнения»:</w:t>
-      </w:r>
-      <w:r>
-        <w:t xml:space="preserve"> </w:t>
-      </w:r>
-      <w:r>
-        <w:t xml:space="preserve">двусторонние отзывы и т.п.) и к остальным пожеланиям из бэклога.</w:t>
-      </w:r>
-    </w:p>
-    <w:p>
-      <w:pPr>
-        <w:pStyle w:val="FirstParagraph"/>
-      </w:pPr>
-      <w:r>
-        <w:rPr>
-          <w:bCs/>
-          <w:b/>
-        </w:rPr>
-        <w:t xml:space="preserve">Готово:</w:t>
-      </w:r>
-      <w:r>
-        <w:t xml:space="preserve"> </w:t>
-      </w:r>
-      <w:r>
-        <w:t xml:space="preserve">канал поддержки пользователей — реализован поверх</w:t>
-      </w:r>
-      <w:r>
-        <w:t xml:space="preserve"> </w:t>
-      </w:r>
-      <w:r>
-        <w:t xml:space="preserve">существующего чата. Один аккаунт помечается флагом</w:t>
-      </w:r>
-      <w:r>
-        <w:t xml:space="preserve"> </w:t>
-      </w:r>
-      <w:r>
-        <w:rPr>
-          <w:rStyle w:val="VerbatimChar"/>
-        </w:rPr>
-        <w:t xml:space="preserve">User.isSupport</w:t>
-      </w:r>
-      <w:r>
-        <w:t xml:space="preserve"> </w:t>
-      </w:r>
-      <w:r>
-        <w:t xml:space="preserve">(сейчас — напрямую в БД, тем же способом, что и</w:t>
-      </w:r>
-      <w:r>
-        <w:t xml:space="preserve"> </w:t>
-      </w:r>
-      <w:r>
-        <w:rPr>
-          <w:rStyle w:val="VerbatimChar"/>
-        </w:rPr>
-        <w:t xml:space="preserve">isAdmin</w:t>
-      </w:r>
-      <w:r>
-        <w:t xml:space="preserve">; отдельной</w:t>
-      </w:r>
-      <w:r>
-        <w:t xml:space="preserve"> </w:t>
-      </w:r>
-      <w:r>
-        <w:t xml:space="preserve">админ-панели управления пользователями в проекте нет). Публичный</w:t>
-      </w:r>
-      <w:r>
-        <w:t xml:space="preserve"> </w:t>
-      </w:r>
-      <w:r>
-        <w:t xml:space="preserve">эндпоинт</w:t>
-      </w:r>
-      <w:r>
-        <w:t xml:space="preserve"> </w:t>
-      </w:r>
-      <w:r>
-        <w:rPr>
-          <w:rStyle w:val="VerbatimChar"/>
-        </w:rPr>
-        <w:t xml:space="preserve">GET /api/support/contact</w:t>
-      </w:r>
-      <w:r>
-        <w:t xml:space="preserve"> </w:t>
-      </w:r>
-      <w:r>
-        <w:t xml:space="preserve">отдаёт его id, плавающий</w:t>
-      </w:r>
-      <w:r>
-        <w:t xml:space="preserve"> </w:t>
-      </w:r>
-      <w:r>
-        <w:t xml:space="preserve">чат-виджет показывает закреплённую строку «Поддержка» сверху списка</w:t>
-      </w:r>
-      <w:r>
-        <w:t xml:space="preserve"> </w:t>
-      </w:r>
-      <w:r>
-        <w:t xml:space="preserve">диалогов — переиспользует уже готовую инфраструктуру чата (WS,</w:t>
-      </w:r>
-      <w:r>
-        <w:t xml:space="preserve"> </w:t>
-      </w:r>
-      <w:r>
-        <w:t xml:space="preserve">REST-фолбэк, бейдж непрочитанных), отдельной системы тикетов не</w:t>
-      </w:r>
-      <w:r>
-        <w:t xml:space="preserve"> </w:t>
-      </w:r>
-      <w:r>
-        <w:t xml:space="preserve">потребовалось. На новом сервере поддержку сейчас ведёт аккаунт</w:t>
-      </w:r>
-      <w:r>
-        <w:t xml:space="preserve"> </w:t>
-      </w:r>
-      <w:r>
-        <w:rPr>
-          <w:rStyle w:val="VerbatimChar"/>
-        </w:rPr>
-        <w:t xml:space="preserve">support@hobbyhub.ru</w:t>
-      </w:r>
-      <w:r>
-        <w:t xml:space="preserve"> </w:t>
-      </w:r>
-      <w:r>
-        <w:t xml:space="preserve">— перед реальным запуском решить, кто и по какому</w:t>
-      </w:r>
-      <w:r>
-        <w:t xml:space="preserve"> </w:t>
-      </w:r>
-      <w:r>
-        <w:t xml:space="preserve">графику на него отвечает (или завести несколько таких аккаунтов, если</w:t>
-      </w:r>
-      <w:r>
-        <w:t xml:space="preserve"> </w:t>
-      </w:r>
-      <w:r>
-        <w:t xml:space="preserve">нагрузка потребует).</w:t>
-      </w:r>
-    </w:p>
-    <w:bookmarkEnd w:id="29"/>
-    <w:bookmarkEnd w:id="30"/>
-    <w:bookmarkStart w:id="31" w:name="Xbed8038e2bfc6adc28336f0e4406830b9b72dd2"/>
-    <w:p>
-      <w:pPr>
-        <w:pStyle w:val="Heading2"/>
-      </w:pPr>
-      <w:r>
-        <w:t xml:space="preserve">3. Чек-лист регресс-тестирования перед запуском (минимум)</w:t>
+        <w:t xml:space="preserve">Создание услуги продавцом → прохождение модерации → публикация.</w:t>
       </w:r>
     </w:p>
     <w:p>
       <w:pPr>
         <w:numPr>
           <w:ilvl w:val="0"/>
-          <w:numId w:val="1007"/>
+          <w:numId w:val="1006"/>
         </w:numPr>
         <w:pStyle w:val="Compact"/>
       </w:pPr>
       <w:r>
-        <w:t xml:space="preserve">Регистрация покупателя и продавца, подтверждение email, вход, сброс</w:t>
-      </w:r>
-      <w:r>
-        <w:t xml:space="preserve"> </w:t>
-      </w:r>
-      <w:r>
-        <w:t xml:space="preserve">пароля.</w:t>
+        <w:t xml:space="preserve">Поиск/фильтрация в каталоге, просмотр на карте.</w:t>
       </w:r>
     </w:p>
     <w:p>
       <w:pPr>
         <w:numPr>
           <w:ilvl w:val="0"/>
-          <w:numId w:val="1007"/>
+          <w:numId w:val="1006"/>
         </w:numPr>
         <w:pStyle w:val="Compact"/>
       </w:pPr>
       <w:r>
-        <w:t xml:space="preserve">Создание услуги продавцом → прохождение модерации → публикация.</w:t>
+        <w:t xml:space="preserve">Бронирование по слотам (включая групповую вместимость) и по запросу.</w:t>
       </w:r>
     </w:p>
     <w:p>
       <w:pPr>
         <w:numPr>
           <w:ilvl w:val="0"/>
-          <w:numId w:val="1007"/>
+          <w:numId w:val="1006"/>
         </w:numPr>
         <w:pStyle w:val="Compact"/>
       </w:pPr>
       <w:r>
-        <w:t xml:space="preserve">Поиск/фильтрация в каталоге, просмотр на карте.</w:t>
+        <w:t xml:space="preserve">Полный цикл оплаты: холдирование → подтверждение продавцом →</w:t>
+      </w:r>
+      <w:r>
+        <w:t xml:space="preserve"> </w:t>
+      </w:r>
+      <w:r>
+        <w:t xml:space="preserve">освобождение эскроу → чек покупателю.</w:t>
       </w:r>
     </w:p>
     <w:p>
       <w:pPr>
         <w:numPr>
           <w:ilvl w:val="0"/>
-          <w:numId w:val="1007"/>
+          <w:numId w:val="1006"/>
         </w:numPr>
         <w:pStyle w:val="Compact"/>
       </w:pPr>
       <w:r>
-        <w:t xml:space="preserve">Бронирование по слотам (включая групповую вместимость) и по запросу.</w:t>
+        <w:t xml:space="preserve">Отмена брони, спор, разрешение спора администратором.</w:t>
       </w:r>
     </w:p>
     <w:p>
       <w:pPr>
         <w:numPr>
           <w:ilvl w:val="0"/>
-          <w:numId w:val="1007"/>
+          <w:numId w:val="1006"/>
         </w:numPr>
         <w:pStyle w:val="Compact"/>
       </w:pPr>
       <w:r>
-        <w:t xml:space="preserve">Полный цикл оплаты: холдирование → подтверждение продавцом →</w:t>
-      </w:r>
-      <w:r>
-        <w:t xml:space="preserve"> </w:t>
-      </w:r>
-      <w:r>
-        <w:t xml:space="preserve">освобождение эскроу → чек покупателю.</w:t>
+        <w:t xml:space="preserve">Чат: сообщения, жалоба на сообщение, плавающий виджет и полная</w:t>
+      </w:r>
+      <w:r>
+        <w:t xml:space="preserve"> </w:t>
+      </w:r>
+      <w:r>
+        <w:t xml:space="preserve">страница.</w:t>
       </w:r>
     </w:p>
     <w:p>
       <w:pPr>
         <w:numPr>
           <w:ilvl w:val="0"/>
-          <w:numId w:val="1007"/>
+          <w:numId w:val="1006"/>
         </w:numPr>
         <w:pStyle w:val="Compact"/>
       </w:pPr>
       <w:r>
-        <w:t xml:space="preserve">Отмена брони, спор, разрешение спора администратором.</w:t>
+        <w:t xml:space="preserve">Отзыв после завершения заказа, ответ продавца на отзыв.</w:t>
       </w:r>
     </w:p>
     <w:p>
       <w:pPr>
         <w:numPr>
           <w:ilvl w:val="0"/>
-          <w:numId w:val="1007"/>
+          <w:numId w:val="1006"/>
         </w:numPr>
         <w:pStyle w:val="Compact"/>
       </w:pPr>
       <w:r>
-        <w:t xml:space="preserve">Чат: сообщения, жалоба на сообщение, плавающий виджет и полная</w:t>
-      </w:r>
-      <w:r>
-        <w:t xml:space="preserve"> </w:t>
-      </w:r>
-      <w:r>
-        <w:t xml:space="preserve">страница.</w:t>
+        <w:t xml:space="preserve">Избранное: добавление, счётчик у продавца.</w:t>
       </w:r>
     </w:p>
     <w:p>
       <w:pPr>
         <w:numPr>
           <w:ilvl w:val="0"/>
-          <w:numId w:val="1007"/>
-        </w:numPr>
-        <w:pStyle w:val="Compact"/>
-      </w:pPr>
-      <w:r>
-        <w:t xml:space="preserve">Отзыв после завершения заказа, ответ продавца на отзыв.</w:t>
-      </w:r>
-    </w:p>
-    <w:p>
-      <w:pPr>
-        <w:numPr>
-          <w:ilvl w:val="0"/>
-          <w:numId w:val="1007"/>
-        </w:numPr>
-        <w:pStyle w:val="Compact"/>
-      </w:pPr>
-      <w:r>
-        <w:t xml:space="preserve">Избранное: добавление, счётчик у продавца.</w:t>
-      </w:r>
-    </w:p>
-    <w:p>
-      <w:pPr>
-        <w:numPr>
-          <w:ilvl w:val="0"/>
-          <w:numId w:val="1007"/>
+          <w:numId w:val="1006"/>
         </w:numPr>
         <w:pStyle w:val="Compact"/>
       </w:pPr>
@@ -2998,9 +3088,6 @@
     <w:abstractNumId w:val="991"/>
   </w:num>
   <w:num w:numId="1006">
-    <w:abstractNumId w:val="991"/>
-  </w:num>
-  <w:num w:numId="1007">
     <w:abstractNumId w:val="991"/>
   </w:num>
 </w:numbering>

</xml_diff>

<commit_message>
Update release plan: email done, push/reschedule shipped, security fixes since audit
</commit_message>
<xml_diff>
--- a/docs/release-plan.docx
+++ b/docs/release-plan.docx
@@ -24,7 +24,7 @@
         <w:pStyle w:val="FirstParagraph"/>
       </w:pPr>
       <w:r>
-        <w:t xml:space="preserve">Статус на 2026-08-28. Документ описывает путь от текущего состояния до</w:t>
+        <w:t xml:space="preserve">Статус на 2026-09-23. Документ описывает путь от текущего состояния до</w:t>
       </w:r>
       <w:r>
         <w:t xml:space="preserve"> </w:t>
@@ -74,19 +74,31 @@
         <w:pStyle w:val="FirstParagraph"/>
       </w:pPr>
       <w:r>
-        <w:t xml:space="preserve">Функционально MVP закрывает весь исходный скоуп: регистрация/auth,</w:t>
-      </w:r>
-      <w:r>
-        <w:t xml:space="preserve"> </w:t>
-      </w:r>
-      <w:r>
-        <w:t xml:space="preserve">каталог с поиском/фильтрами/картой, бронирование по слотам и по запросу</w:t>
-      </w:r>
-      <w:r>
-        <w:t xml:space="preserve"> </w:t>
-      </w:r>
-      <w:r>
-        <w:t xml:space="preserve">(включая групповую вместимость), эскроу-платежи (за абстракцией</w:t>
+        <w:t xml:space="preserve">Функционально MVP закрывает исходный скоуп и заметно вырос сверх него:</w:t>
+      </w:r>
+      <w:r>
+        <w:t xml:space="preserve"> </w:t>
+      </w:r>
+      <w:r>
+        <w:t xml:space="preserve">регистрация/auth (с рабочим подтверждением email и сбросом пароля по</w:t>
+      </w:r>
+      <w:r>
+        <w:t xml:space="preserve"> </w:t>
+      </w:r>
+      <w:r>
+        <w:t xml:space="preserve">почте), каталог с поиском/фильтрами/картой, бронирование по слотам и по</w:t>
+      </w:r>
+      <w:r>
+        <w:t xml:space="preserve"> </w:t>
+      </w:r>
+      <w:r>
+        <w:t xml:space="preserve">запросу (включая групповую вместимость и перенос даты с подтверждением</w:t>
+      </w:r>
+      <w:r>
+        <w:t xml:space="preserve"> </w:t>
+      </w:r>
+      <w:r>
+        <w:t xml:space="preserve">покупателя), эскроу-платежи (за абстракцией</w:t>
       </w:r>
       <w:r>
         <w:t xml:space="preserve"> </w:t>
@@ -98,19 +110,31 @@
         <w:t xml:space="preserve">PaymentProvider</w:t>
       </w:r>
       <w:r>
-        <w:t xml:space="preserve">), отзывы, чат (включая плавающий виджет и канал</w:t>
-      </w:r>
-      <w:r>
-        <w:t xml:space="preserve"> </w:t>
-      </w:r>
-      <w:r>
-        <w:t xml:space="preserve">поддержки), избранное, модерация объявлений админом, профили продавцов,</w:t>
-      </w:r>
-      <w:r>
-        <w:t xml:space="preserve"> </w:t>
-      </w:r>
-      <w:r>
-        <w:t xml:space="preserve">уведомления.</w:t>
+        <w:t xml:space="preserve">), отзывы,</w:t>
+      </w:r>
+      <w:r>
+        <w:t xml:space="preserve"> </w:t>
+      </w:r>
+      <w:r>
+        <w:t xml:space="preserve">чат (плавающий виджет, канал поддержки, email/push при новом сообщении</w:t>
+      </w:r>
+      <w:r>
+        <w:t xml:space="preserve"> </w:t>
+      </w:r>
+      <w:r>
+        <w:t xml:space="preserve">получателю не в сети), избранное, модерация объявлений админом (с</w:t>
+      </w:r>
+      <w:r>
+        <w:t xml:space="preserve"> </w:t>
+      </w:r>
+      <w:r>
+        <w:t xml:space="preserve">поиском/фильтрами и предпросмотром фото), профили продавцов,</w:t>
+      </w:r>
+      <w:r>
+        <w:t xml:space="preserve"> </w:t>
+      </w:r>
+      <w:r>
+        <w:t xml:space="preserve">in-app + email + Web Push уведомления.</w:t>
       </w:r>
     </w:p>
     <w:p>
@@ -118,13 +142,7 @@
         <w:pStyle w:val="BodyText"/>
       </w:pPr>
       <w:r>
-        <w:t xml:space="preserve">С 2026-08-27 сайт живёт не на dev-сервере за туннелем, а на выделенном</w:t>
-      </w:r>
-      <w:r>
-        <w:t xml:space="preserve"> </w:t>
-      </w:r>
-      <w:r>
-        <w:t xml:space="preserve">сервере (Timeweb) под собственным доменом</w:t>
+        <w:t xml:space="preserve">Сайт живёт на выделенном сервере (Timeweb) под собственным доменом</w:t>
       </w:r>
       <w:r>
         <w:t xml:space="preserve"> </w:t>
@@ -137,25 +155,19 @@
         <w:t xml:space="preserve">hobbyhub.ru</w:t>
       </w:r>
       <w:r>
-        <w:t xml:space="preserve">, с настоящим</w:t>
-      </w:r>
-      <w:r>
-        <w:t xml:space="preserve"> </w:t>
-      </w:r>
-      <w:r>
-        <w:t xml:space="preserve">TLS-сертификатом (Let’s Encrypt через Caddy, автообновление). Backend и</w:t>
-      </w:r>
-      <w:r>
-        <w:t xml:space="preserve"> </w:t>
-      </w:r>
-      <w:r>
-        <w:t xml:space="preserve">frontend собраны в прод-режиме и запущены через systemd под отдельным</w:t>
-      </w:r>
-      <w:r>
-        <w:t xml:space="preserve"> </w:t>
-      </w:r>
-      <w:r>
-        <w:t xml:space="preserve">непривилегированным пользователем</w:t>
+        <w:t xml:space="preserve">, с настоящим TLS-сертификатом (Let’s Encrypt через</w:t>
+      </w:r>
+      <w:r>
+        <w:t xml:space="preserve"> </w:t>
+      </w:r>
+      <w:r>
+        <w:t xml:space="preserve">Caddy, автообновление). Backend и frontend собраны в прод-режиме и</w:t>
+      </w:r>
+      <w:r>
+        <w:t xml:space="preserve"> </w:t>
+      </w:r>
+      <w:r>
+        <w:t xml:space="preserve">запущены через systemd под отдельным непривилегированным пользователем</w:t>
       </w:r>
       <w:r>
         <w:t xml:space="preserve"> </w:t>
@@ -170,17 +182,31 @@
         <w:t xml:space="preserve"> </w:t>
       </w:r>
       <w:r>
-        <w:t xml:space="preserve">(не root). По итогам</w:t>
-      </w:r>
-      <w:r>
-        <w:t xml:space="preserve"> </w:t>
-      </w:r>
-      <w:r>
-        <w:t xml:space="preserve">аудита безопасности 2026-08-27 закрыт ряд находок (детали — Фаза 5).</w:t>
-      </w:r>
-      <w:r>
-        <w:t xml:space="preserve"> </w:t>
-      </w:r>
+        <w:t xml:space="preserve">(не root). Реальная отправка почты работает (SMTP через</w:t>
+      </w:r>
+      <w:r>
+        <w:t xml:space="preserve"> </w:t>
+      </w:r>
+      <w:r>
+        <w:t xml:space="preserve">Timeweb, порт 587). Прошёл полный аудит безопасности и несколько раундов</w:t>
+      </w:r>
+      <w:r>
+        <w:t xml:space="preserve"> </w:t>
+      </w:r>
+      <w:r>
+        <w:t xml:space="preserve">находок по ходу использования (детали — Фаза 5), у меня есть прямой SSH-</w:t>
+      </w:r>
+      <w:r>
+        <w:t xml:space="preserve"> </w:t>
+      </w:r>
+      <w:r>
+        <w:t xml:space="preserve">доступ к серверу для дальнейших правок и диагностики.</w:t>
+      </w:r>
+    </w:p>
+    <w:p>
+      <w:pPr>
+        <w:pStyle w:val="BodyText"/>
+      </w:pPr>
       <w:r>
         <w:t xml:space="preserve">Пока нет реального платёжного провайдера — оформление брони временно</w:t>
       </w:r>
@@ -209,7 +235,25 @@
         <w:t xml:space="preserve"> </w:t>
       </w:r>
       <w:r>
-        <w:t xml:space="preserve">проверки UX и контента, но без реальных сделок).</w:t>
+        <w:t xml:space="preserve">проверки UX и контента, но без реальных сделок). Карта не показывает</w:t>
+      </w:r>
+      <w:r>
+        <w:t xml:space="preserve"> </w:t>
+      </w:r>
+      <w:r>
+        <w:t xml:space="preserve">услуги — нет реальных ключей Яндекса (Maps JS + Geocoder), это единственная</w:t>
+      </w:r>
+      <w:r>
+        <w:t xml:space="preserve"> </w:t>
+      </w:r>
+      <w:r>
+        <w:t xml:space="preserve">чисто техническая недоделка без внешней зависимости от юр./платёжных</w:t>
+      </w:r>
+      <w:r>
+        <w:t xml:space="preserve"> </w:t>
+      </w:r>
+      <w:r>
+        <w:t xml:space="preserve">вопросов.</w:t>
       </w:r>
     </w:p>
     <w:p>
@@ -217,13 +261,19 @@
         <w:pStyle w:val="BodyText"/>
       </w:pPr>
       <w:r>
-        <w:t xml:space="preserve">Это значит, что релиз — это в основном не «дописать функциональность»,</w:t>
-      </w:r>
-      <w:r>
-        <w:t xml:space="preserve"> </w:t>
-      </w:r>
-      <w:r>
-        <w:t xml:space="preserve">а закрыть юридические, платёжные и надёжностные пробелы ниже.</w:t>
+        <w:t xml:space="preserve">Это значит, что до реального публичного запуска остаются в основном</w:t>
+      </w:r>
+      <w:r>
+        <w:t xml:space="preserve"> </w:t>
+      </w:r>
+      <w:r>
+        <w:t xml:space="preserve">юридические и платёжные пробелы, плюс эксплуатационная база (бэкапы,</w:t>
+      </w:r>
+      <w:r>
+        <w:t xml:space="preserve"> </w:t>
+      </w:r>
+      <w:r>
+        <w:t xml:space="preserve">мониторинг, тесты) — ниже.</w:t>
       </w:r>
     </w:p>
     <w:bookmarkEnd w:id="20"/>
@@ -311,6 +361,9 @@
               <w:jc w:val="left"/>
             </w:pPr>
             <w:r>
+              <w:rPr>
+                <w:strike/>
+              </w:rPr>
               <w:t xml:space="preserve">1</w:t>
             </w:r>
           </w:p>
@@ -323,7 +376,26 @@
               <w:jc w:val="left"/>
             </w:pPr>
             <w:r>
+              <w:rPr>
+                <w:strike/>
+              </w:rPr>
               <w:t xml:space="preserve">Email — заглушка</w:t>
+            </w:r>
+            <w:r>
+              <w:t xml:space="preserve"> </w:t>
+            </w:r>
+            <w:r>
+              <w:t xml:space="preserve">—</w:t>
+            </w:r>
+            <w:r>
+              <w:t xml:space="preserve"> </w:t>
+            </w:r>
+            <w:r>
+              <w:rPr>
+                <w:bCs/>
+                <w:b/>
+              </w:rPr>
+              <w:t xml:space="preserve">готово</w:t>
             </w:r>
           </w:p>
         </w:tc>
@@ -338,13 +410,13 @@
               <w:rPr>
                 <w:rStyle w:val="VerbatimChar"/>
               </w:rPr>
-              <w:t xml:space="preserve">backend/src/mail/mail.service.ts</w:t>
+              <w:t xml:space="preserve">mail.service.ts</w:t>
             </w:r>
             <w:r>
               <w:t xml:space="preserve"> </w:t>
             </w:r>
             <w:r>
-              <w:t xml:space="preserve">только логирует письма, ничего не отправляет</w:t>
+              <w:t xml:space="preserve">шлёт через SMTP (Timeweb, порт 587)</w:t>
             </w:r>
           </w:p>
         </w:tc>
@@ -356,7 +428,7 @@
               <w:jc w:val="left"/>
             </w:pPr>
             <w:r>
-              <w:t xml:space="preserve">Подтверждение email и восстановление пароля физически не работают для реальных пользователей. Домен уже есть (блокер №6 закрыт) — прежняя причина отложить пункт больше не действует, можно начинать</w:t>
+              <w:t xml:space="preserve">Подтверждение email и восстановление пароля реально работают, проверено на проде</w:t>
             </w:r>
           </w:p>
         </w:tc>
@@ -465,7 +537,22 @@
               <w:jc w:val="left"/>
             </w:pPr>
             <w:r>
-              <w:t xml:space="preserve">—</w:t>
+              <w:t xml:space="preserve">Черновики в</w:t>
+            </w:r>
+            <w:r>
+              <w:t xml:space="preserve"> </w:t>
+            </w:r>
+            <w:r>
+              <w:rPr>
+                <w:rStyle w:val="VerbatimChar"/>
+              </w:rPr>
+              <w:t xml:space="preserve">docs/legal/</w:t>
+            </w:r>
+            <w:r>
+              <w:t xml:space="preserve"> </w:t>
+            </w:r>
+            <w:r>
+              <w:t xml:space="preserve">готовы, юристом не проверены, на сайте не опубликованы</w:t>
             </w:r>
           </w:p>
         </w:tc>
@@ -797,7 +884,7 @@
               <w:jc w:val="left"/>
             </w:pPr>
             <w:r>
-              <w:t xml:space="preserve">Новый сервер стартовал с чистой БД, но за время публичного тестирования уже накопились реальные тестовые аккаунты/брони</w:t>
+              <w:t xml:space="preserve">За время публичного тестирования накопились тестовые аккаунты/брони</w:t>
             </w:r>
           </w:p>
         </w:tc>
@@ -809,7 +896,75 @@
               <w:jc w:val="left"/>
             </w:pPr>
             <w:r>
-              <w:t xml:space="preserve">Перед широким анонсом — почистить; ниже, не растёт критично, пока сайт не мягкого-запущен</w:t>
+              <w:t xml:space="preserve">Перед широким анонсом — почистить; не растёт критично, пока сайт не мягкого-запущен</w:t>
+            </w:r>
+          </w:p>
+        </w:tc>
+      </w:tr>
+      <w:tr>
+        <w:tc>
+          <w:tcPr/>
+          <w:p>
+            <w:pPr>
+              <w:pStyle w:val="Compact"/>
+              <w:jc w:val="left"/>
+            </w:pPr>
+            <w:r>
+              <w:t xml:space="preserve">8</w:t>
+            </w:r>
+          </w:p>
+        </w:tc>
+        <w:tc>
+          <w:tcPr/>
+          <w:p>
+            <w:pPr>
+              <w:pStyle w:val="Compact"/>
+              <w:jc w:val="left"/>
+            </w:pPr>
+            <w:r>
+              <w:t xml:space="preserve">Карта не показывает услуги</w:t>
+            </w:r>
+          </w:p>
+        </w:tc>
+        <w:tc>
+          <w:tcPr/>
+          <w:p>
+            <w:pPr>
+              <w:pStyle w:val="Compact"/>
+              <w:jc w:val="left"/>
+            </w:pPr>
+            <w:r>
+              <w:rPr>
+                <w:rStyle w:val="VerbatimChar"/>
+              </w:rPr>
+              <w:t xml:space="preserve">NEXT_PUBLIC_YANDEX_MAPS_API_KEY</w:t>
+            </w:r>
+            <w:r>
+              <w:t xml:space="preserve">/</w:t>
+            </w:r>
+            <w:r>
+              <w:rPr>
+                <w:rStyle w:val="VerbatimChar"/>
+              </w:rPr>
+              <w:t xml:space="preserve">YANDEX_GEOCODER_API_KEY</w:t>
+            </w:r>
+            <w:r>
+              <w:t xml:space="preserve"> </w:t>
+            </w:r>
+            <w:r>
+              <w:t xml:space="preserve">— заглушки</w:t>
+            </w:r>
+          </w:p>
+        </w:tc>
+        <w:tc>
+          <w:tcPr/>
+          <w:p>
+            <w:pPr>
+              <w:pStyle w:val="Compact"/>
+              <w:jc w:val="left"/>
+            </w:pPr>
+            <w:r>
+              <w:t xml:space="preserve">Нет реальных ключей Яндекса — ни геокодирование адресов, ни сама карта не работают. Чисто техническая правка (проставить ключи), ждём ключи от вас</w:t>
             </w:r>
           </w:p>
         </w:tc>
@@ -1469,7 +1624,7 @@
           <w:bCs/>
           <w:b/>
         </w:rPr>
-        <w:t xml:space="preserve">Готово (2026-08-28):</w:t>
+        <w:t xml:space="preserve">Готово (2026-09-22):</w:t>
       </w:r>
       <w:r>
         <w:t xml:space="preserve"> </w:t>
@@ -1484,85 +1639,31 @@
         <w:t xml:space="preserve"> </w:t>
       </w:r>
       <w:r>
-        <w:t xml:space="preserve">переписан на реальную отправку</w:t>
-      </w:r>
-      <w:r>
-        <w:t xml:space="preserve"> </w:t>
-      </w:r>
-      <w:r>
-        <w:t xml:space="preserve">через SMTP (nodemailer), почтовый ящик</w:t>
-      </w:r>
-      <w:r>
-        <w:t xml:space="preserve"> </w:t>
-      </w:r>
-      <w:r>
-        <w:rPr>
-          <w:rStyle w:val="VerbatimChar"/>
-        </w:rPr>
-        <w:t xml:space="preserve">support@hobbyhub.ru</w:t>
-      </w:r>
-      <w:r>
-        <w:t xml:space="preserve"> </w:t>
-      </w:r>
-      <w:r>
-        <w:t xml:space="preserve">заведён в</w:t>
-      </w:r>
-      <w:r>
-        <w:t xml:space="preserve"> </w:t>
-      </w:r>
-      <w:r>
-        <w:t xml:space="preserve">Timeweb (DKIM у Timeweb настраивается автоматически при делегировании</w:t>
-      </w:r>
-      <w:r>
-        <w:t xml:space="preserve"> </w:t>
-      </w:r>
-      <w:r>
-        <w:t xml:space="preserve">NS на Timeweb — уже так и есть). Заодно обнаружилось и закрыто: у</w:t>
-      </w:r>
-      <w:r>
-        <w:t xml:space="preserve"> </w:t>
-      </w:r>
-      <w:r>
-        <w:t xml:space="preserve">бэкенда были рабочие эндпоинты</w:t>
-      </w:r>
-      <w:r>
-        <w:t xml:space="preserve"> </w:t>
-      </w:r>
-      <w:r>
-        <w:rPr>
-          <w:rStyle w:val="VerbatimChar"/>
-        </w:rPr>
-        <w:t xml:space="preserve">forgot-password</w:t>
-      </w:r>
-      <w:r>
-        <w:t xml:space="preserve">/</w:t>
-      </w:r>
-      <w:r>
-        <w:rPr>
-          <w:rStyle w:val="VerbatimChar"/>
-        </w:rPr>
-        <w:t xml:space="preserve">reset-password</w:t>
-      </w:r>
-      <w:r>
-        <w:t xml:space="preserve">/</w:t>
-      </w:r>
-      <w:r>
-        <w:t xml:space="preserve"> </w:t>
-      </w:r>
-      <w:r>
-        <w:rPr>
-          <w:rStyle w:val="VerbatimChar"/>
-        </w:rPr>
-        <w:t xml:space="preserve">verify-email</w:t>
-      </w:r>
-      <w:r>
-        <w:t xml:space="preserve">, но на фронтенде не было ни одной страницы под них —</w:t>
-      </w:r>
-      <w:r>
-        <w:t xml:space="preserve"> </w:t>
-      </w:r>
-      <w:r>
-        <w:t xml:space="preserve">письма со ссылками вели бы в никуда. Добавлены страницы</w:t>
+        <w:t xml:space="preserve">шлёт реальные письма через SMTP</w:t>
+      </w:r>
+      <w:r>
+        <w:t xml:space="preserve"> </w:t>
+      </w:r>
+      <w:r>
+        <w:t xml:space="preserve">(nodemailer, Timeweb, порт 587 — 465 у них зависал на TLS-хендшейке,</w:t>
+      </w:r>
+      <w:r>
+        <w:t xml:space="preserve"> </w:t>
+      </w:r>
+      <w:r>
+        <w:t xml:space="preserve">эмпирически найдено и переключено). Письмо не блокирует ответ пользователю</w:t>
+      </w:r>
+      <w:r>
+        <w:t xml:space="preserve"> </w:t>
+      </w:r>
+      <w:r>
+        <w:t xml:space="preserve">(фоновая отправка + короткие таймауты) — раньше зависший SMTP держал</w:t>
+      </w:r>
+      <w:r>
+        <w:t xml:space="preserve"> </w:t>
+      </w:r>
+      <w:r>
+        <w:t xml:space="preserve">регистрацию по 30 секунд, пока прокси не обрывал запрос. Страницы</w:t>
       </w:r>
       <w:r>
         <w:t xml:space="preserve"> </w:t>
@@ -1601,13 +1702,31 @@
         <w:t xml:space="preserve"> </w:t>
       </w:r>
       <w:r>
-        <w:t xml:space="preserve">+ ссылка «Забыли</w:t>
-      </w:r>
-      <w:r>
-        <w:t xml:space="preserve"> </w:t>
-      </w:r>
-      <w:r>
-        <w:t xml:space="preserve">пароль?» на странице входа.</w:t>
+        <w:t xml:space="preserve">+ повторная отправка</w:t>
+      </w:r>
+      <w:r>
+        <w:t xml:space="preserve"> </w:t>
+      </w:r>
+      <w:r>
+        <w:t xml:space="preserve">письма подтверждения (кнопка в профиле) — всё на месте и проверено на</w:t>
+      </w:r>
+      <w:r>
+        <w:t xml:space="preserve"> </w:t>
+      </w:r>
+      <w:r>
+        <w:t xml:space="preserve">проде сквозным тестом. SPF у Timeweb настраивается автоматически при</w:t>
+      </w:r>
+      <w:r>
+        <w:t xml:space="preserve"> </w:t>
+      </w:r>
+      <w:r>
+        <w:t xml:space="preserve">делегировании NS на Timeweb (уже так и есть) — отдельно проверять не</w:t>
+      </w:r>
+      <w:r>
+        <w:t xml:space="preserve"> </w:t>
+      </w:r>
+      <w:r>
+        <w:t xml:space="preserve">пришлось.</w:t>
       </w:r>
     </w:p>
     <w:p>
@@ -1615,94 +1734,19 @@
         <w:pStyle w:val="BodyText"/>
       </w:pPr>
       <w:r>
-        <w:t xml:space="preserve">Осталось:</w:t>
-      </w:r>
-      <w:r>
-        <w:t xml:space="preserve"> </w:t>
-      </w:r>
-      <w:r>
-        <w:t xml:space="preserve">- На сервере в</w:t>
-      </w:r>
-      <w:r>
-        <w:t xml:space="preserve"> </w:t>
-      </w:r>
-      <w:r>
-        <w:rPr>
-          <w:rStyle w:val="VerbatimChar"/>
-        </w:rPr>
-        <w:t xml:space="preserve">backend/.env</w:t>
-      </w:r>
-      <w:r>
-        <w:t xml:space="preserve"> </w:t>
-      </w:r>
-      <w:r>
-        <w:t xml:space="preserve">прописать</w:t>
-      </w:r>
-      <w:r>
-        <w:t xml:space="preserve"> </w:t>
-      </w:r>
-      <w:r>
-        <w:rPr>
-          <w:rStyle w:val="VerbatimChar"/>
-        </w:rPr>
-        <w:t xml:space="preserve">SMTP_PASSWORD</w:t>
-      </w:r>
-      <w:r>
-        <w:t xml:space="preserve"> </w:t>
-      </w:r>
-      <w:r>
-        <w:t xml:space="preserve">от ящика</w:t>
-      </w:r>
-      <w:r>
-        <w:t xml:space="preserve"> </w:t>
-      </w:r>
-      <w:r>
-        <w:rPr>
-          <w:rStyle w:val="VerbatimChar"/>
-        </w:rPr>
-        <w:t xml:space="preserve">support@hobbyhub.ru</w:t>
-      </w:r>
-      <w:r>
-        <w:t xml:space="preserve"> </w:t>
-      </w:r>
-      <w:r>
-        <w:t xml:space="preserve">(пароль приложения/SMTP, не обычный пароль веб-почты,</w:t>
-      </w:r>
-      <w:r>
-        <w:t xml:space="preserve"> </w:t>
-      </w:r>
-      <w:r>
-        <w:t xml:space="preserve">если Timeweb их разделяет — проверить в панели) и передеплоить.</w:t>
-      </w:r>
-      <w:r>
-        <w:t xml:space="preserve"> </w:t>
-      </w:r>
-      <w:r>
-        <w:t xml:space="preserve">- Проверить SPF (Timeweb требует конкретную запись — см. их документацию</w:t>
-      </w:r>
-      <w:r>
-        <w:t xml:space="preserve"> </w:t>
-      </w:r>
-      <w:r>
-        <w:t xml:space="preserve">по DKIM/SPF) и DMARC — иначе письма будут попадать в спам даже при</w:t>
-      </w:r>
-      <w:r>
-        <w:t xml:space="preserve"> </w:t>
-      </w:r>
-      <w:r>
-        <w:t xml:space="preserve">рабочем SMTP.</w:t>
-      </w:r>
-      <w:r>
-        <w:t xml:space="preserve"> </w:t>
-      </w:r>
-      <w:r>
-        <w:t xml:space="preserve">- Прогнать реальный тест: регистрация → письмо пришло → ссылка работает</w:t>
-      </w:r>
-      <w:r>
-        <w:t xml:space="preserve"> </w:t>
-      </w:r>
-      <w:r>
-        <w:t xml:space="preserve">→ email подтверждён; то же для сброса пароля.</w:t>
+        <w:t xml:space="preserve">Остаётся на будущее, не блокирует: DMARC-запись отдельно не проверялась</w:t>
+      </w:r>
+      <w:r>
+        <w:t xml:space="preserve"> </w:t>
+      </w:r>
+      <w:r>
+        <w:t xml:space="preserve">(SPF+DKIM обычно достаточно для базовой доставляемости, но при росте</w:t>
+      </w:r>
+      <w:r>
+        <w:t xml:space="preserve"> </w:t>
+      </w:r>
+      <w:r>
+        <w:t xml:space="preserve">объёма писем стоит свериться).</w:t>
       </w:r>
     </w:p>
     <w:bookmarkEnd w:id="25"/>
@@ -2184,6 +2228,144 @@
       </w:r>
       <w:r>
         <w:t xml:space="preserve">.</w:t>
+      </w:r>
+    </w:p>
+    <w:p>
+      <w:pPr>
+        <w:pStyle w:val="BodyText"/>
+      </w:pPr>
+      <w:r>
+        <w:rPr>
+          <w:bCs/>
+          <w:b/>
+        </w:rPr>
+        <w:t xml:space="preserve">Дополнительно найдено и исправлено по ходу использования (2026-09):</w:t>
+      </w:r>
+      <w:r>
+        <w:t xml:space="preserve"> </w:t>
+      </w:r>
+      <w:r>
+        <w:t xml:space="preserve">- Удаление аккаунта: реальный</w:t>
+      </w:r>
+      <w:r>
+        <w:t xml:space="preserve"> </w:t>
+      </w:r>
+      <w:r>
+        <w:rPr>
+          <w:rStyle w:val="VerbatimChar"/>
+        </w:rPr>
+        <w:t xml:space="preserve">DELETE</w:t>
+      </w:r>
+      <w:r>
+        <w:t xml:space="preserve"> </w:t>
+      </w:r>
+      <w:r>
+        <w:t xml:space="preserve">упал бы на внешних ключах у брони</w:t>
+      </w:r>
+      <w:r>
+        <w:t xml:space="preserve"> </w:t>
+      </w:r>
+      <w:r>
+        <w:t xml:space="preserve">(</w:t>
+      </w:r>
+      <w:r>
+        <w:rPr>
+          <w:rStyle w:val="VerbatimChar"/>
+        </w:rPr>
+        <w:t xml:space="preserve">ON DELETE RESTRICT</w:t>
+      </w:r>
+      <w:r>
+        <w:t xml:space="preserve">) или тихо снёс бы чужие данные там, где каскад</w:t>
+      </w:r>
+      <w:r>
+        <w:t xml:space="preserve"> </w:t>
+      </w:r>
+      <w:r>
+        <w:t xml:space="preserve">разрешён (отзывы, переписка) — заменено на анонимизацию с сохранением</w:t>
+      </w:r>
+      <w:r>
+        <w:t xml:space="preserve"> </w:t>
+      </w:r>
+      <w:r>
+        <w:t xml:space="preserve">строки.</w:t>
+      </w:r>
+      <w:r>
+        <w:t xml:space="preserve"> </w:t>
+      </w:r>
+      <w:r>
+        <w:t xml:space="preserve">-</w:t>
+      </w:r>
+      <w:r>
+        <w:t xml:space="preserve"> </w:t>
+      </w:r>
+      <w:r>
+        <w:rPr>
+          <w:rStyle w:val="VerbatimChar"/>
+        </w:rPr>
+        <w:t xml:space="preserve">accessToken</w:t>
+      </w:r>
+      <w:r>
+        <w:t xml:space="preserve"> </w:t>
+      </w:r>
+      <w:r>
+        <w:t xml:space="preserve">(15 мин) истекал без обновления по</w:t>
+      </w:r>
+      <w:r>
+        <w:t xml:space="preserve"> </w:t>
+      </w:r>
+      <w:r>
+        <w:rPr>
+          <w:rStyle w:val="VerbatimChar"/>
+        </w:rPr>
+        <w:t xml:space="preserve">refreshToken</w:t>
+      </w:r>
+      <w:r>
+        <w:t xml:space="preserve"> </w:t>
+      </w:r>
+      <w:r>
+        <w:t xml:space="preserve">—</w:t>
+      </w:r>
+      <w:r>
+        <w:t xml:space="preserve"> </w:t>
+      </w:r>
+      <w:r>
+        <w:t xml:space="preserve">выглядело как случайный выход из аккаунта на любой активной сессии</w:t>
+      </w:r>
+      <w:r>
+        <w:t xml:space="preserve"> </w:t>
+      </w:r>
+      <w:r>
+        <w:t xml:space="preserve">дольше 15 минут. Добавлено прозрачное обновление токена на 401.</w:t>
+      </w:r>
+      <w:r>
+        <w:t xml:space="preserve"> </w:t>
+      </w:r>
+      <w:r>
+        <w:t xml:space="preserve">- Бронирование/создание услуги теперь требует подтверждённый email</w:t>
+      </w:r>
+      <w:r>
+        <w:t xml:space="preserve"> </w:t>
+      </w:r>
+      <w:r>
+        <w:t xml:space="preserve">(раньше подтверждение было чисто декоративным, никак не проверялось).</w:t>
+      </w:r>
+      <w:r>
+        <w:t xml:space="preserve"> </w:t>
+      </w:r>
+      <w:r>
+        <w:t xml:space="preserve">- Три типа уведомлений для переноса брони существовали только в</w:t>
+      </w:r>
+      <w:r>
+        <w:t xml:space="preserve"> </w:t>
+      </w:r>
+      <w:r>
+        <w:t xml:space="preserve">TS-коде, не в реальном Postgres enum — падали бы при первом</w:t>
+      </w:r>
+      <w:r>
+        <w:t xml:space="preserve"> </w:t>
+      </w:r>
+      <w:r>
+        <w:t xml:space="preserve">использовании.</w:t>
       </w:r>
     </w:p>
     <w:p>
@@ -2664,7 +2846,7 @@
         <w:t xml:space="preserve"> </w:t>
       </w:r>
       <w:r>
-        <w:t xml:space="preserve">потребовалось. На новом сервере поддержку сейчас ведёт аккаунт</w:t>
+        <w:t xml:space="preserve">потребовалось. Поддержку сейчас ведёт аккаунт</w:t>
       </w:r>
       <w:r>
         <w:t xml:space="preserve"> </w:t>
@@ -2679,19 +2861,73 @@
         <w:t xml:space="preserve"> </w:t>
       </w:r>
       <w:r>
-        <w:t xml:space="preserve">— перед реальным запуском решить, кто и по какому</w:t>
-      </w:r>
-      <w:r>
-        <w:t xml:space="preserve"> </w:t>
-      </w:r>
-      <w:r>
-        <w:t xml:space="preserve">графику на него отвечает (или завести несколько таких аккаунтов, если</w:t>
-      </w:r>
-      <w:r>
-        <w:t xml:space="preserve"> </w:t>
-      </w:r>
-      <w:r>
-        <w:t xml:space="preserve">нагрузка потребует).</w:t>
+        <w:t xml:space="preserve">—</w:t>
+      </w:r>
+      <w:r>
+        <w:t xml:space="preserve"> </w:t>
+      </w:r>
+      <w:r>
+        <w:t xml:space="preserve">перед реальным запуском решить, кто и по какому графику на него отвечает</w:t>
+      </w:r>
+      <w:r>
+        <w:t xml:space="preserve"> </w:t>
+      </w:r>
+      <w:r>
+        <w:t xml:space="preserve">(или завести несколько таких аккаунтов, если нагрузка потребует). Кнопка</w:t>
+      </w:r>
+      <w:r>
+        <w:t xml:space="preserve"> </w:t>
+      </w:r>
+      <w:r>
+        <w:t xml:space="preserve">«Написать нам» в шапке — отдельный явный вход в тот же канал, не только</w:t>
+      </w:r>
+      <w:r>
+        <w:t xml:space="preserve"> </w:t>
+      </w:r>
+      <w:r>
+        <w:t xml:space="preserve">плавающий виджет.</w:t>
+      </w:r>
+    </w:p>
+    <w:p>
+      <w:pPr>
+        <w:pStyle w:val="BodyText"/>
+      </w:pPr>
+      <w:r>
+        <w:rPr>
+          <w:bCs/>
+          <w:b/>
+        </w:rPr>
+        <w:t xml:space="preserve">Готово (2026-09):</w:t>
+      </w:r>
+      <w:r>
+        <w:t xml:space="preserve"> </w:t>
+      </w:r>
+      <w:r>
+        <w:t xml:space="preserve">сверх исходного скоупа добавлены Web Push</w:t>
+      </w:r>
+      <w:r>
+        <w:t xml:space="preserve"> </w:t>
+      </w:r>
+      <w:r>
+        <w:t xml:space="preserve">(браузерные уведомления, VAPID, переключатель в профиле) и управление</w:t>
+      </w:r>
+      <w:r>
+        <w:t xml:space="preserve"> </w:t>
+      </w:r>
+      <w:r>
+        <w:t xml:space="preserve">уже оплаченным заказом — перенос даты с подтверждением покупателем,</w:t>
+      </w:r>
+      <w:r>
+        <w:t xml:space="preserve"> </w:t>
+      </w:r>
+      <w:r>
+        <w:t xml:space="preserve">отмена с возвратом и открытие спора доступны обеим сторонам, не только</w:t>
+      </w:r>
+      <w:r>
+        <w:t xml:space="preserve"> </w:t>
+      </w:r>
+      <w:r>
+        <w:t xml:space="preserve">покупателю, как было раньше.</w:t>
       </w:r>
     </w:p>
     <w:bookmarkEnd w:id="29"/>
@@ -2786,7 +3022,19 @@
         <w:pStyle w:val="Compact"/>
       </w:pPr>
       <w:r>
-        <w:t xml:space="preserve">Отмена брони, спор, разрешение спора администратором.</w:t>
+        <w:t xml:space="preserve">Отмена брони, перенос даты (предложение продавцом → подтверждение/</w:t>
+      </w:r>
+      <w:r>
+        <w:t xml:space="preserve"> </w:t>
+      </w:r>
+      <w:r>
+        <w:t xml:space="preserve">отклонение покупателем, с автовозвратом при отклонении), спор,</w:t>
+      </w:r>
+      <w:r>
+        <w:t xml:space="preserve"> </w:t>
+      </w:r>
+      <w:r>
+        <w:t xml:space="preserve">разрешение спора администратором.</w:t>
       </w:r>
     </w:p>
     <w:p>

</xml_diff>